<commit_message>
docs: aajustesd en el it para hacerlo implementable
</commit_message>
<xml_diff>
--- a/docs/IT-037-001 — Operational Admission MVP.docx
+++ b/docs/IT-037-001 — Operational Admission MVP.docx
@@ -420,7 +420,7 @@
       <w:pPr>
         <w:numPr>
           <w:ilvl w:val="0"/>
-          <w:numId w:val="32"/>
+          <w:numId w:val="33"/>
         </w:numPr>
         <w:spacing w:after="0" w:afterAutospacing="0" w:before="240" w:lineRule="auto"/>
         <w:ind w:left="720" w:hanging="360"/>
@@ -450,7 +450,7 @@
       <w:pPr>
         <w:numPr>
           <w:ilvl w:val="0"/>
-          <w:numId w:val="32"/>
+          <w:numId w:val="33"/>
         </w:numPr>
         <w:spacing w:after="0" w:afterAutospacing="0" w:before="0" w:beforeAutospacing="0" w:lineRule="auto"/>
         <w:ind w:left="720" w:hanging="360"/>
@@ -466,7 +466,7 @@
       <w:pPr>
         <w:numPr>
           <w:ilvl w:val="0"/>
-          <w:numId w:val="32"/>
+          <w:numId w:val="33"/>
         </w:numPr>
         <w:spacing w:after="0" w:afterAutospacing="0" w:before="0" w:beforeAutospacing="0" w:lineRule="auto"/>
         <w:ind w:left="720" w:hanging="360"/>
@@ -482,7 +482,7 @@
       <w:pPr>
         <w:numPr>
           <w:ilvl w:val="0"/>
-          <w:numId w:val="32"/>
+          <w:numId w:val="33"/>
         </w:numPr>
         <w:spacing w:after="0" w:afterAutospacing="0" w:before="0" w:beforeAutospacing="0" w:lineRule="auto"/>
         <w:ind w:left="720" w:hanging="360"/>
@@ -512,7 +512,7 @@
       <w:pPr>
         <w:numPr>
           <w:ilvl w:val="0"/>
-          <w:numId w:val="32"/>
+          <w:numId w:val="33"/>
         </w:numPr>
         <w:spacing w:after="0" w:afterAutospacing="0" w:before="0" w:beforeAutospacing="0" w:lineRule="auto"/>
         <w:ind w:left="720" w:hanging="360"/>
@@ -542,7 +542,7 @@
       <w:pPr>
         <w:numPr>
           <w:ilvl w:val="0"/>
-          <w:numId w:val="32"/>
+          <w:numId w:val="33"/>
         </w:numPr>
         <w:spacing w:after="0" w:afterAutospacing="0" w:before="0" w:beforeAutospacing="0" w:lineRule="auto"/>
         <w:ind w:left="720" w:hanging="360"/>
@@ -572,7 +572,7 @@
       <w:pPr>
         <w:numPr>
           <w:ilvl w:val="0"/>
-          <w:numId w:val="32"/>
+          <w:numId w:val="33"/>
         </w:numPr>
         <w:spacing w:after="240" w:before="0" w:beforeAutospacing="0" w:lineRule="auto"/>
         <w:ind w:left="720" w:hanging="360"/>
@@ -733,7 +733,7 @@
       <w:pPr>
         <w:numPr>
           <w:ilvl w:val="0"/>
-          <w:numId w:val="22"/>
+          <w:numId w:val="23"/>
         </w:numPr>
         <w:spacing w:after="0" w:afterAutospacing="0" w:before="240" w:lineRule="auto"/>
         <w:ind w:left="720" w:hanging="360"/>
@@ -749,7 +749,7 @@
       <w:pPr>
         <w:numPr>
           <w:ilvl w:val="0"/>
-          <w:numId w:val="22"/>
+          <w:numId w:val="23"/>
         </w:numPr>
         <w:spacing w:after="0" w:afterAutospacing="0" w:before="0" w:beforeAutospacing="0" w:lineRule="auto"/>
         <w:ind w:left="720" w:hanging="360"/>
@@ -779,7 +779,7 @@
       <w:pPr>
         <w:numPr>
           <w:ilvl w:val="0"/>
-          <w:numId w:val="22"/>
+          <w:numId w:val="23"/>
         </w:numPr>
         <w:spacing w:after="240" w:before="0" w:beforeAutospacing="0" w:lineRule="auto"/>
         <w:ind w:left="720" w:hanging="360"/>
@@ -926,7 +926,7 @@
       <w:pPr>
         <w:numPr>
           <w:ilvl w:val="0"/>
-          <w:numId w:val="56"/>
+          <w:numId w:val="57"/>
         </w:numPr>
         <w:spacing w:after="0" w:afterAutospacing="0" w:before="240" w:lineRule="auto"/>
         <w:ind w:left="720" w:hanging="360"/>
@@ -942,7 +942,7 @@
       <w:pPr>
         <w:numPr>
           <w:ilvl w:val="0"/>
-          <w:numId w:val="56"/>
+          <w:numId w:val="57"/>
         </w:numPr>
         <w:spacing w:after="0" w:afterAutospacing="0" w:before="0" w:beforeAutospacing="0" w:lineRule="auto"/>
         <w:ind w:left="720" w:hanging="360"/>
@@ -958,7 +958,7 @@
       <w:pPr>
         <w:numPr>
           <w:ilvl w:val="0"/>
-          <w:numId w:val="56"/>
+          <w:numId w:val="57"/>
         </w:numPr>
         <w:spacing w:after="0" w:afterAutospacing="0" w:before="0" w:beforeAutospacing="0" w:lineRule="auto"/>
         <w:ind w:left="720" w:hanging="360"/>
@@ -974,7 +974,7 @@
       <w:pPr>
         <w:numPr>
           <w:ilvl w:val="0"/>
-          <w:numId w:val="56"/>
+          <w:numId w:val="57"/>
         </w:numPr>
         <w:spacing w:after="0" w:afterAutospacing="0" w:before="0" w:beforeAutospacing="0" w:lineRule="auto"/>
         <w:ind w:left="720" w:hanging="360"/>
@@ -990,7 +990,7 @@
       <w:pPr>
         <w:numPr>
           <w:ilvl w:val="0"/>
-          <w:numId w:val="56"/>
+          <w:numId w:val="57"/>
         </w:numPr>
         <w:spacing w:after="240" w:before="0" w:beforeAutospacing="0" w:lineRule="auto"/>
         <w:ind w:left="720" w:hanging="360"/>
@@ -1283,7 +1283,7 @@
       <w:pPr>
         <w:numPr>
           <w:ilvl w:val="0"/>
-          <w:numId w:val="30"/>
+          <w:numId w:val="31"/>
         </w:numPr>
         <w:spacing w:after="0" w:afterAutospacing="0" w:before="240" w:lineRule="auto"/>
         <w:ind w:left="720" w:hanging="360"/>
@@ -1313,7 +1313,7 @@
       <w:pPr>
         <w:numPr>
           <w:ilvl w:val="0"/>
-          <w:numId w:val="30"/>
+          <w:numId w:val="31"/>
         </w:numPr>
         <w:spacing w:after="0" w:afterAutospacing="0" w:before="0" w:beforeAutospacing="0" w:lineRule="auto"/>
         <w:ind w:left="720" w:hanging="360"/>
@@ -1329,7 +1329,7 @@
       <w:pPr>
         <w:numPr>
           <w:ilvl w:val="0"/>
-          <w:numId w:val="30"/>
+          <w:numId w:val="31"/>
         </w:numPr>
         <w:spacing w:after="240" w:before="0" w:beforeAutospacing="0" w:lineRule="auto"/>
         <w:ind w:left="720" w:hanging="360"/>
@@ -1357,7 +1357,7 @@
       <w:pPr>
         <w:numPr>
           <w:ilvl w:val="0"/>
-          <w:numId w:val="24"/>
+          <w:numId w:val="25"/>
         </w:numPr>
         <w:spacing w:after="0" w:afterAutospacing="0" w:before="240" w:lineRule="auto"/>
         <w:ind w:left="720" w:hanging="360"/>
@@ -1373,7 +1373,7 @@
       <w:pPr>
         <w:numPr>
           <w:ilvl w:val="0"/>
-          <w:numId w:val="24"/>
+          <w:numId w:val="25"/>
         </w:numPr>
         <w:spacing w:after="240" w:before="0" w:beforeAutospacing="0" w:lineRule="auto"/>
         <w:ind w:left="720" w:hanging="360"/>
@@ -1649,7 +1649,7 @@
       <w:pPr>
         <w:numPr>
           <w:ilvl w:val="0"/>
-          <w:numId w:val="35"/>
+          <w:numId w:val="36"/>
         </w:numPr>
         <w:spacing w:after="0" w:afterAutospacing="0" w:before="240" w:lineRule="auto"/>
         <w:ind w:left="720" w:hanging="360"/>
@@ -1673,7 +1673,7 @@
       <w:pPr>
         <w:numPr>
           <w:ilvl w:val="0"/>
-          <w:numId w:val="35"/>
+          <w:numId w:val="36"/>
         </w:numPr>
         <w:spacing w:after="0" w:afterAutospacing="0" w:before="0" w:beforeAutospacing="0" w:lineRule="auto"/>
         <w:ind w:left="720" w:hanging="360"/>
@@ -1697,7 +1697,7 @@
       <w:pPr>
         <w:numPr>
           <w:ilvl w:val="0"/>
-          <w:numId w:val="35"/>
+          <w:numId w:val="36"/>
         </w:numPr>
         <w:spacing w:after="0" w:afterAutospacing="0" w:before="0" w:beforeAutospacing="0" w:lineRule="auto"/>
         <w:ind w:left="720" w:hanging="360"/>
@@ -1721,7 +1721,7 @@
       <w:pPr>
         <w:numPr>
           <w:ilvl w:val="0"/>
-          <w:numId w:val="35"/>
+          <w:numId w:val="36"/>
         </w:numPr>
         <w:spacing w:after="240" w:before="0" w:beforeAutospacing="0" w:lineRule="auto"/>
         <w:ind w:left="720" w:hanging="360"/>
@@ -2041,7 +2041,7 @@
       <w:pPr>
         <w:numPr>
           <w:ilvl w:val="0"/>
-          <w:numId w:val="41"/>
+          <w:numId w:val="42"/>
         </w:numPr>
         <w:spacing w:after="0" w:afterAutospacing="0" w:before="240" w:lineRule="auto"/>
         <w:ind w:left="720" w:hanging="360"/>
@@ -2057,7 +2057,7 @@
       <w:pPr>
         <w:numPr>
           <w:ilvl w:val="0"/>
-          <w:numId w:val="41"/>
+          <w:numId w:val="42"/>
         </w:numPr>
         <w:spacing w:after="0" w:afterAutospacing="0" w:before="0" w:beforeAutospacing="0" w:lineRule="auto"/>
         <w:ind w:left="720" w:hanging="360"/>
@@ -2087,7 +2087,7 @@
       <w:pPr>
         <w:numPr>
           <w:ilvl w:val="0"/>
-          <w:numId w:val="41"/>
+          <w:numId w:val="42"/>
         </w:numPr>
         <w:spacing w:after="0" w:afterAutospacing="0" w:before="0" w:beforeAutospacing="0" w:lineRule="auto"/>
         <w:ind w:left="720" w:hanging="360"/>
@@ -2103,7 +2103,7 @@
       <w:pPr>
         <w:numPr>
           <w:ilvl w:val="0"/>
-          <w:numId w:val="41"/>
+          <w:numId w:val="42"/>
         </w:numPr>
         <w:spacing w:after="0" w:afterAutospacing="0" w:before="0" w:beforeAutospacing="0" w:lineRule="auto"/>
         <w:ind w:left="720" w:hanging="360"/>
@@ -2119,7 +2119,7 @@
       <w:pPr>
         <w:numPr>
           <w:ilvl w:val="0"/>
-          <w:numId w:val="41"/>
+          <w:numId w:val="42"/>
         </w:numPr>
         <w:spacing w:after="0" w:afterAutospacing="0" w:before="0" w:beforeAutospacing="0" w:lineRule="auto"/>
         <w:ind w:left="720" w:hanging="360"/>
@@ -2135,7 +2135,7 @@
       <w:pPr>
         <w:numPr>
           <w:ilvl w:val="0"/>
-          <w:numId w:val="41"/>
+          <w:numId w:val="42"/>
         </w:numPr>
         <w:spacing w:after="0" w:afterAutospacing="0" w:before="0" w:beforeAutospacing="0" w:lineRule="auto"/>
         <w:ind w:left="720" w:hanging="360"/>
@@ -2151,7 +2151,7 @@
       <w:pPr>
         <w:numPr>
           <w:ilvl w:val="0"/>
-          <w:numId w:val="41"/>
+          <w:numId w:val="42"/>
         </w:numPr>
         <w:spacing w:after="240" w:before="0" w:beforeAutospacing="0" w:lineRule="auto"/>
         <w:ind w:left="720" w:hanging="360"/>
@@ -2244,7 +2244,7 @@
       <w:pPr>
         <w:numPr>
           <w:ilvl w:val="0"/>
-          <w:numId w:val="13"/>
+          <w:numId w:val="14"/>
         </w:numPr>
         <w:spacing w:after="0" w:afterAutospacing="0" w:before="240" w:lineRule="auto"/>
         <w:ind w:left="720" w:hanging="360"/>
@@ -2260,7 +2260,7 @@
       <w:pPr>
         <w:numPr>
           <w:ilvl w:val="0"/>
-          <w:numId w:val="13"/>
+          <w:numId w:val="14"/>
         </w:numPr>
         <w:spacing w:after="0" w:afterAutospacing="0" w:before="0" w:beforeAutospacing="0" w:lineRule="auto"/>
         <w:ind w:left="720" w:hanging="360"/>
@@ -2276,7 +2276,7 @@
       <w:pPr>
         <w:numPr>
           <w:ilvl w:val="0"/>
-          <w:numId w:val="13"/>
+          <w:numId w:val="14"/>
         </w:numPr>
         <w:spacing w:after="0" w:afterAutospacing="0" w:before="0" w:beforeAutospacing="0" w:lineRule="auto"/>
         <w:ind w:left="720" w:hanging="360"/>
@@ -2292,7 +2292,7 @@
       <w:pPr>
         <w:numPr>
           <w:ilvl w:val="0"/>
-          <w:numId w:val="13"/>
+          <w:numId w:val="14"/>
         </w:numPr>
         <w:spacing w:after="0" w:afterAutospacing="0" w:before="0" w:beforeAutospacing="0" w:lineRule="auto"/>
         <w:ind w:left="720" w:hanging="360"/>
@@ -2308,7 +2308,7 @@
       <w:pPr>
         <w:numPr>
           <w:ilvl w:val="0"/>
-          <w:numId w:val="13"/>
+          <w:numId w:val="14"/>
         </w:numPr>
         <w:spacing w:after="0" w:afterAutospacing="0" w:before="0" w:beforeAutospacing="0" w:lineRule="auto"/>
         <w:ind w:left="720" w:hanging="360"/>
@@ -2324,7 +2324,7 @@
       <w:pPr>
         <w:numPr>
           <w:ilvl w:val="0"/>
-          <w:numId w:val="13"/>
+          <w:numId w:val="14"/>
         </w:numPr>
         <w:spacing w:after="0" w:afterAutospacing="0" w:before="0" w:beforeAutospacing="0" w:lineRule="auto"/>
         <w:ind w:left="720" w:hanging="360"/>
@@ -2340,7 +2340,7 @@
       <w:pPr>
         <w:numPr>
           <w:ilvl w:val="0"/>
-          <w:numId w:val="13"/>
+          <w:numId w:val="14"/>
         </w:numPr>
         <w:spacing w:after="0" w:afterAutospacing="0" w:before="0" w:beforeAutospacing="0" w:lineRule="auto"/>
         <w:ind w:left="720" w:hanging="360"/>
@@ -2356,7 +2356,7 @@
       <w:pPr>
         <w:numPr>
           <w:ilvl w:val="0"/>
-          <w:numId w:val="13"/>
+          <w:numId w:val="14"/>
         </w:numPr>
         <w:spacing w:after="0" w:afterAutospacing="0" w:before="0" w:beforeAutospacing="0" w:lineRule="auto"/>
         <w:ind w:left="720" w:hanging="360"/>
@@ -2372,7 +2372,7 @@
       <w:pPr>
         <w:numPr>
           <w:ilvl w:val="0"/>
-          <w:numId w:val="13"/>
+          <w:numId w:val="14"/>
         </w:numPr>
         <w:spacing w:after="0" w:afterAutospacing="0" w:before="0" w:beforeAutospacing="0" w:lineRule="auto"/>
         <w:ind w:left="720" w:hanging="360"/>
@@ -2388,7 +2388,7 @@
       <w:pPr>
         <w:numPr>
           <w:ilvl w:val="0"/>
-          <w:numId w:val="13"/>
+          <w:numId w:val="14"/>
         </w:numPr>
         <w:spacing w:after="240" w:before="0" w:beforeAutospacing="0" w:lineRule="auto"/>
         <w:ind w:left="720" w:hanging="360"/>
@@ -2680,7 +2680,7 @@
       <w:pPr>
         <w:numPr>
           <w:ilvl w:val="0"/>
-          <w:numId w:val="44"/>
+          <w:numId w:val="45"/>
         </w:numPr>
         <w:spacing w:after="0" w:afterAutospacing="0" w:before="240" w:lineRule="auto"/>
         <w:ind w:left="720" w:hanging="360"/>
@@ -2696,7 +2696,7 @@
       <w:pPr>
         <w:numPr>
           <w:ilvl w:val="0"/>
-          <w:numId w:val="44"/>
+          <w:numId w:val="45"/>
         </w:numPr>
         <w:spacing w:after="0" w:afterAutospacing="0" w:before="0" w:beforeAutospacing="0" w:lineRule="auto"/>
         <w:ind w:left="720" w:hanging="360"/>
@@ -2712,7 +2712,7 @@
       <w:pPr>
         <w:numPr>
           <w:ilvl w:val="0"/>
-          <w:numId w:val="44"/>
+          <w:numId w:val="45"/>
         </w:numPr>
         <w:spacing w:after="0" w:afterAutospacing="0" w:before="0" w:beforeAutospacing="0" w:lineRule="auto"/>
         <w:ind w:left="720" w:hanging="360"/>
@@ -2728,7 +2728,7 @@
       <w:pPr>
         <w:numPr>
           <w:ilvl w:val="0"/>
-          <w:numId w:val="44"/>
+          <w:numId w:val="45"/>
         </w:numPr>
         <w:spacing w:after="0" w:afterAutospacing="0" w:before="0" w:beforeAutospacing="0" w:lineRule="auto"/>
         <w:ind w:left="720" w:hanging="360"/>
@@ -2744,7 +2744,7 @@
       <w:pPr>
         <w:numPr>
           <w:ilvl w:val="0"/>
-          <w:numId w:val="44"/>
+          <w:numId w:val="45"/>
         </w:numPr>
         <w:spacing w:after="0" w:afterAutospacing="0" w:before="0" w:beforeAutospacing="0" w:lineRule="auto"/>
         <w:ind w:left="720" w:hanging="360"/>
@@ -2760,7 +2760,7 @@
       <w:pPr>
         <w:numPr>
           <w:ilvl w:val="0"/>
-          <w:numId w:val="44"/>
+          <w:numId w:val="45"/>
         </w:numPr>
         <w:spacing w:after="0" w:afterAutospacing="0" w:before="0" w:beforeAutospacing="0" w:lineRule="auto"/>
         <w:ind w:left="720" w:hanging="360"/>
@@ -2776,7 +2776,7 @@
       <w:pPr>
         <w:numPr>
           <w:ilvl w:val="0"/>
-          <w:numId w:val="44"/>
+          <w:numId w:val="45"/>
         </w:numPr>
         <w:spacing w:after="240" w:before="0" w:beforeAutospacing="0" w:lineRule="auto"/>
         <w:ind w:left="720" w:hanging="360"/>
@@ -3016,7 +3016,7 @@
       <w:pPr>
         <w:numPr>
           <w:ilvl w:val="0"/>
-          <w:numId w:val="49"/>
+          <w:numId w:val="50"/>
         </w:numPr>
         <w:spacing w:after="0" w:afterAutospacing="0" w:before="240" w:lineRule="auto"/>
         <w:ind w:left="720" w:hanging="360"/>
@@ -3032,7 +3032,7 @@
       <w:pPr>
         <w:numPr>
           <w:ilvl w:val="0"/>
-          <w:numId w:val="49"/>
+          <w:numId w:val="50"/>
         </w:numPr>
         <w:spacing w:after="0" w:afterAutospacing="0" w:before="0" w:beforeAutospacing="0" w:lineRule="auto"/>
         <w:ind w:left="720" w:hanging="360"/>
@@ -3048,7 +3048,7 @@
       <w:pPr>
         <w:numPr>
           <w:ilvl w:val="0"/>
-          <w:numId w:val="49"/>
+          <w:numId w:val="50"/>
         </w:numPr>
         <w:spacing w:after="0" w:afterAutospacing="0" w:before="0" w:beforeAutospacing="0" w:lineRule="auto"/>
         <w:ind w:left="720" w:hanging="360"/>
@@ -3064,7 +3064,7 @@
       <w:pPr>
         <w:numPr>
           <w:ilvl w:val="0"/>
-          <w:numId w:val="49"/>
+          <w:numId w:val="50"/>
         </w:numPr>
         <w:spacing w:after="240" w:before="0" w:beforeAutospacing="0" w:lineRule="auto"/>
         <w:ind w:left="720" w:hanging="360"/>
@@ -3345,7 +3345,7 @@
       <w:pPr>
         <w:numPr>
           <w:ilvl w:val="0"/>
-          <w:numId w:val="47"/>
+          <w:numId w:val="48"/>
         </w:numPr>
         <w:spacing w:after="0" w:afterAutospacing="0" w:before="240" w:lineRule="auto"/>
         <w:ind w:left="720" w:hanging="360"/>
@@ -3361,7 +3361,7 @@
       <w:pPr>
         <w:numPr>
           <w:ilvl w:val="0"/>
-          <w:numId w:val="47"/>
+          <w:numId w:val="48"/>
         </w:numPr>
         <w:spacing w:after="0" w:afterAutospacing="0" w:before="0" w:beforeAutospacing="0" w:lineRule="auto"/>
         <w:ind w:left="720" w:hanging="360"/>
@@ -3377,7 +3377,7 @@
       <w:pPr>
         <w:numPr>
           <w:ilvl w:val="0"/>
-          <w:numId w:val="47"/>
+          <w:numId w:val="48"/>
         </w:numPr>
         <w:spacing w:after="0" w:afterAutospacing="0" w:before="0" w:beforeAutospacing="0" w:lineRule="auto"/>
         <w:ind w:left="720" w:hanging="360"/>
@@ -3393,7 +3393,7 @@
       <w:pPr>
         <w:numPr>
           <w:ilvl w:val="0"/>
-          <w:numId w:val="47"/>
+          <w:numId w:val="48"/>
         </w:numPr>
         <w:spacing w:after="0" w:afterAutospacing="0" w:before="0" w:beforeAutospacing="0" w:lineRule="auto"/>
         <w:ind w:left="720" w:hanging="360"/>
@@ -3409,7 +3409,7 @@
       <w:pPr>
         <w:numPr>
           <w:ilvl w:val="0"/>
-          <w:numId w:val="47"/>
+          <w:numId w:val="48"/>
         </w:numPr>
         <w:spacing w:after="240" w:before="0" w:beforeAutospacing="0" w:lineRule="auto"/>
         <w:ind w:left="720" w:hanging="360"/>
@@ -3451,7 +3451,7 @@
       <w:pPr>
         <w:numPr>
           <w:ilvl w:val="0"/>
-          <w:numId w:val="51"/>
+          <w:numId w:val="52"/>
         </w:numPr>
         <w:spacing w:after="0" w:afterAutospacing="0" w:before="240" w:lineRule="auto"/>
         <w:ind w:left="720" w:hanging="360"/>
@@ -3475,7 +3475,7 @@
       <w:pPr>
         <w:numPr>
           <w:ilvl w:val="0"/>
-          <w:numId w:val="51"/>
+          <w:numId w:val="52"/>
         </w:numPr>
         <w:spacing w:after="0" w:afterAutospacing="0" w:before="0" w:beforeAutospacing="0" w:lineRule="auto"/>
         <w:ind w:left="720" w:hanging="360"/>
@@ -3499,7 +3499,7 @@
       <w:pPr>
         <w:numPr>
           <w:ilvl w:val="0"/>
-          <w:numId w:val="51"/>
+          <w:numId w:val="52"/>
         </w:numPr>
         <w:spacing w:after="0" w:afterAutospacing="0" w:before="0" w:beforeAutospacing="0" w:lineRule="auto"/>
         <w:ind w:left="720" w:hanging="360"/>
@@ -3515,7 +3515,7 @@
       <w:pPr>
         <w:numPr>
           <w:ilvl w:val="0"/>
-          <w:numId w:val="51"/>
+          <w:numId w:val="52"/>
         </w:numPr>
         <w:spacing w:after="240" w:before="0" w:beforeAutospacing="0" w:lineRule="auto"/>
         <w:ind w:left="720" w:hanging="360"/>
@@ -3557,7 +3557,7 @@
       <w:pPr>
         <w:numPr>
           <w:ilvl w:val="0"/>
-          <w:numId w:val="64"/>
+          <w:numId w:val="66"/>
         </w:numPr>
         <w:spacing w:after="0" w:afterAutospacing="0" w:before="240" w:lineRule="auto"/>
         <w:ind w:left="720" w:hanging="360"/>
@@ -3573,7 +3573,7 @@
       <w:pPr>
         <w:numPr>
           <w:ilvl w:val="0"/>
-          <w:numId w:val="64"/>
+          <w:numId w:val="66"/>
         </w:numPr>
         <w:spacing w:after="0" w:afterAutospacing="0" w:before="0" w:beforeAutospacing="0" w:lineRule="auto"/>
         <w:ind w:left="720" w:hanging="360"/>
@@ -3589,7 +3589,7 @@
       <w:pPr>
         <w:numPr>
           <w:ilvl w:val="0"/>
-          <w:numId w:val="64"/>
+          <w:numId w:val="66"/>
         </w:numPr>
         <w:spacing w:after="0" w:afterAutospacing="0" w:before="0" w:beforeAutospacing="0" w:lineRule="auto"/>
         <w:ind w:left="720" w:hanging="360"/>
@@ -3605,7 +3605,7 @@
       <w:pPr>
         <w:numPr>
           <w:ilvl w:val="0"/>
-          <w:numId w:val="64"/>
+          <w:numId w:val="66"/>
         </w:numPr>
         <w:spacing w:after="0" w:afterAutospacing="0" w:before="0" w:beforeAutospacing="0" w:lineRule="auto"/>
         <w:ind w:left="720" w:hanging="360"/>
@@ -3621,7 +3621,7 @@
       <w:pPr>
         <w:numPr>
           <w:ilvl w:val="0"/>
-          <w:numId w:val="64"/>
+          <w:numId w:val="66"/>
         </w:numPr>
         <w:spacing w:after="240" w:before="0" w:beforeAutospacing="0" w:lineRule="auto"/>
         <w:ind w:left="720" w:hanging="360"/>
@@ -3663,7 +3663,7 @@
       <w:pPr>
         <w:numPr>
           <w:ilvl w:val="0"/>
-          <w:numId w:val="29"/>
+          <w:numId w:val="30"/>
         </w:numPr>
         <w:spacing w:after="0" w:afterAutospacing="0" w:before="240" w:lineRule="auto"/>
         <w:ind w:left="720" w:hanging="360"/>
@@ -3693,7 +3693,7 @@
       <w:pPr>
         <w:numPr>
           <w:ilvl w:val="0"/>
-          <w:numId w:val="29"/>
+          <w:numId w:val="30"/>
         </w:numPr>
         <w:spacing w:after="0" w:afterAutospacing="0" w:before="0" w:beforeAutospacing="0" w:lineRule="auto"/>
         <w:ind w:left="720" w:hanging="360"/>
@@ -3709,7 +3709,7 @@
       <w:pPr>
         <w:numPr>
           <w:ilvl w:val="0"/>
-          <w:numId w:val="29"/>
+          <w:numId w:val="30"/>
         </w:numPr>
         <w:spacing w:after="0" w:afterAutospacing="0" w:before="0" w:beforeAutospacing="0" w:lineRule="auto"/>
         <w:ind w:left="720" w:hanging="360"/>
@@ -3725,7 +3725,7 @@
       <w:pPr>
         <w:numPr>
           <w:ilvl w:val="0"/>
-          <w:numId w:val="29"/>
+          <w:numId w:val="30"/>
         </w:numPr>
         <w:spacing w:after="240" w:before="0" w:beforeAutospacing="0" w:lineRule="auto"/>
         <w:ind w:left="720" w:hanging="360"/>
@@ -3767,7 +3767,7 @@
       <w:pPr>
         <w:numPr>
           <w:ilvl w:val="0"/>
-          <w:numId w:val="40"/>
+          <w:numId w:val="41"/>
         </w:numPr>
         <w:spacing w:after="0" w:afterAutospacing="0" w:before="240" w:lineRule="auto"/>
         <w:ind w:left="720" w:hanging="360"/>
@@ -3783,7 +3783,7 @@
       <w:pPr>
         <w:numPr>
           <w:ilvl w:val="0"/>
-          <w:numId w:val="40"/>
+          <w:numId w:val="41"/>
         </w:numPr>
         <w:spacing w:after="0" w:afterAutospacing="0" w:before="0" w:beforeAutospacing="0" w:lineRule="auto"/>
         <w:ind w:left="720" w:hanging="360"/>
@@ -3799,7 +3799,7 @@
       <w:pPr>
         <w:numPr>
           <w:ilvl w:val="0"/>
-          <w:numId w:val="40"/>
+          <w:numId w:val="41"/>
         </w:numPr>
         <w:spacing w:after="0" w:afterAutospacing="0" w:before="0" w:beforeAutospacing="0" w:lineRule="auto"/>
         <w:ind w:left="720" w:hanging="360"/>
@@ -3815,7 +3815,7 @@
       <w:pPr>
         <w:numPr>
           <w:ilvl w:val="0"/>
-          <w:numId w:val="40"/>
+          <w:numId w:val="41"/>
         </w:numPr>
         <w:spacing w:after="0" w:afterAutospacing="0" w:before="0" w:beforeAutospacing="0" w:lineRule="auto"/>
         <w:ind w:left="720" w:hanging="360"/>
@@ -3831,7 +3831,7 @@
       <w:pPr>
         <w:numPr>
           <w:ilvl w:val="0"/>
-          <w:numId w:val="40"/>
+          <w:numId w:val="41"/>
         </w:numPr>
         <w:spacing w:after="0" w:afterAutospacing="0" w:before="0" w:beforeAutospacing="0" w:lineRule="auto"/>
         <w:ind w:left="720" w:hanging="360"/>
@@ -3847,7 +3847,7 @@
       <w:pPr>
         <w:numPr>
           <w:ilvl w:val="0"/>
-          <w:numId w:val="40"/>
+          <w:numId w:val="41"/>
         </w:numPr>
         <w:spacing w:after="240" w:before="0" w:beforeAutospacing="0" w:lineRule="auto"/>
         <w:ind w:left="720" w:hanging="360"/>
@@ -3889,7 +3889,7 @@
       <w:pPr>
         <w:numPr>
           <w:ilvl w:val="0"/>
-          <w:numId w:val="28"/>
+          <w:numId w:val="29"/>
         </w:numPr>
         <w:spacing w:after="0" w:afterAutospacing="0" w:before="240" w:lineRule="auto"/>
         <w:ind w:left="720" w:hanging="360"/>
@@ -3905,7 +3905,7 @@
       <w:pPr>
         <w:numPr>
           <w:ilvl w:val="0"/>
-          <w:numId w:val="28"/>
+          <w:numId w:val="29"/>
         </w:numPr>
         <w:spacing w:after="0" w:afterAutospacing="0" w:before="0" w:beforeAutospacing="0" w:lineRule="auto"/>
         <w:ind w:left="720" w:hanging="360"/>
@@ -3921,7 +3921,7 @@
       <w:pPr>
         <w:numPr>
           <w:ilvl w:val="0"/>
-          <w:numId w:val="28"/>
+          <w:numId w:val="29"/>
         </w:numPr>
         <w:spacing w:after="0" w:afterAutospacing="0" w:before="0" w:beforeAutospacing="0" w:lineRule="auto"/>
         <w:ind w:left="720" w:hanging="360"/>
@@ -3937,7 +3937,7 @@
       <w:pPr>
         <w:numPr>
           <w:ilvl w:val="0"/>
-          <w:numId w:val="28"/>
+          <w:numId w:val="29"/>
         </w:numPr>
         <w:spacing w:after="240" w:before="0" w:beforeAutospacing="0" w:lineRule="auto"/>
         <w:ind w:left="720" w:hanging="360"/>
@@ -3979,7 +3979,7 @@
       <w:pPr>
         <w:numPr>
           <w:ilvl w:val="0"/>
-          <w:numId w:val="55"/>
+          <w:numId w:val="56"/>
         </w:numPr>
         <w:spacing w:after="0" w:afterAutospacing="0" w:before="240" w:lineRule="auto"/>
         <w:ind w:left="720" w:hanging="360"/>
@@ -3995,7 +3995,7 @@
       <w:pPr>
         <w:numPr>
           <w:ilvl w:val="0"/>
-          <w:numId w:val="55"/>
+          <w:numId w:val="56"/>
         </w:numPr>
         <w:spacing w:after="0" w:afterAutospacing="0" w:before="0" w:beforeAutospacing="0" w:lineRule="auto"/>
         <w:ind w:left="720" w:hanging="360"/>
@@ -4011,7 +4011,7 @@
       <w:pPr>
         <w:numPr>
           <w:ilvl w:val="0"/>
-          <w:numId w:val="55"/>
+          <w:numId w:val="56"/>
         </w:numPr>
         <w:spacing w:after="0" w:afterAutospacing="0" w:before="0" w:beforeAutospacing="0" w:lineRule="auto"/>
         <w:ind w:left="720" w:hanging="360"/>
@@ -4027,7 +4027,7 @@
       <w:pPr>
         <w:numPr>
           <w:ilvl w:val="0"/>
-          <w:numId w:val="55"/>
+          <w:numId w:val="56"/>
         </w:numPr>
         <w:spacing w:after="0" w:afterAutospacing="0" w:before="0" w:beforeAutospacing="0" w:lineRule="auto"/>
         <w:ind w:left="720" w:hanging="360"/>
@@ -4043,7 +4043,7 @@
       <w:pPr>
         <w:numPr>
           <w:ilvl w:val="0"/>
-          <w:numId w:val="55"/>
+          <w:numId w:val="56"/>
         </w:numPr>
         <w:spacing w:after="240" w:before="0" w:beforeAutospacing="0" w:lineRule="auto"/>
         <w:ind w:left="720" w:hanging="360"/>
@@ -4215,7 +4215,7 @@
       <w:pPr>
         <w:numPr>
           <w:ilvl w:val="0"/>
-          <w:numId w:val="65"/>
+          <w:numId w:val="67"/>
         </w:numPr>
         <w:spacing w:after="0" w:afterAutospacing="0" w:before="240" w:lineRule="auto"/>
         <w:ind w:left="720" w:hanging="360"/>
@@ -4239,7 +4239,7 @@
       <w:pPr>
         <w:numPr>
           <w:ilvl w:val="0"/>
-          <w:numId w:val="65"/>
+          <w:numId w:val="67"/>
         </w:numPr>
         <w:spacing w:after="0" w:afterAutospacing="0" w:before="0" w:beforeAutospacing="0" w:lineRule="auto"/>
         <w:ind w:left="720" w:hanging="360"/>
@@ -4263,7 +4263,7 @@
       <w:pPr>
         <w:numPr>
           <w:ilvl w:val="0"/>
-          <w:numId w:val="65"/>
+          <w:numId w:val="67"/>
         </w:numPr>
         <w:spacing w:after="0" w:afterAutospacing="0" w:before="0" w:beforeAutospacing="0" w:lineRule="auto"/>
         <w:ind w:left="720" w:hanging="360"/>
@@ -4287,7 +4287,7 @@
       <w:pPr>
         <w:numPr>
           <w:ilvl w:val="0"/>
-          <w:numId w:val="65"/>
+          <w:numId w:val="67"/>
         </w:numPr>
         <w:spacing w:after="240" w:before="0" w:beforeAutospacing="0" w:lineRule="auto"/>
         <w:ind w:left="720" w:hanging="360"/>
@@ -4380,7 +4380,7 @@
       <w:pPr>
         <w:numPr>
           <w:ilvl w:val="0"/>
-          <w:numId w:val="68"/>
+          <w:numId w:val="70"/>
         </w:numPr>
         <w:spacing w:after="0" w:afterAutospacing="0" w:before="240" w:lineRule="auto"/>
         <w:ind w:left="720" w:hanging="360"/>
@@ -4396,7 +4396,7 @@
       <w:pPr>
         <w:numPr>
           <w:ilvl w:val="0"/>
-          <w:numId w:val="68"/>
+          <w:numId w:val="70"/>
         </w:numPr>
         <w:spacing w:after="0" w:afterAutospacing="0" w:before="0" w:beforeAutospacing="0" w:lineRule="auto"/>
         <w:ind w:left="720" w:hanging="360"/>
@@ -4412,7 +4412,7 @@
       <w:pPr>
         <w:numPr>
           <w:ilvl w:val="0"/>
-          <w:numId w:val="68"/>
+          <w:numId w:val="70"/>
         </w:numPr>
         <w:spacing w:after="0" w:afterAutospacing="0" w:before="0" w:beforeAutospacing="0" w:lineRule="auto"/>
         <w:ind w:left="720" w:hanging="360"/>
@@ -4428,7 +4428,7 @@
       <w:pPr>
         <w:numPr>
           <w:ilvl w:val="0"/>
-          <w:numId w:val="68"/>
+          <w:numId w:val="70"/>
         </w:numPr>
         <w:spacing w:after="0" w:afterAutospacing="0" w:before="0" w:beforeAutospacing="0" w:lineRule="auto"/>
         <w:ind w:left="720" w:hanging="360"/>
@@ -4444,7 +4444,7 @@
       <w:pPr>
         <w:numPr>
           <w:ilvl w:val="0"/>
-          <w:numId w:val="68"/>
+          <w:numId w:val="70"/>
         </w:numPr>
         <w:spacing w:after="0" w:afterAutospacing="0" w:before="0" w:beforeAutospacing="0" w:lineRule="auto"/>
         <w:ind w:left="720" w:hanging="360"/>
@@ -4460,7 +4460,7 @@
       <w:pPr>
         <w:numPr>
           <w:ilvl w:val="0"/>
-          <w:numId w:val="68"/>
+          <w:numId w:val="70"/>
         </w:numPr>
         <w:spacing w:after="0" w:afterAutospacing="0" w:before="0" w:beforeAutospacing="0" w:lineRule="auto"/>
         <w:ind w:left="720" w:hanging="360"/>
@@ -4476,7 +4476,7 @@
       <w:pPr>
         <w:numPr>
           <w:ilvl w:val="0"/>
-          <w:numId w:val="68"/>
+          <w:numId w:val="70"/>
         </w:numPr>
         <w:spacing w:after="0" w:afterAutospacing="0" w:before="0" w:beforeAutospacing="0" w:lineRule="auto"/>
         <w:ind w:left="720" w:hanging="360"/>
@@ -4492,7 +4492,7 @@
       <w:pPr>
         <w:numPr>
           <w:ilvl w:val="0"/>
-          <w:numId w:val="68"/>
+          <w:numId w:val="70"/>
         </w:numPr>
         <w:spacing w:after="0" w:afterAutospacing="0" w:before="0" w:beforeAutospacing="0" w:lineRule="auto"/>
         <w:ind w:left="720" w:hanging="360"/>
@@ -4508,7 +4508,7 @@
       <w:pPr>
         <w:numPr>
           <w:ilvl w:val="0"/>
-          <w:numId w:val="68"/>
+          <w:numId w:val="70"/>
         </w:numPr>
         <w:spacing w:after="0" w:afterAutospacing="0" w:before="0" w:beforeAutospacing="0" w:lineRule="auto"/>
         <w:ind w:left="720" w:hanging="360"/>
@@ -4524,7 +4524,7 @@
       <w:pPr>
         <w:numPr>
           <w:ilvl w:val="0"/>
-          <w:numId w:val="68"/>
+          <w:numId w:val="70"/>
         </w:numPr>
         <w:spacing w:after="0" w:afterAutospacing="0" w:before="0" w:beforeAutospacing="0" w:lineRule="auto"/>
         <w:ind w:left="720" w:hanging="360"/>
@@ -4540,7 +4540,7 @@
       <w:pPr>
         <w:numPr>
           <w:ilvl w:val="0"/>
-          <w:numId w:val="68"/>
+          <w:numId w:val="70"/>
         </w:numPr>
         <w:spacing w:after="240" w:before="0" w:beforeAutospacing="0" w:lineRule="auto"/>
         <w:ind w:left="720" w:hanging="360"/>
@@ -4633,7 +4633,7 @@
       <w:pPr>
         <w:numPr>
           <w:ilvl w:val="0"/>
-          <w:numId w:val="36"/>
+          <w:numId w:val="37"/>
         </w:numPr>
         <w:spacing w:after="0" w:afterAutospacing="0" w:before="240" w:lineRule="auto"/>
         <w:ind w:left="720" w:hanging="360"/>
@@ -4649,7 +4649,7 @@
       <w:pPr>
         <w:numPr>
           <w:ilvl w:val="0"/>
-          <w:numId w:val="36"/>
+          <w:numId w:val="37"/>
         </w:numPr>
         <w:spacing w:after="0" w:afterAutospacing="0" w:before="0" w:beforeAutospacing="0" w:lineRule="auto"/>
         <w:ind w:left="720" w:hanging="360"/>
@@ -4665,7 +4665,7 @@
       <w:pPr>
         <w:numPr>
           <w:ilvl w:val="0"/>
-          <w:numId w:val="36"/>
+          <w:numId w:val="37"/>
         </w:numPr>
         <w:spacing w:after="0" w:afterAutospacing="0" w:before="0" w:beforeAutospacing="0" w:lineRule="auto"/>
         <w:ind w:left="720" w:hanging="360"/>
@@ -4681,7 +4681,7 @@
       <w:pPr>
         <w:numPr>
           <w:ilvl w:val="0"/>
-          <w:numId w:val="36"/>
+          <w:numId w:val="37"/>
         </w:numPr>
         <w:spacing w:after="0" w:afterAutospacing="0" w:before="0" w:beforeAutospacing="0" w:lineRule="auto"/>
         <w:ind w:left="720" w:hanging="360"/>
@@ -4697,7 +4697,7 @@
       <w:pPr>
         <w:numPr>
           <w:ilvl w:val="0"/>
-          <w:numId w:val="36"/>
+          <w:numId w:val="37"/>
         </w:numPr>
         <w:spacing w:after="0" w:afterAutospacing="0" w:before="0" w:beforeAutospacing="0" w:lineRule="auto"/>
         <w:ind w:left="720" w:hanging="360"/>
@@ -4713,7 +4713,7 @@
       <w:pPr>
         <w:numPr>
           <w:ilvl w:val="0"/>
-          <w:numId w:val="36"/>
+          <w:numId w:val="37"/>
         </w:numPr>
         <w:spacing w:after="0" w:afterAutospacing="0" w:before="0" w:beforeAutospacing="0" w:lineRule="auto"/>
         <w:ind w:left="720" w:hanging="360"/>
@@ -4729,7 +4729,7 @@
       <w:pPr>
         <w:numPr>
           <w:ilvl w:val="0"/>
-          <w:numId w:val="36"/>
+          <w:numId w:val="37"/>
         </w:numPr>
         <w:spacing w:after="0" w:afterAutospacing="0" w:before="0" w:beforeAutospacing="0" w:lineRule="auto"/>
         <w:ind w:left="720" w:hanging="360"/>
@@ -4745,7 +4745,7 @@
       <w:pPr>
         <w:numPr>
           <w:ilvl w:val="0"/>
-          <w:numId w:val="36"/>
+          <w:numId w:val="37"/>
         </w:numPr>
         <w:spacing w:after="0" w:afterAutospacing="0" w:before="0" w:beforeAutospacing="0" w:lineRule="auto"/>
         <w:ind w:left="720" w:hanging="360"/>
@@ -4761,7 +4761,7 @@
       <w:pPr>
         <w:numPr>
           <w:ilvl w:val="0"/>
-          <w:numId w:val="36"/>
+          <w:numId w:val="37"/>
         </w:numPr>
         <w:spacing w:after="0" w:afterAutospacing="0" w:before="0" w:beforeAutospacing="0" w:lineRule="auto"/>
         <w:ind w:left="720" w:hanging="360"/>
@@ -4777,7 +4777,7 @@
       <w:pPr>
         <w:numPr>
           <w:ilvl w:val="0"/>
-          <w:numId w:val="36"/>
+          <w:numId w:val="37"/>
         </w:numPr>
         <w:spacing w:after="0" w:afterAutospacing="0" w:before="0" w:beforeAutospacing="0" w:lineRule="auto"/>
         <w:ind w:left="720" w:hanging="360"/>
@@ -4793,7 +4793,7 @@
       <w:pPr>
         <w:numPr>
           <w:ilvl w:val="0"/>
-          <w:numId w:val="36"/>
+          <w:numId w:val="37"/>
         </w:numPr>
         <w:spacing w:after="0" w:afterAutospacing="0" w:before="0" w:beforeAutospacing="0" w:lineRule="auto"/>
         <w:ind w:left="720" w:hanging="360"/>
@@ -4809,7 +4809,7 @@
       <w:pPr>
         <w:numPr>
           <w:ilvl w:val="0"/>
-          <w:numId w:val="36"/>
+          <w:numId w:val="37"/>
         </w:numPr>
         <w:spacing w:after="0" w:afterAutospacing="0" w:before="0" w:beforeAutospacing="0" w:lineRule="auto"/>
         <w:ind w:left="720" w:hanging="360"/>
@@ -4825,7 +4825,7 @@
       <w:pPr>
         <w:numPr>
           <w:ilvl w:val="0"/>
-          <w:numId w:val="36"/>
+          <w:numId w:val="37"/>
         </w:numPr>
         <w:spacing w:after="240" w:before="0" w:beforeAutospacing="0" w:lineRule="auto"/>
         <w:ind w:left="720" w:hanging="360"/>
@@ -4906,7 +4906,7 @@
       <w:pPr>
         <w:numPr>
           <w:ilvl w:val="0"/>
-          <w:numId w:val="71"/>
+          <w:numId w:val="73"/>
         </w:numPr>
         <w:spacing w:after="0" w:afterAutospacing="0" w:before="240" w:lineRule="auto"/>
         <w:ind w:left="720" w:hanging="360"/>
@@ -4922,7 +4922,7 @@
       <w:pPr>
         <w:numPr>
           <w:ilvl w:val="0"/>
-          <w:numId w:val="71"/>
+          <w:numId w:val="73"/>
         </w:numPr>
         <w:spacing w:after="0" w:afterAutospacing="0" w:before="0" w:beforeAutospacing="0" w:lineRule="auto"/>
         <w:ind w:left="720" w:hanging="360"/>
@@ -4938,7 +4938,7 @@
       <w:pPr>
         <w:numPr>
           <w:ilvl w:val="0"/>
-          <w:numId w:val="71"/>
+          <w:numId w:val="73"/>
         </w:numPr>
         <w:spacing w:after="0" w:afterAutospacing="0" w:before="0" w:beforeAutospacing="0" w:lineRule="auto"/>
         <w:ind w:left="720" w:hanging="360"/>
@@ -4954,7 +4954,7 @@
       <w:pPr>
         <w:numPr>
           <w:ilvl w:val="0"/>
-          <w:numId w:val="71"/>
+          <w:numId w:val="73"/>
         </w:numPr>
         <w:spacing w:after="0" w:afterAutospacing="0" w:before="0" w:beforeAutospacing="0" w:lineRule="auto"/>
         <w:ind w:left="720" w:hanging="360"/>
@@ -4970,7 +4970,7 @@
       <w:pPr>
         <w:numPr>
           <w:ilvl w:val="0"/>
-          <w:numId w:val="71"/>
+          <w:numId w:val="73"/>
         </w:numPr>
         <w:spacing w:after="0" w:afterAutospacing="0" w:before="0" w:beforeAutospacing="0" w:lineRule="auto"/>
         <w:ind w:left="720" w:hanging="360"/>
@@ -4986,7 +4986,7 @@
       <w:pPr>
         <w:numPr>
           <w:ilvl w:val="0"/>
-          <w:numId w:val="71"/>
+          <w:numId w:val="73"/>
         </w:numPr>
         <w:spacing w:after="0" w:afterAutospacing="0" w:before="0" w:beforeAutospacing="0" w:lineRule="auto"/>
         <w:ind w:left="720" w:hanging="360"/>
@@ -5002,7 +5002,7 @@
       <w:pPr>
         <w:numPr>
           <w:ilvl w:val="0"/>
-          <w:numId w:val="71"/>
+          <w:numId w:val="73"/>
         </w:numPr>
         <w:spacing w:after="0" w:afterAutospacing="0" w:before="0" w:beforeAutospacing="0" w:lineRule="auto"/>
         <w:ind w:left="720" w:hanging="360"/>
@@ -5018,7 +5018,7 @@
       <w:pPr>
         <w:numPr>
           <w:ilvl w:val="0"/>
-          <w:numId w:val="71"/>
+          <w:numId w:val="73"/>
         </w:numPr>
         <w:spacing w:after="0" w:afterAutospacing="0" w:before="0" w:beforeAutospacing="0" w:lineRule="auto"/>
         <w:ind w:left="720" w:hanging="360"/>
@@ -5034,7 +5034,7 @@
       <w:pPr>
         <w:numPr>
           <w:ilvl w:val="0"/>
-          <w:numId w:val="71"/>
+          <w:numId w:val="73"/>
         </w:numPr>
         <w:spacing w:after="0" w:afterAutospacing="0" w:before="0" w:beforeAutospacing="0" w:lineRule="auto"/>
         <w:ind w:left="720" w:hanging="360"/>
@@ -5050,7 +5050,7 @@
       <w:pPr>
         <w:numPr>
           <w:ilvl w:val="0"/>
-          <w:numId w:val="71"/>
+          <w:numId w:val="73"/>
         </w:numPr>
         <w:spacing w:after="0" w:afterAutospacing="0" w:before="0" w:beforeAutospacing="0" w:lineRule="auto"/>
         <w:ind w:left="720" w:hanging="360"/>
@@ -5066,7 +5066,7 @@
       <w:pPr>
         <w:numPr>
           <w:ilvl w:val="0"/>
-          <w:numId w:val="71"/>
+          <w:numId w:val="73"/>
         </w:numPr>
         <w:spacing w:after="0" w:afterAutospacing="0" w:before="0" w:beforeAutospacing="0" w:lineRule="auto"/>
         <w:ind w:left="720" w:hanging="360"/>
@@ -5082,7 +5082,7 @@
       <w:pPr>
         <w:numPr>
           <w:ilvl w:val="0"/>
-          <w:numId w:val="71"/>
+          <w:numId w:val="73"/>
         </w:numPr>
         <w:spacing w:after="0" w:afterAutospacing="0" w:before="0" w:beforeAutospacing="0" w:lineRule="auto"/>
         <w:ind w:left="720" w:hanging="360"/>
@@ -5098,7 +5098,7 @@
       <w:pPr>
         <w:numPr>
           <w:ilvl w:val="0"/>
-          <w:numId w:val="71"/>
+          <w:numId w:val="73"/>
         </w:numPr>
         <w:spacing w:after="0" w:afterAutospacing="0" w:before="0" w:beforeAutospacing="0" w:lineRule="auto"/>
         <w:ind w:left="720" w:hanging="360"/>
@@ -5114,7 +5114,7 @@
       <w:pPr>
         <w:numPr>
           <w:ilvl w:val="0"/>
-          <w:numId w:val="71"/>
+          <w:numId w:val="73"/>
         </w:numPr>
         <w:spacing w:after="0" w:afterAutospacing="0" w:before="0" w:beforeAutospacing="0" w:lineRule="auto"/>
         <w:ind w:left="720" w:hanging="360"/>
@@ -5130,7 +5130,7 @@
       <w:pPr>
         <w:numPr>
           <w:ilvl w:val="0"/>
-          <w:numId w:val="71"/>
+          <w:numId w:val="73"/>
         </w:numPr>
         <w:spacing w:after="0" w:afterAutospacing="0" w:before="0" w:beforeAutospacing="0" w:lineRule="auto"/>
         <w:ind w:left="720" w:hanging="360"/>
@@ -5146,7 +5146,7 @@
       <w:pPr>
         <w:numPr>
           <w:ilvl w:val="0"/>
-          <w:numId w:val="71"/>
+          <w:numId w:val="73"/>
         </w:numPr>
         <w:spacing w:after="240" w:before="0" w:beforeAutospacing="0" w:lineRule="auto"/>
         <w:ind w:left="720" w:hanging="360"/>
@@ -5896,7 +5896,7 @@
       <w:pPr>
         <w:numPr>
           <w:ilvl w:val="0"/>
-          <w:numId w:val="52"/>
+          <w:numId w:val="53"/>
         </w:numPr>
         <w:spacing w:after="0" w:afterAutospacing="0" w:before="240" w:lineRule="auto"/>
         <w:ind w:left="720" w:hanging="360"/>
@@ -5916,7 +5916,7 @@
       <w:pPr>
         <w:numPr>
           <w:ilvl w:val="0"/>
-          <w:numId w:val="52"/>
+          <w:numId w:val="53"/>
         </w:numPr>
         <w:spacing w:after="240" w:before="0" w:beforeAutospacing="0" w:lineRule="auto"/>
         <w:ind w:left="720" w:hanging="360"/>
@@ -6098,7 +6098,7 @@
       <w:pPr>
         <w:numPr>
           <w:ilvl w:val="0"/>
-          <w:numId w:val="45"/>
+          <w:numId w:val="46"/>
         </w:numPr>
         <w:spacing w:after="0" w:afterAutospacing="0" w:before="240" w:lineRule="auto"/>
         <w:ind w:left="720" w:hanging="360"/>
@@ -6122,7 +6122,7 @@
       <w:pPr>
         <w:numPr>
           <w:ilvl w:val="0"/>
-          <w:numId w:val="45"/>
+          <w:numId w:val="46"/>
         </w:numPr>
         <w:spacing w:after="0" w:afterAutospacing="0" w:before="0" w:beforeAutospacing="0" w:lineRule="auto"/>
         <w:ind w:left="720" w:hanging="360"/>
@@ -6146,7 +6146,7 @@
       <w:pPr>
         <w:numPr>
           <w:ilvl w:val="0"/>
-          <w:numId w:val="45"/>
+          <w:numId w:val="46"/>
         </w:numPr>
         <w:spacing w:after="0" w:afterAutospacing="0" w:before="0" w:beforeAutospacing="0" w:lineRule="auto"/>
         <w:ind w:left="720" w:hanging="360"/>
@@ -6170,7 +6170,7 @@
       <w:pPr>
         <w:numPr>
           <w:ilvl w:val="0"/>
-          <w:numId w:val="45"/>
+          <w:numId w:val="46"/>
         </w:numPr>
         <w:spacing w:after="240" w:before="0" w:beforeAutospacing="0" w:lineRule="auto"/>
         <w:ind w:left="720" w:hanging="360"/>
@@ -6557,7 +6557,7 @@
       <w:pPr>
         <w:numPr>
           <w:ilvl w:val="0"/>
-          <w:numId w:val="60"/>
+          <w:numId w:val="61"/>
         </w:numPr>
         <w:spacing w:after="0" w:afterAutospacing="0" w:before="240" w:lineRule="auto"/>
         <w:ind w:left="720" w:hanging="360"/>
@@ -6573,7 +6573,7 @@
       <w:pPr>
         <w:numPr>
           <w:ilvl w:val="0"/>
-          <w:numId w:val="60"/>
+          <w:numId w:val="61"/>
         </w:numPr>
         <w:spacing w:after="0" w:afterAutospacing="0" w:before="0" w:beforeAutospacing="0" w:lineRule="auto"/>
         <w:ind w:left="720" w:hanging="360"/>
@@ -6589,7 +6589,7 @@
       <w:pPr>
         <w:numPr>
           <w:ilvl w:val="0"/>
-          <w:numId w:val="60"/>
+          <w:numId w:val="61"/>
         </w:numPr>
         <w:spacing w:after="0" w:afterAutospacing="0" w:before="0" w:beforeAutospacing="0" w:lineRule="auto"/>
         <w:ind w:left="720" w:hanging="360"/>
@@ -6605,7 +6605,7 @@
       <w:pPr>
         <w:numPr>
           <w:ilvl w:val="0"/>
-          <w:numId w:val="60"/>
+          <w:numId w:val="61"/>
         </w:numPr>
         <w:spacing w:after="0" w:afterAutospacing="0" w:before="0" w:beforeAutospacing="0" w:lineRule="auto"/>
         <w:ind w:left="720" w:hanging="360"/>
@@ -6621,7 +6621,7 @@
       <w:pPr>
         <w:numPr>
           <w:ilvl w:val="0"/>
-          <w:numId w:val="60"/>
+          <w:numId w:val="61"/>
         </w:numPr>
         <w:spacing w:after="0" w:afterAutospacing="0" w:before="0" w:beforeAutospacing="0" w:lineRule="auto"/>
         <w:ind w:left="720" w:hanging="360"/>
@@ -6637,7 +6637,7 @@
       <w:pPr>
         <w:numPr>
           <w:ilvl w:val="0"/>
-          <w:numId w:val="60"/>
+          <w:numId w:val="61"/>
         </w:numPr>
         <w:spacing w:after="0" w:afterAutospacing="0" w:before="0" w:beforeAutospacing="0" w:lineRule="auto"/>
         <w:ind w:left="720" w:hanging="360"/>
@@ -6653,7 +6653,7 @@
       <w:pPr>
         <w:numPr>
           <w:ilvl w:val="0"/>
-          <w:numId w:val="60"/>
+          <w:numId w:val="61"/>
         </w:numPr>
         <w:spacing w:after="0" w:afterAutospacing="0" w:before="0" w:beforeAutospacing="0" w:lineRule="auto"/>
         <w:ind w:left="720" w:hanging="360"/>
@@ -6669,7 +6669,7 @@
       <w:pPr>
         <w:numPr>
           <w:ilvl w:val="0"/>
-          <w:numId w:val="60"/>
+          <w:numId w:val="61"/>
         </w:numPr>
         <w:spacing w:after="0" w:afterAutospacing="0" w:before="0" w:beforeAutospacing="0" w:lineRule="auto"/>
         <w:ind w:left="720" w:hanging="360"/>
@@ -6685,7 +6685,7 @@
       <w:pPr>
         <w:numPr>
           <w:ilvl w:val="0"/>
-          <w:numId w:val="60"/>
+          <w:numId w:val="61"/>
         </w:numPr>
         <w:spacing w:after="0" w:afterAutospacing="0" w:before="0" w:beforeAutospacing="0" w:lineRule="auto"/>
         <w:ind w:left="720" w:hanging="360"/>
@@ -6701,7 +6701,7 @@
       <w:pPr>
         <w:numPr>
           <w:ilvl w:val="0"/>
-          <w:numId w:val="60"/>
+          <w:numId w:val="61"/>
         </w:numPr>
         <w:spacing w:after="0" w:afterAutospacing="0" w:before="0" w:beforeAutospacing="0" w:lineRule="auto"/>
         <w:ind w:left="720" w:hanging="360"/>
@@ -6717,7 +6717,7 @@
       <w:pPr>
         <w:numPr>
           <w:ilvl w:val="0"/>
-          <w:numId w:val="60"/>
+          <w:numId w:val="61"/>
         </w:numPr>
         <w:spacing w:after="0" w:afterAutospacing="0" w:before="0" w:beforeAutospacing="0" w:lineRule="auto"/>
         <w:ind w:left="720" w:hanging="360"/>
@@ -6733,7 +6733,7 @@
       <w:pPr>
         <w:numPr>
           <w:ilvl w:val="0"/>
-          <w:numId w:val="60"/>
+          <w:numId w:val="61"/>
         </w:numPr>
         <w:spacing w:after="0" w:afterAutospacing="0" w:before="0" w:beforeAutospacing="0" w:lineRule="auto"/>
         <w:ind w:left="720" w:hanging="360"/>
@@ -6749,7 +6749,7 @@
       <w:pPr>
         <w:numPr>
           <w:ilvl w:val="0"/>
-          <w:numId w:val="60"/>
+          <w:numId w:val="61"/>
         </w:numPr>
         <w:spacing w:after="0" w:afterAutospacing="0" w:before="0" w:beforeAutospacing="0" w:lineRule="auto"/>
         <w:ind w:left="720" w:hanging="360"/>
@@ -6765,7 +6765,7 @@
       <w:pPr>
         <w:numPr>
           <w:ilvl w:val="0"/>
-          <w:numId w:val="60"/>
+          <w:numId w:val="61"/>
         </w:numPr>
         <w:spacing w:after="240" w:before="0" w:beforeAutospacing="0" w:lineRule="auto"/>
         <w:ind w:left="720" w:hanging="360"/>
@@ -7140,7 +7140,245 @@
         <w:rPr>
           <w:rtl w:val="0"/>
         </w:rPr>
-        <w:t xml:space="preserve"> como el contrato que representa la evidencia externa normalizada mínima necesaria para realizar el reconocimiento contractual.</w:t>
+        <w:t xml:space="preserve"> como contrato de evidencia externa normalizada previa al reconocimiento contractual.</w:t>
+      </w:r>
+    </w:p>
+    <w:p>
+      <w:pPr>
+        <w:spacing w:after="240" w:before="240" w:lineRule="auto"/>
+        <w:rPr/>
+      </w:pPr>
+      <w:r>
+        <w:rPr>
+          <w:rtl w:val="0"/>
+        </w:rPr>
+        <w:t xml:space="preserve">Su información pública será exactamente:</w:t>
+      </w:r>
+    </w:p>
+    <w:p>
+      <w:pPr>
+        <w:numPr>
+          <w:ilvl w:val="0"/>
+          <w:numId w:val="13"/>
+        </w:numPr>
+        <w:spacing w:after="0" w:afterAutospacing="0" w:before="240" w:lineRule="auto"/>
+        <w:ind w:left="720" w:hanging="360"/>
+      </w:pPr>
+      <w:r>
+        <w:rPr>
+          <w:rFonts w:ascii="Roboto Mono" w:cs="Roboto Mono" w:eastAsia="Roboto Mono" w:hAnsi="Roboto Mono"/>
+          <w:color w:val="188038"/>
+          <w:rtl w:val="0"/>
+        </w:rPr>
+        <w:t xml:space="preserve">admitted: bool</w:t>
+      </w:r>
+    </w:p>
+    <w:p>
+      <w:pPr>
+        <w:numPr>
+          <w:ilvl w:val="0"/>
+          <w:numId w:val="13"/>
+        </w:numPr>
+        <w:spacing w:after="240" w:before="0" w:beforeAutospacing="0" w:lineRule="auto"/>
+        <w:ind w:left="720" w:hanging="360"/>
+      </w:pPr>
+      <w:r>
+        <w:rPr>
+          <w:rFonts w:ascii="Roboto Mono" w:cs="Roboto Mono" w:eastAsia="Roboto Mono" w:hAnsi="Roboto Mono"/>
+          <w:color w:val="188038"/>
+          <w:rtl w:val="0"/>
+        </w:rPr>
+        <w:t xml:space="preserve">rejected: bool</w:t>
+      </w:r>
+    </w:p>
+    <w:p>
+      <w:pPr>
+        <w:spacing w:after="240" w:before="240" w:lineRule="auto"/>
+        <w:rPr/>
+      </w:pPr>
+      <w:r>
+        <w:rPr>
+          <w:rtl w:val="0"/>
+        </w:rPr>
+        <w:t xml:space="preserve">Los campos representan evidencia observada, no </w:t>
+      </w:r>
+      <w:r>
+        <w:rPr>
+          <w:rFonts w:ascii="Roboto Mono" w:cs="Roboto Mono" w:eastAsia="Roboto Mono" w:hAnsi="Roboto Mono"/>
+          <w:color w:val="188038"/>
+          <w:rtl w:val="0"/>
+        </w:rPr>
+        <w:t xml:space="preserve">AdmissionDecision</w:t>
+      </w:r>
+      <w:r>
+        <w:rPr>
+          <w:rtl w:val="0"/>
+        </w:rPr>
+        <w:t xml:space="preserve">.</w:t>
+      </w:r>
+    </w:p>
+    <w:p>
+      <w:pPr>
+        <w:spacing w:after="240" w:before="240" w:lineRule="auto"/>
+        <w:rPr/>
+      </w:pPr>
+      <w:r>
+        <w:rPr>
+          <w:rtl w:val="0"/>
+        </w:rPr>
+        <w:t xml:space="preserve">Su semántica contractual será:</w:t>
+      </w:r>
+    </w:p>
+    <w:p>
+      <w:pPr>
+        <w:numPr>
+          <w:ilvl w:val="0"/>
+          <w:numId w:val="64"/>
+        </w:numPr>
+        <w:spacing w:after="0" w:afterAutospacing="0" w:before="240" w:lineRule="auto"/>
+        <w:ind w:left="720" w:hanging="360"/>
+      </w:pPr>
+      <w:r>
+        <w:rPr>
+          <w:rFonts w:ascii="Roboto Mono" w:cs="Roboto Mono" w:eastAsia="Roboto Mono" w:hAnsi="Roboto Mono"/>
+          <w:color w:val="188038"/>
+          <w:rtl w:val="0"/>
+        </w:rPr>
+        <w:t xml:space="preserve">admitted=True</w:t>
+      </w:r>
+      <w:r>
+        <w:rPr>
+          <w:rtl w:val="0"/>
+        </w:rPr>
+        <w:t xml:space="preserve">, </w:t>
+      </w:r>
+      <w:r>
+        <w:rPr>
+          <w:rFonts w:ascii="Roboto Mono" w:cs="Roboto Mono" w:eastAsia="Roboto Mono" w:hAnsi="Roboto Mono"/>
+          <w:color w:val="188038"/>
+          <w:rtl w:val="0"/>
+        </w:rPr>
+        <w:t xml:space="preserve">rejected=False</w:t>
+      </w:r>
+      <w:r>
+        <w:rPr>
+          <w:rtl w:val="0"/>
+        </w:rPr>
+        <w:t xml:space="preserve">: evidencia inequívoca compatible con admisión;</w:t>
+      </w:r>
+    </w:p>
+    <w:p>
+      <w:pPr>
+        <w:numPr>
+          <w:ilvl w:val="0"/>
+          <w:numId w:val="64"/>
+        </w:numPr>
+        <w:spacing w:after="0" w:afterAutospacing="0" w:before="0" w:beforeAutospacing="0" w:lineRule="auto"/>
+        <w:ind w:left="720" w:hanging="360"/>
+      </w:pPr>
+      <w:r>
+        <w:rPr>
+          <w:rFonts w:ascii="Roboto Mono" w:cs="Roboto Mono" w:eastAsia="Roboto Mono" w:hAnsi="Roboto Mono"/>
+          <w:color w:val="188038"/>
+          <w:rtl w:val="0"/>
+        </w:rPr>
+        <w:t xml:space="preserve">admitted=False</w:t>
+      </w:r>
+      <w:r>
+        <w:rPr>
+          <w:rtl w:val="0"/>
+        </w:rPr>
+        <w:t xml:space="preserve">, </w:t>
+      </w:r>
+      <w:r>
+        <w:rPr>
+          <w:rFonts w:ascii="Roboto Mono" w:cs="Roboto Mono" w:eastAsia="Roboto Mono" w:hAnsi="Roboto Mono"/>
+          <w:color w:val="188038"/>
+          <w:rtl w:val="0"/>
+        </w:rPr>
+        <w:t xml:space="preserve">rejected=True</w:t>
+      </w:r>
+      <w:r>
+        <w:rPr>
+          <w:rtl w:val="0"/>
+        </w:rPr>
+        <w:t xml:space="preserve">: evidencia inequívoca compatible con rechazo;</w:t>
+      </w:r>
+    </w:p>
+    <w:p>
+      <w:pPr>
+        <w:numPr>
+          <w:ilvl w:val="0"/>
+          <w:numId w:val="64"/>
+        </w:numPr>
+        <w:spacing w:after="0" w:afterAutospacing="0" w:before="0" w:beforeAutospacing="0" w:lineRule="auto"/>
+        <w:ind w:left="720" w:hanging="360"/>
+      </w:pPr>
+      <w:r>
+        <w:rPr>
+          <w:rFonts w:ascii="Roboto Mono" w:cs="Roboto Mono" w:eastAsia="Roboto Mono" w:hAnsi="Roboto Mono"/>
+          <w:color w:val="188038"/>
+          <w:rtl w:val="0"/>
+        </w:rPr>
+        <w:t xml:space="preserve">admitted=False</w:t>
+      </w:r>
+      <w:r>
+        <w:rPr>
+          <w:rtl w:val="0"/>
+        </w:rPr>
+        <w:t xml:space="preserve">, </w:t>
+      </w:r>
+      <w:r>
+        <w:rPr>
+          <w:rFonts w:ascii="Roboto Mono" w:cs="Roboto Mono" w:eastAsia="Roboto Mono" w:hAnsi="Roboto Mono"/>
+          <w:color w:val="188038"/>
+          <w:rtl w:val="0"/>
+        </w:rPr>
+        <w:t xml:space="preserve">rejected=False</w:t>
+      </w:r>
+      <w:r>
+        <w:rPr>
+          <w:rtl w:val="0"/>
+        </w:rPr>
+        <w:t xml:space="preserve">: evidencia insuficiente;</w:t>
+      </w:r>
+    </w:p>
+    <w:p>
+      <w:pPr>
+        <w:numPr>
+          <w:ilvl w:val="0"/>
+          <w:numId w:val="64"/>
+        </w:numPr>
+        <w:spacing w:after="240" w:before="0" w:beforeAutospacing="0" w:lineRule="auto"/>
+        <w:ind w:left="720" w:hanging="360"/>
+      </w:pPr>
+      <w:r>
+        <w:rPr>
+          <w:rFonts w:ascii="Roboto Mono" w:cs="Roboto Mono" w:eastAsia="Roboto Mono" w:hAnsi="Roboto Mono"/>
+          <w:color w:val="188038"/>
+          <w:rtl w:val="0"/>
+        </w:rPr>
+        <w:t xml:space="preserve">admitted=True</w:t>
+      </w:r>
+      <w:r>
+        <w:rPr>
+          <w:rtl w:val="0"/>
+        </w:rPr>
+        <w:t xml:space="preserve">, </w:t>
+      </w:r>
+      <w:r>
+        <w:rPr>
+          <w:rFonts w:ascii="Roboto Mono" w:cs="Roboto Mono" w:eastAsia="Roboto Mono" w:hAnsi="Roboto Mono"/>
+          <w:color w:val="188038"/>
+          <w:rtl w:val="0"/>
+        </w:rPr>
+        <w:t xml:space="preserve">rejected=True</w:t>
+      </w:r>
+      <w:r>
+        <w:rPr>
+          <w:rtl w:val="0"/>
+        </w:rPr>
+        <w:t xml:space="preserve">: evidencia ambigua o contradictoria.</w:t>
       </w:r>
     </w:p>
     <w:p>
@@ -7160,7 +7398,7 @@
         <w:rPr>
           <w:rtl w:val="0"/>
         </w:rPr>
-        <w:t xml:space="preserve"> no constituye </w:t>
+        <w:t xml:space="preserve"> no produce por sí misma </w:t>
       </w:r>
       <w:r>
         <w:rPr>
@@ -7174,15 +7412,27 @@
         <w:rPr>
           <w:rtl w:val="0"/>
         </w:rPr>
-        <w:t xml:space="preserve"> ni determina por sí misma </w:t>
-      </w:r>
-      <w:r>
-        <w:rPr>
-          <w:rFonts w:ascii="Roboto Mono" w:cs="Roboto Mono" w:eastAsia="Roboto Mono" w:hAnsi="Roboto Mono"/>
-          <w:color w:val="188038"/>
-          <w:rtl w:val="0"/>
-        </w:rPr>
-        <w:t xml:space="preserve">ADMITTED</w:t>
+        <w:t xml:space="preserve">.</w:t>
+      </w:r>
+    </w:p>
+    <w:p>
+      <w:pPr>
+        <w:spacing w:after="240" w:before="240" w:lineRule="auto"/>
+        <w:rPr/>
+      </w:pPr>
+      <w:r>
+        <w:rPr>
+          <w:rtl w:val="0"/>
+        </w:rPr>
+        <w:t xml:space="preserve">La transformación de esta evidencia en </w:t>
+      </w:r>
+      <w:r>
+        <w:rPr>
+          <w:rFonts w:ascii="Roboto Mono" w:cs="Roboto Mono" w:eastAsia="Roboto Mono" w:hAnsi="Roboto Mono"/>
+          <w:color w:val="188038"/>
+          <w:rtl w:val="0"/>
+        </w:rPr>
+        <w:t xml:space="preserve">AdmissionDecision.ADMITTED</w:t>
       </w:r>
       <w:r>
         <w:rPr>
@@ -7196,21 +7446,7 @@
           <w:color w:val="188038"/>
           <w:rtl w:val="0"/>
         </w:rPr>
-        <w:t xml:space="preserve">REJECTED</w:t>
-      </w:r>
-      <w:r>
-        <w:rPr>
-          <w:rtl w:val="0"/>
-        </w:rPr>
-        <w:t xml:space="preserve">. La transformación de esta observación en </w:t>
-      </w:r>
-      <w:r>
-        <w:rPr>
-          <w:rFonts w:ascii="Roboto Mono" w:cs="Roboto Mono" w:eastAsia="Roboto Mono" w:hAnsi="Roboto Mono"/>
-          <w:color w:val="188038"/>
-          <w:rtl w:val="0"/>
-        </w:rPr>
-        <w:t xml:space="preserve">AdmissionDecision</w:t>
+        <w:t xml:space="preserve">AdmissionDecision.REJECTED</w:t>
       </w:r>
       <w:r>
         <w:rPr>
@@ -7231,6 +7467,17 @@
           <w:rtl w:val="0"/>
         </w:rPr>
         <w:t xml:space="preserve">.</w:t>
+      </w:r>
+    </w:p>
+    <w:p>
+      <w:pPr>
+        <w:spacing w:after="240" w:before="240" w:lineRule="auto"/>
+        <w:rPr/>
+      </w:pPr>
+      <w:r>
+        <w:rPr>
+          <w:rtl w:val="0"/>
+        </w:rPr>
       </w:r>
     </w:p>
     <w:p>
@@ -7383,7 +7630,7 @@
       <w:pPr>
         <w:numPr>
           <w:ilvl w:val="0"/>
-          <w:numId w:val="48"/>
+          <w:numId w:val="49"/>
         </w:numPr>
         <w:spacing w:after="0" w:afterAutospacing="0" w:before="240" w:lineRule="auto"/>
         <w:ind w:left="720" w:hanging="360"/>
@@ -7399,7 +7646,7 @@
       <w:pPr>
         <w:numPr>
           <w:ilvl w:val="0"/>
-          <w:numId w:val="48"/>
+          <w:numId w:val="49"/>
         </w:numPr>
         <w:spacing w:after="240" w:before="0" w:beforeAutospacing="0" w:lineRule="auto"/>
         <w:ind w:left="720" w:hanging="360"/>
@@ -7553,6 +7800,82 @@
     <w:p>
       <w:pPr>
         <w:spacing w:after="240" w:before="240" w:lineRule="auto"/>
+        <w:rPr/>
+      </w:pPr>
+      <w:r>
+        <w:rPr>
+          <w:rFonts w:ascii="Roboto Mono" w:cs="Roboto Mono" w:eastAsia="Roboto Mono" w:hAnsi="Roboto Mono"/>
+          <w:color w:val="188038"/>
+          <w:rtl w:val="0"/>
+        </w:rPr>
+        <w:t xml:space="preserve">OperationalAdmissionBoundary</w:t>
+      </w:r>
+      <w:r>
+        <w:rPr>
+          <w:rtl w:val="0"/>
+        </w:rPr>
+        <w:t xml:space="preserve"> podrá producir cualquiera de las cuatro configuraciones válidas de </w:t>
+      </w:r>
+      <w:r>
+        <w:rPr>
+          <w:rFonts w:ascii="Roboto Mono" w:cs="Roboto Mono" w:eastAsia="Roboto Mono" w:hAnsi="Roboto Mono"/>
+          <w:color w:val="188038"/>
+          <w:rtl w:val="0"/>
+        </w:rPr>
+        <w:t xml:space="preserve">OperationalAdmissionObservation</w:t>
+      </w:r>
+      <w:r>
+        <w:rPr>
+          <w:rtl w:val="0"/>
+        </w:rPr>
+        <w:t xml:space="preserve">. Solo las configuraciones con evidencia inequívoca permiten a </w:t>
+      </w:r>
+      <w:r>
+        <w:rPr>
+          <w:rFonts w:ascii="Roboto Mono" w:cs="Roboto Mono" w:eastAsia="Roboto Mono" w:hAnsi="Roboto Mono"/>
+          <w:color w:val="188038"/>
+          <w:rtl w:val="0"/>
+        </w:rPr>
+        <w:t xml:space="preserve">recognize_admission</w:t>
+      </w:r>
+      <w:r>
+        <w:rPr>
+          <w:rtl w:val="0"/>
+        </w:rPr>
+        <w:t xml:space="preserve"> producir un </w:t>
+      </w:r>
+      <w:r>
+        <w:rPr>
+          <w:rFonts w:ascii="Roboto Mono" w:cs="Roboto Mono" w:eastAsia="Roboto Mono" w:hAnsi="Roboto Mono"/>
+          <w:color w:val="188038"/>
+          <w:rtl w:val="0"/>
+        </w:rPr>
+        <w:t xml:space="preserve">OperationalAdmission</w:t>
+      </w:r>
+      <w:r>
+        <w:rPr>
+          <w:rtl w:val="0"/>
+        </w:rPr>
+        <w:t xml:space="preserve">; las configuraciones insuficiente o ambigua deberán conducir a </w:t>
+      </w:r>
+      <w:r>
+        <w:rPr>
+          <w:rFonts w:ascii="Roboto Mono" w:cs="Roboto Mono" w:eastAsia="Roboto Mono" w:hAnsi="Roboto Mono"/>
+          <w:color w:val="188038"/>
+          <w:rtl w:val="0"/>
+        </w:rPr>
+        <w:t xml:space="preserve">OperationalAdmissionDomainError</w:t>
+      </w:r>
+      <w:r>
+        <w:rPr>
+          <w:rtl w:val="0"/>
+        </w:rPr>
+        <w:t xml:space="preserve">. </w:t>
+      </w:r>
+    </w:p>
+    <w:p>
+      <w:pPr>
+        <w:spacing w:after="240" w:before="240" w:lineRule="auto"/>
         <w:rPr>
           <w:rFonts w:ascii="Roboto Mono" w:cs="Roboto Mono" w:eastAsia="Roboto Mono" w:hAnsi="Roboto Mono"/>
           <w:color w:val="188038"/>
@@ -7633,7 +7956,7 @@
       <w:pPr>
         <w:numPr>
           <w:ilvl w:val="0"/>
-          <w:numId w:val="53"/>
+          <w:numId w:val="54"/>
         </w:numPr>
         <w:spacing w:after="0" w:afterAutospacing="0" w:before="240" w:lineRule="auto"/>
         <w:ind w:left="720" w:hanging="360"/>
@@ -7649,7 +7972,7 @@
       <w:pPr>
         <w:numPr>
           <w:ilvl w:val="0"/>
-          <w:numId w:val="53"/>
+          <w:numId w:val="54"/>
         </w:numPr>
         <w:spacing w:after="0" w:afterAutospacing="0" w:before="0" w:beforeAutospacing="0" w:lineRule="auto"/>
         <w:ind w:left="720" w:hanging="360"/>
@@ -7665,7 +7988,7 @@
       <w:pPr>
         <w:numPr>
           <w:ilvl w:val="0"/>
-          <w:numId w:val="53"/>
+          <w:numId w:val="54"/>
         </w:numPr>
         <w:spacing w:after="0" w:afterAutospacing="0" w:before="0" w:beforeAutospacing="0" w:lineRule="auto"/>
         <w:ind w:left="720" w:hanging="360"/>
@@ -7681,7 +8004,7 @@
       <w:pPr>
         <w:numPr>
           <w:ilvl w:val="0"/>
-          <w:numId w:val="53"/>
+          <w:numId w:val="54"/>
         </w:numPr>
         <w:spacing w:after="240" w:before="0" w:beforeAutospacing="0" w:lineRule="auto"/>
         <w:ind w:left="720" w:hanging="360"/>
@@ -7808,7 +8131,7 @@
       <w:pPr>
         <w:numPr>
           <w:ilvl w:val="0"/>
-          <w:numId w:val="21"/>
+          <w:numId w:val="22"/>
         </w:numPr>
         <w:spacing w:after="0" w:afterAutospacing="0" w:before="240" w:lineRule="auto"/>
         <w:ind w:left="720" w:hanging="360"/>
@@ -7824,7 +8147,7 @@
       <w:pPr>
         <w:numPr>
           <w:ilvl w:val="0"/>
-          <w:numId w:val="21"/>
+          <w:numId w:val="22"/>
         </w:numPr>
         <w:spacing w:after="0" w:afterAutospacing="0" w:before="0" w:beforeAutospacing="0" w:lineRule="auto"/>
         <w:ind w:left="720" w:hanging="360"/>
@@ -7840,7 +8163,7 @@
       <w:pPr>
         <w:numPr>
           <w:ilvl w:val="0"/>
-          <w:numId w:val="21"/>
+          <w:numId w:val="22"/>
         </w:numPr>
         <w:spacing w:after="0" w:afterAutospacing="0" w:before="0" w:beforeAutospacing="0" w:lineRule="auto"/>
         <w:ind w:left="720" w:hanging="360"/>
@@ -7856,7 +8179,7 @@
       <w:pPr>
         <w:numPr>
           <w:ilvl w:val="0"/>
-          <w:numId w:val="21"/>
+          <w:numId w:val="22"/>
         </w:numPr>
         <w:spacing w:after="0" w:afterAutospacing="0" w:before="0" w:beforeAutospacing="0" w:lineRule="auto"/>
         <w:ind w:left="720" w:hanging="360"/>
@@ -7872,7 +8195,7 @@
       <w:pPr>
         <w:numPr>
           <w:ilvl w:val="0"/>
-          <w:numId w:val="21"/>
+          <w:numId w:val="22"/>
         </w:numPr>
         <w:spacing w:after="0" w:afterAutospacing="0" w:before="0" w:beforeAutospacing="0" w:lineRule="auto"/>
         <w:ind w:left="720" w:hanging="360"/>
@@ -7888,7 +8211,7 @@
       <w:pPr>
         <w:numPr>
           <w:ilvl w:val="0"/>
-          <w:numId w:val="21"/>
+          <w:numId w:val="22"/>
         </w:numPr>
         <w:spacing w:after="240" w:before="0" w:beforeAutospacing="0" w:lineRule="auto"/>
         <w:ind w:left="720" w:hanging="360"/>
@@ -8325,7 +8648,7 @@
       <w:pPr>
         <w:numPr>
           <w:ilvl w:val="0"/>
-          <w:numId w:val="31"/>
+          <w:numId w:val="32"/>
         </w:numPr>
         <w:spacing w:after="0" w:afterAutospacing="0" w:before="240" w:lineRule="auto"/>
         <w:ind w:left="720" w:hanging="360"/>
@@ -8355,7 +8678,7 @@
       <w:pPr>
         <w:numPr>
           <w:ilvl w:val="0"/>
-          <w:numId w:val="31"/>
+          <w:numId w:val="32"/>
         </w:numPr>
         <w:spacing w:after="0" w:afterAutospacing="0" w:before="0" w:beforeAutospacing="0" w:lineRule="auto"/>
         <w:ind w:left="720" w:hanging="360"/>
@@ -8385,7 +8708,7 @@
       <w:pPr>
         <w:numPr>
           <w:ilvl w:val="0"/>
-          <w:numId w:val="31"/>
+          <w:numId w:val="32"/>
         </w:numPr>
         <w:spacing w:after="240" w:before="0" w:beforeAutospacing="0" w:lineRule="auto"/>
         <w:ind w:left="720" w:hanging="360"/>
@@ -9107,7 +9430,7 @@
       <w:pPr>
         <w:numPr>
           <w:ilvl w:val="0"/>
-          <w:numId w:val="61"/>
+          <w:numId w:val="62"/>
         </w:numPr>
         <w:spacing w:after="0" w:afterAutospacing="0" w:before="240" w:lineRule="auto"/>
         <w:ind w:left="720" w:hanging="360"/>
@@ -9123,7 +9446,7 @@
       <w:pPr>
         <w:numPr>
           <w:ilvl w:val="0"/>
-          <w:numId w:val="61"/>
+          <w:numId w:val="62"/>
         </w:numPr>
         <w:spacing w:after="0" w:afterAutospacing="0" w:before="0" w:beforeAutospacing="0" w:lineRule="auto"/>
         <w:ind w:left="720" w:hanging="360"/>
@@ -9139,7 +9462,7 @@
       <w:pPr>
         <w:numPr>
           <w:ilvl w:val="0"/>
-          <w:numId w:val="61"/>
+          <w:numId w:val="62"/>
         </w:numPr>
         <w:spacing w:after="0" w:afterAutospacing="0" w:before="0" w:beforeAutospacing="0" w:lineRule="auto"/>
         <w:ind w:left="720" w:hanging="360"/>
@@ -9155,7 +9478,7 @@
       <w:pPr>
         <w:numPr>
           <w:ilvl w:val="0"/>
-          <w:numId w:val="61"/>
+          <w:numId w:val="62"/>
         </w:numPr>
         <w:spacing w:after="0" w:afterAutospacing="0" w:before="0" w:beforeAutospacing="0" w:lineRule="auto"/>
         <w:ind w:left="720" w:hanging="360"/>
@@ -9171,7 +9494,7 @@
       <w:pPr>
         <w:numPr>
           <w:ilvl w:val="0"/>
-          <w:numId w:val="61"/>
+          <w:numId w:val="62"/>
         </w:numPr>
         <w:spacing w:after="240" w:before="0" w:beforeAutospacing="0" w:lineRule="auto"/>
         <w:ind w:left="720" w:hanging="360"/>
@@ -9844,7 +10167,7 @@
       <w:pPr>
         <w:numPr>
           <w:ilvl w:val="0"/>
-          <w:numId w:val="38"/>
+          <w:numId w:val="39"/>
         </w:numPr>
         <w:spacing w:after="0" w:afterAutospacing="0" w:before="240" w:lineRule="auto"/>
         <w:ind w:left="720" w:hanging="360"/>
@@ -9880,7 +10203,7 @@
       <w:pPr>
         <w:numPr>
           <w:ilvl w:val="0"/>
-          <w:numId w:val="38"/>
+          <w:numId w:val="39"/>
         </w:numPr>
         <w:spacing w:after="240" w:before="0" w:beforeAutospacing="0" w:lineRule="auto"/>
         <w:ind w:left="720" w:hanging="360"/>
@@ -9999,7 +10322,7 @@
       <w:pPr>
         <w:numPr>
           <w:ilvl w:val="0"/>
-          <w:numId w:val="59"/>
+          <w:numId w:val="60"/>
         </w:numPr>
         <w:spacing w:after="0" w:afterAutospacing="0" w:before="240" w:lineRule="auto"/>
         <w:ind w:left="720" w:hanging="360"/>
@@ -10017,7 +10340,7 @@
       <w:pPr>
         <w:numPr>
           <w:ilvl w:val="0"/>
-          <w:numId w:val="59"/>
+          <w:numId w:val="60"/>
         </w:numPr>
         <w:spacing w:after="0" w:afterAutospacing="0" w:before="0" w:beforeAutospacing="0" w:lineRule="auto"/>
         <w:ind w:left="720" w:hanging="360"/>
@@ -10035,7 +10358,7 @@
       <w:pPr>
         <w:numPr>
           <w:ilvl w:val="0"/>
-          <w:numId w:val="59"/>
+          <w:numId w:val="60"/>
         </w:numPr>
         <w:spacing w:after="0" w:afterAutospacing="0" w:before="0" w:beforeAutospacing="0" w:lineRule="auto"/>
         <w:ind w:left="720" w:hanging="360"/>
@@ -10053,7 +10376,7 @@
       <w:pPr>
         <w:numPr>
           <w:ilvl w:val="0"/>
-          <w:numId w:val="59"/>
+          <w:numId w:val="60"/>
         </w:numPr>
         <w:spacing w:after="0" w:afterAutospacing="0" w:before="0" w:beforeAutospacing="0" w:lineRule="auto"/>
         <w:ind w:left="720" w:hanging="360"/>
@@ -10071,7 +10394,7 @@
       <w:pPr>
         <w:numPr>
           <w:ilvl w:val="0"/>
-          <w:numId w:val="59"/>
+          <w:numId w:val="60"/>
         </w:numPr>
         <w:spacing w:after="0" w:afterAutospacing="0" w:before="0" w:beforeAutospacing="0" w:lineRule="auto"/>
         <w:ind w:left="720" w:hanging="360"/>
@@ -10089,7 +10412,7 @@
       <w:pPr>
         <w:numPr>
           <w:ilvl w:val="0"/>
-          <w:numId w:val="59"/>
+          <w:numId w:val="60"/>
         </w:numPr>
         <w:spacing w:after="240" w:before="0" w:beforeAutospacing="0" w:lineRule="auto"/>
         <w:ind w:left="720" w:hanging="360"/>
@@ -10617,7 +10940,7 @@
       <w:pPr>
         <w:numPr>
           <w:ilvl w:val="0"/>
-          <w:numId w:val="19"/>
+          <w:numId w:val="20"/>
         </w:numPr>
         <w:spacing w:after="0" w:afterAutospacing="0" w:before="240" w:lineRule="auto"/>
         <w:ind w:left="720" w:hanging="360"/>
@@ -10641,7 +10964,7 @@
       <w:pPr>
         <w:numPr>
           <w:ilvl w:val="0"/>
-          <w:numId w:val="19"/>
+          <w:numId w:val="20"/>
         </w:numPr>
         <w:spacing w:after="0" w:afterAutospacing="0" w:before="0" w:beforeAutospacing="0" w:lineRule="auto"/>
         <w:ind w:left="720" w:hanging="360"/>
@@ -10665,7 +10988,7 @@
       <w:pPr>
         <w:numPr>
           <w:ilvl w:val="0"/>
-          <w:numId w:val="19"/>
+          <w:numId w:val="20"/>
         </w:numPr>
         <w:spacing w:after="0" w:afterAutospacing="0" w:before="0" w:beforeAutospacing="0" w:lineRule="auto"/>
         <w:ind w:left="720" w:hanging="360"/>
@@ -10689,7 +11012,7 @@
       <w:pPr>
         <w:numPr>
           <w:ilvl w:val="0"/>
-          <w:numId w:val="19"/>
+          <w:numId w:val="20"/>
         </w:numPr>
         <w:spacing w:after="240" w:before="0" w:beforeAutospacing="0" w:lineRule="auto"/>
         <w:ind w:left="720" w:hanging="360"/>
@@ -11432,7 +11755,7 @@
       <w:pPr>
         <w:numPr>
           <w:ilvl w:val="0"/>
-          <w:numId w:val="18"/>
+          <w:numId w:val="19"/>
         </w:numPr>
         <w:spacing w:after="0" w:afterAutospacing="0" w:before="240" w:lineRule="auto"/>
         <w:ind w:left="720" w:hanging="360"/>
@@ -11476,7 +11799,7 @@
       <w:pPr>
         <w:numPr>
           <w:ilvl w:val="0"/>
-          <w:numId w:val="18"/>
+          <w:numId w:val="19"/>
         </w:numPr>
         <w:spacing w:after="0" w:afterAutospacing="0" w:before="0" w:beforeAutospacing="0" w:lineRule="auto"/>
         <w:ind w:left="720" w:hanging="360"/>
@@ -11520,7 +11843,7 @@
       <w:pPr>
         <w:numPr>
           <w:ilvl w:val="0"/>
-          <w:numId w:val="18"/>
+          <w:numId w:val="19"/>
         </w:numPr>
         <w:spacing w:after="0" w:afterAutospacing="0" w:before="0" w:beforeAutospacing="0" w:lineRule="auto"/>
         <w:ind w:left="720" w:hanging="360"/>
@@ -11536,7 +11859,7 @@
       <w:pPr>
         <w:numPr>
           <w:ilvl w:val="0"/>
-          <w:numId w:val="18"/>
+          <w:numId w:val="19"/>
         </w:numPr>
         <w:spacing w:after="0" w:afterAutospacing="0" w:before="0" w:beforeAutospacing="0" w:lineRule="auto"/>
         <w:ind w:left="720" w:hanging="360"/>
@@ -11552,7 +11875,7 @@
       <w:pPr>
         <w:numPr>
           <w:ilvl w:val="0"/>
-          <w:numId w:val="18"/>
+          <w:numId w:val="19"/>
         </w:numPr>
         <w:spacing w:after="0" w:afterAutospacing="0" w:before="0" w:beforeAutospacing="0" w:lineRule="auto"/>
         <w:ind w:left="720" w:hanging="360"/>
@@ -11568,7 +11891,7 @@
       <w:pPr>
         <w:numPr>
           <w:ilvl w:val="0"/>
-          <w:numId w:val="18"/>
+          <w:numId w:val="19"/>
         </w:numPr>
         <w:spacing w:after="0" w:afterAutospacing="0" w:before="0" w:beforeAutospacing="0" w:lineRule="auto"/>
         <w:ind w:left="720" w:hanging="360"/>
@@ -11598,7 +11921,7 @@
       <w:pPr>
         <w:numPr>
           <w:ilvl w:val="0"/>
-          <w:numId w:val="18"/>
+          <w:numId w:val="19"/>
         </w:numPr>
         <w:spacing w:after="0" w:afterAutospacing="0" w:before="0" w:beforeAutospacing="0" w:lineRule="auto"/>
         <w:ind w:left="720" w:hanging="360"/>
@@ -11614,7 +11937,7 @@
       <w:pPr>
         <w:numPr>
           <w:ilvl w:val="0"/>
-          <w:numId w:val="18"/>
+          <w:numId w:val="19"/>
         </w:numPr>
         <w:spacing w:after="0" w:afterAutospacing="0" w:before="0" w:beforeAutospacing="0" w:lineRule="auto"/>
         <w:ind w:left="720" w:hanging="360"/>
@@ -11630,7 +11953,7 @@
       <w:pPr>
         <w:numPr>
           <w:ilvl w:val="0"/>
-          <w:numId w:val="18"/>
+          <w:numId w:val="19"/>
         </w:numPr>
         <w:spacing w:after="0" w:afterAutospacing="0" w:before="0" w:beforeAutospacing="0" w:lineRule="auto"/>
         <w:ind w:left="720" w:hanging="360"/>
@@ -11646,7 +11969,7 @@
       <w:pPr>
         <w:numPr>
           <w:ilvl w:val="0"/>
-          <w:numId w:val="18"/>
+          <w:numId w:val="19"/>
         </w:numPr>
         <w:spacing w:after="0" w:afterAutospacing="0" w:before="0" w:beforeAutospacing="0" w:lineRule="auto"/>
         <w:ind w:left="720" w:hanging="360"/>
@@ -11662,7 +11985,7 @@
       <w:pPr>
         <w:numPr>
           <w:ilvl w:val="0"/>
-          <w:numId w:val="18"/>
+          <w:numId w:val="19"/>
         </w:numPr>
         <w:spacing w:after="0" w:afterAutospacing="0" w:before="0" w:beforeAutospacing="0" w:lineRule="auto"/>
         <w:ind w:left="720" w:hanging="360"/>
@@ -11678,7 +12001,7 @@
       <w:pPr>
         <w:numPr>
           <w:ilvl w:val="0"/>
-          <w:numId w:val="18"/>
+          <w:numId w:val="19"/>
         </w:numPr>
         <w:spacing w:after="240" w:before="0" w:beforeAutospacing="0" w:lineRule="auto"/>
         <w:ind w:left="720" w:hanging="360"/>
@@ -11759,7 +12082,7 @@
       <w:pPr>
         <w:numPr>
           <w:ilvl w:val="0"/>
-          <w:numId w:val="69"/>
+          <w:numId w:val="71"/>
         </w:numPr>
         <w:spacing w:after="0" w:afterAutospacing="0" w:before="240" w:lineRule="auto"/>
         <w:ind w:left="720" w:hanging="360"/>
@@ -11775,7 +12098,7 @@
       <w:pPr>
         <w:numPr>
           <w:ilvl w:val="0"/>
-          <w:numId w:val="69"/>
+          <w:numId w:val="71"/>
         </w:numPr>
         <w:spacing w:after="0" w:afterAutospacing="0" w:before="0" w:beforeAutospacing="0" w:lineRule="auto"/>
         <w:ind w:left="720" w:hanging="360"/>
@@ -11791,7 +12114,7 @@
       <w:pPr>
         <w:numPr>
           <w:ilvl w:val="0"/>
-          <w:numId w:val="69"/>
+          <w:numId w:val="71"/>
         </w:numPr>
         <w:spacing w:after="0" w:afterAutospacing="0" w:before="0" w:beforeAutospacing="0" w:lineRule="auto"/>
         <w:ind w:left="720" w:hanging="360"/>
@@ -11807,7 +12130,7 @@
       <w:pPr>
         <w:numPr>
           <w:ilvl w:val="0"/>
-          <w:numId w:val="69"/>
+          <w:numId w:val="71"/>
         </w:numPr>
         <w:spacing w:after="0" w:afterAutospacing="0" w:before="0" w:beforeAutospacing="0" w:lineRule="auto"/>
         <w:ind w:left="720" w:hanging="360"/>
@@ -11823,7 +12146,7 @@
       <w:pPr>
         <w:numPr>
           <w:ilvl w:val="0"/>
-          <w:numId w:val="69"/>
+          <w:numId w:val="71"/>
         </w:numPr>
         <w:spacing w:after="0" w:afterAutospacing="0" w:before="0" w:beforeAutospacing="0" w:lineRule="auto"/>
         <w:ind w:left="720" w:hanging="360"/>
@@ -11839,7 +12162,7 @@
       <w:pPr>
         <w:numPr>
           <w:ilvl w:val="0"/>
-          <w:numId w:val="69"/>
+          <w:numId w:val="71"/>
         </w:numPr>
         <w:spacing w:after="0" w:afterAutospacing="0" w:before="0" w:beforeAutospacing="0" w:lineRule="auto"/>
         <w:ind w:left="720" w:hanging="360"/>
@@ -11855,7 +12178,7 @@
       <w:pPr>
         <w:numPr>
           <w:ilvl w:val="0"/>
-          <w:numId w:val="69"/>
+          <w:numId w:val="71"/>
         </w:numPr>
         <w:spacing w:after="0" w:afterAutospacing="0" w:before="0" w:beforeAutospacing="0" w:lineRule="auto"/>
         <w:ind w:left="720" w:hanging="360"/>
@@ -11871,7 +12194,7 @@
       <w:pPr>
         <w:numPr>
           <w:ilvl w:val="0"/>
-          <w:numId w:val="69"/>
+          <w:numId w:val="71"/>
         </w:numPr>
         <w:spacing w:after="0" w:afterAutospacing="0" w:before="0" w:beforeAutospacing="0" w:lineRule="auto"/>
         <w:ind w:left="720" w:hanging="360"/>
@@ -11887,7 +12210,7 @@
       <w:pPr>
         <w:numPr>
           <w:ilvl w:val="0"/>
-          <w:numId w:val="69"/>
+          <w:numId w:val="71"/>
         </w:numPr>
         <w:spacing w:after="0" w:afterAutospacing="0" w:before="0" w:beforeAutospacing="0" w:lineRule="auto"/>
         <w:ind w:left="720" w:hanging="360"/>
@@ -11903,7 +12226,7 @@
       <w:pPr>
         <w:numPr>
           <w:ilvl w:val="0"/>
-          <w:numId w:val="69"/>
+          <w:numId w:val="71"/>
         </w:numPr>
         <w:spacing w:after="240" w:before="0" w:beforeAutospacing="0" w:lineRule="auto"/>
         <w:ind w:left="720" w:hanging="360"/>
@@ -11943,7 +12266,7 @@
       <w:pPr>
         <w:numPr>
           <w:ilvl w:val="0"/>
-          <w:numId w:val="17"/>
+          <w:numId w:val="18"/>
         </w:numPr>
         <w:spacing w:after="0" w:afterAutospacing="0" w:before="240" w:lineRule="auto"/>
         <w:ind w:left="720" w:hanging="360"/>
@@ -11959,7 +12282,7 @@
       <w:pPr>
         <w:numPr>
           <w:ilvl w:val="0"/>
-          <w:numId w:val="17"/>
+          <w:numId w:val="18"/>
         </w:numPr>
         <w:spacing w:after="0" w:afterAutospacing="0" w:before="0" w:beforeAutospacing="0" w:lineRule="auto"/>
         <w:ind w:left="720" w:hanging="360"/>
@@ -11975,7 +12298,7 @@
       <w:pPr>
         <w:numPr>
           <w:ilvl w:val="0"/>
-          <w:numId w:val="17"/>
+          <w:numId w:val="18"/>
         </w:numPr>
         <w:spacing w:after="0" w:afterAutospacing="0" w:before="0" w:beforeAutospacing="0" w:lineRule="auto"/>
         <w:ind w:left="720" w:hanging="360"/>
@@ -11991,7 +12314,7 @@
       <w:pPr>
         <w:numPr>
           <w:ilvl w:val="0"/>
-          <w:numId w:val="17"/>
+          <w:numId w:val="18"/>
         </w:numPr>
         <w:spacing w:after="0" w:afterAutospacing="0" w:before="0" w:beforeAutospacing="0" w:lineRule="auto"/>
         <w:ind w:left="720" w:hanging="360"/>
@@ -12007,7 +12330,7 @@
       <w:pPr>
         <w:numPr>
           <w:ilvl w:val="0"/>
-          <w:numId w:val="17"/>
+          <w:numId w:val="18"/>
         </w:numPr>
         <w:spacing w:after="240" w:before="0" w:beforeAutospacing="0" w:lineRule="auto"/>
         <w:ind w:left="720" w:hanging="360"/>
@@ -12252,7 +12575,7 @@
       <w:pPr>
         <w:numPr>
           <w:ilvl w:val="0"/>
-          <w:numId w:val="57"/>
+          <w:numId w:val="58"/>
         </w:numPr>
         <w:spacing w:after="0" w:afterAutospacing="0" w:before="240" w:lineRule="auto"/>
         <w:ind w:left="720" w:hanging="360"/>
@@ -12270,7 +12593,7 @@
       <w:pPr>
         <w:numPr>
           <w:ilvl w:val="0"/>
-          <w:numId w:val="57"/>
+          <w:numId w:val="58"/>
         </w:numPr>
         <w:spacing w:after="240" w:before="0" w:beforeAutospacing="0" w:lineRule="auto"/>
         <w:ind w:left="720" w:hanging="360"/>
@@ -12466,7 +12789,7 @@
       <w:pPr>
         <w:numPr>
           <w:ilvl w:val="0"/>
-          <w:numId w:val="20"/>
+          <w:numId w:val="21"/>
         </w:numPr>
         <w:spacing w:after="0" w:afterAutospacing="0" w:before="240" w:lineRule="auto"/>
         <w:ind w:left="720" w:hanging="360"/>
@@ -12490,7 +12813,7 @@
       <w:pPr>
         <w:numPr>
           <w:ilvl w:val="0"/>
-          <w:numId w:val="20"/>
+          <w:numId w:val="21"/>
         </w:numPr>
         <w:spacing w:after="0" w:afterAutospacing="0" w:before="0" w:beforeAutospacing="0" w:lineRule="auto"/>
         <w:ind w:left="720" w:hanging="360"/>
@@ -12514,7 +12837,7 @@
       <w:pPr>
         <w:numPr>
           <w:ilvl w:val="0"/>
-          <w:numId w:val="20"/>
+          <w:numId w:val="21"/>
         </w:numPr>
         <w:spacing w:after="0" w:afterAutospacing="0" w:before="0" w:beforeAutospacing="0" w:lineRule="auto"/>
         <w:ind w:left="720" w:hanging="360"/>
@@ -12538,7 +12861,7 @@
       <w:pPr>
         <w:numPr>
           <w:ilvl w:val="0"/>
-          <w:numId w:val="20"/>
+          <w:numId w:val="21"/>
         </w:numPr>
         <w:spacing w:after="240" w:before="0" w:beforeAutospacing="0" w:lineRule="auto"/>
         <w:ind w:left="720" w:hanging="360"/>
@@ -12742,7 +13065,7 @@
       <w:pPr>
         <w:numPr>
           <w:ilvl w:val="0"/>
-          <w:numId w:val="70"/>
+          <w:numId w:val="72"/>
         </w:numPr>
         <w:spacing w:after="0" w:afterAutospacing="0" w:before="240" w:lineRule="auto"/>
         <w:ind w:left="720" w:hanging="360"/>
@@ -12758,7 +13081,7 @@
       <w:pPr>
         <w:numPr>
           <w:ilvl w:val="0"/>
-          <w:numId w:val="70"/>
+          <w:numId w:val="72"/>
         </w:numPr>
         <w:spacing w:after="0" w:afterAutospacing="0" w:before="0" w:beforeAutospacing="0" w:lineRule="auto"/>
         <w:ind w:left="720" w:hanging="360"/>
@@ -12774,7 +13097,7 @@
       <w:pPr>
         <w:numPr>
           <w:ilvl w:val="0"/>
-          <w:numId w:val="70"/>
+          <w:numId w:val="72"/>
         </w:numPr>
         <w:spacing w:after="0" w:afterAutospacing="0" w:before="0" w:beforeAutospacing="0" w:lineRule="auto"/>
         <w:ind w:left="720" w:hanging="360"/>
@@ -12790,7 +13113,7 @@
       <w:pPr>
         <w:numPr>
           <w:ilvl w:val="0"/>
-          <w:numId w:val="70"/>
+          <w:numId w:val="72"/>
         </w:numPr>
         <w:spacing w:after="0" w:afterAutospacing="0" w:before="0" w:beforeAutospacing="0" w:lineRule="auto"/>
         <w:ind w:left="720" w:hanging="360"/>
@@ -12806,7 +13129,7 @@
       <w:pPr>
         <w:numPr>
           <w:ilvl w:val="0"/>
-          <w:numId w:val="70"/>
+          <w:numId w:val="72"/>
         </w:numPr>
         <w:spacing w:after="0" w:afterAutospacing="0" w:before="0" w:beforeAutospacing="0" w:lineRule="auto"/>
         <w:ind w:left="720" w:hanging="360"/>
@@ -12822,7 +13145,7 @@
       <w:pPr>
         <w:numPr>
           <w:ilvl w:val="0"/>
-          <w:numId w:val="70"/>
+          <w:numId w:val="72"/>
         </w:numPr>
         <w:spacing w:after="240" w:before="0" w:beforeAutospacing="0" w:lineRule="auto"/>
         <w:ind w:left="720" w:hanging="360"/>
@@ -12911,7 +13234,7 @@
       <w:pPr>
         <w:numPr>
           <w:ilvl w:val="0"/>
-          <w:numId w:val="33"/>
+          <w:numId w:val="34"/>
         </w:numPr>
         <w:spacing w:after="0" w:afterAutospacing="0" w:before="240" w:lineRule="auto"/>
         <w:ind w:left="720" w:hanging="360"/>
@@ -12927,7 +13250,7 @@
       <w:pPr>
         <w:numPr>
           <w:ilvl w:val="0"/>
-          <w:numId w:val="33"/>
+          <w:numId w:val="34"/>
         </w:numPr>
         <w:spacing w:after="0" w:afterAutospacing="0" w:before="0" w:beforeAutospacing="0" w:lineRule="auto"/>
         <w:ind w:left="720" w:hanging="360"/>
@@ -12943,7 +13266,7 @@
       <w:pPr>
         <w:numPr>
           <w:ilvl w:val="0"/>
-          <w:numId w:val="33"/>
+          <w:numId w:val="34"/>
         </w:numPr>
         <w:spacing w:after="0" w:afterAutospacing="0" w:before="0" w:beforeAutospacing="0" w:lineRule="auto"/>
         <w:ind w:left="720" w:hanging="360"/>
@@ -12959,7 +13282,7 @@
       <w:pPr>
         <w:numPr>
           <w:ilvl w:val="0"/>
-          <w:numId w:val="33"/>
+          <w:numId w:val="34"/>
         </w:numPr>
         <w:spacing w:after="0" w:afterAutospacing="0" w:before="0" w:beforeAutospacing="0" w:lineRule="auto"/>
         <w:ind w:left="720" w:hanging="360"/>
@@ -12975,7 +13298,7 @@
       <w:pPr>
         <w:numPr>
           <w:ilvl w:val="0"/>
-          <w:numId w:val="33"/>
+          <w:numId w:val="34"/>
         </w:numPr>
         <w:spacing w:after="0" w:afterAutospacing="0" w:before="0" w:beforeAutospacing="0" w:lineRule="auto"/>
         <w:ind w:left="720" w:hanging="360"/>
@@ -12991,7 +13314,7 @@
       <w:pPr>
         <w:numPr>
           <w:ilvl w:val="0"/>
-          <w:numId w:val="33"/>
+          <w:numId w:val="34"/>
         </w:numPr>
         <w:spacing w:after="240" w:before="0" w:beforeAutospacing="0" w:lineRule="auto"/>
         <w:ind w:left="720" w:hanging="360"/>
@@ -13088,7 +13411,7 @@
       <w:pPr>
         <w:numPr>
           <w:ilvl w:val="0"/>
-          <w:numId w:val="23"/>
+          <w:numId w:val="24"/>
         </w:numPr>
         <w:spacing w:after="0" w:afterAutospacing="0" w:before="240" w:lineRule="auto"/>
         <w:ind w:left="720" w:hanging="360"/>
@@ -13104,7 +13427,7 @@
       <w:pPr>
         <w:numPr>
           <w:ilvl w:val="0"/>
-          <w:numId w:val="23"/>
+          <w:numId w:val="24"/>
         </w:numPr>
         <w:spacing w:after="0" w:afterAutospacing="0" w:before="0" w:beforeAutospacing="0" w:lineRule="auto"/>
         <w:ind w:left="720" w:hanging="360"/>
@@ -13120,7 +13443,7 @@
       <w:pPr>
         <w:numPr>
           <w:ilvl w:val="0"/>
-          <w:numId w:val="23"/>
+          <w:numId w:val="24"/>
         </w:numPr>
         <w:spacing w:after="0" w:afterAutospacing="0" w:before="0" w:beforeAutospacing="0" w:lineRule="auto"/>
         <w:ind w:left="720" w:hanging="360"/>
@@ -13136,7 +13459,7 @@
       <w:pPr>
         <w:numPr>
           <w:ilvl w:val="0"/>
-          <w:numId w:val="23"/>
+          <w:numId w:val="24"/>
         </w:numPr>
         <w:spacing w:after="0" w:afterAutospacing="0" w:before="0" w:beforeAutospacing="0" w:lineRule="auto"/>
         <w:ind w:left="720" w:hanging="360"/>
@@ -13152,7 +13475,7 @@
       <w:pPr>
         <w:numPr>
           <w:ilvl w:val="0"/>
-          <w:numId w:val="23"/>
+          <w:numId w:val="24"/>
         </w:numPr>
         <w:spacing w:after="0" w:afterAutospacing="0" w:before="0" w:beforeAutospacing="0" w:lineRule="auto"/>
         <w:ind w:left="720" w:hanging="360"/>
@@ -13168,7 +13491,7 @@
       <w:pPr>
         <w:numPr>
           <w:ilvl w:val="0"/>
-          <w:numId w:val="23"/>
+          <w:numId w:val="24"/>
         </w:numPr>
         <w:spacing w:after="0" w:afterAutospacing="0" w:before="0" w:beforeAutospacing="0" w:lineRule="auto"/>
         <w:ind w:left="720" w:hanging="360"/>
@@ -13184,7 +13507,7 @@
       <w:pPr>
         <w:numPr>
           <w:ilvl w:val="0"/>
-          <w:numId w:val="23"/>
+          <w:numId w:val="24"/>
         </w:numPr>
         <w:spacing w:after="0" w:afterAutospacing="0" w:before="0" w:beforeAutospacing="0" w:lineRule="auto"/>
         <w:ind w:left="720" w:hanging="360"/>
@@ -13200,7 +13523,7 @@
       <w:pPr>
         <w:numPr>
           <w:ilvl w:val="0"/>
-          <w:numId w:val="23"/>
+          <w:numId w:val="24"/>
         </w:numPr>
         <w:spacing w:after="240" w:before="0" w:beforeAutospacing="0" w:lineRule="auto"/>
         <w:ind w:left="720" w:hanging="360"/>
@@ -13536,7 +13859,7 @@
       <w:pPr>
         <w:numPr>
           <w:ilvl w:val="0"/>
-          <w:numId w:val="42"/>
+          <w:numId w:val="43"/>
         </w:numPr>
         <w:spacing w:after="0" w:afterAutospacing="0" w:before="240" w:lineRule="auto"/>
         <w:ind w:left="720" w:hanging="360"/>
@@ -13566,7 +13889,7 @@
       <w:pPr>
         <w:numPr>
           <w:ilvl w:val="0"/>
-          <w:numId w:val="42"/>
+          <w:numId w:val="43"/>
         </w:numPr>
         <w:spacing w:after="240" w:before="0" w:beforeAutospacing="0" w:lineRule="auto"/>
         <w:ind w:left="720" w:hanging="360"/>
@@ -14018,7 +14341,7 @@
       <w:pPr>
         <w:numPr>
           <w:ilvl w:val="0"/>
-          <w:numId w:val="58"/>
+          <w:numId w:val="59"/>
         </w:numPr>
         <w:spacing w:after="0" w:afterAutospacing="0" w:before="240" w:lineRule="auto"/>
         <w:ind w:left="720" w:hanging="360"/>
@@ -14034,7 +14357,7 @@
       <w:pPr>
         <w:numPr>
           <w:ilvl w:val="0"/>
-          <w:numId w:val="58"/>
+          <w:numId w:val="59"/>
         </w:numPr>
         <w:spacing w:after="0" w:afterAutospacing="0" w:before="0" w:beforeAutospacing="0" w:lineRule="auto"/>
         <w:ind w:left="720" w:hanging="360"/>
@@ -14050,7 +14373,7 @@
       <w:pPr>
         <w:numPr>
           <w:ilvl w:val="0"/>
-          <w:numId w:val="58"/>
+          <w:numId w:val="59"/>
         </w:numPr>
         <w:spacing w:after="0" w:afterAutospacing="0" w:before="0" w:beforeAutospacing="0" w:lineRule="auto"/>
         <w:ind w:left="720" w:hanging="360"/>
@@ -14066,7 +14389,7 @@
       <w:pPr>
         <w:numPr>
           <w:ilvl w:val="0"/>
-          <w:numId w:val="58"/>
+          <w:numId w:val="59"/>
         </w:numPr>
         <w:spacing w:after="0" w:afterAutospacing="0" w:before="0" w:beforeAutospacing="0" w:lineRule="auto"/>
         <w:ind w:left="720" w:hanging="360"/>
@@ -14082,7 +14405,7 @@
       <w:pPr>
         <w:numPr>
           <w:ilvl w:val="0"/>
-          <w:numId w:val="58"/>
+          <w:numId w:val="59"/>
         </w:numPr>
         <w:spacing w:after="0" w:afterAutospacing="0" w:before="0" w:beforeAutospacing="0" w:lineRule="auto"/>
         <w:ind w:left="720" w:hanging="360"/>
@@ -14098,7 +14421,7 @@
       <w:pPr>
         <w:numPr>
           <w:ilvl w:val="0"/>
-          <w:numId w:val="58"/>
+          <w:numId w:val="59"/>
         </w:numPr>
         <w:spacing w:after="0" w:afterAutospacing="0" w:before="0" w:beforeAutospacing="0" w:lineRule="auto"/>
         <w:ind w:left="720" w:hanging="360"/>
@@ -14114,7 +14437,7 @@
       <w:pPr>
         <w:numPr>
           <w:ilvl w:val="0"/>
-          <w:numId w:val="58"/>
+          <w:numId w:val="59"/>
         </w:numPr>
         <w:spacing w:after="0" w:afterAutospacing="0" w:before="0" w:beforeAutospacing="0" w:lineRule="auto"/>
         <w:ind w:left="720" w:hanging="360"/>
@@ -14130,7 +14453,7 @@
       <w:pPr>
         <w:numPr>
           <w:ilvl w:val="0"/>
-          <w:numId w:val="58"/>
+          <w:numId w:val="59"/>
         </w:numPr>
         <w:spacing w:after="0" w:afterAutospacing="0" w:before="0" w:beforeAutospacing="0" w:lineRule="auto"/>
         <w:ind w:left="720" w:hanging="360"/>
@@ -14146,7 +14469,7 @@
       <w:pPr>
         <w:numPr>
           <w:ilvl w:val="0"/>
-          <w:numId w:val="58"/>
+          <w:numId w:val="59"/>
         </w:numPr>
         <w:spacing w:after="0" w:afterAutospacing="0" w:before="0" w:beforeAutospacing="0" w:lineRule="auto"/>
         <w:ind w:left="720" w:hanging="360"/>
@@ -14162,7 +14485,7 @@
       <w:pPr>
         <w:numPr>
           <w:ilvl w:val="0"/>
-          <w:numId w:val="58"/>
+          <w:numId w:val="59"/>
         </w:numPr>
         <w:spacing w:after="240" w:before="0" w:beforeAutospacing="0" w:lineRule="auto"/>
         <w:ind w:left="720" w:hanging="360"/>
@@ -14231,7 +14554,7 @@
       <w:pPr>
         <w:numPr>
           <w:ilvl w:val="0"/>
-          <w:numId w:val="16"/>
+          <w:numId w:val="17"/>
         </w:numPr>
         <w:spacing w:after="0" w:afterAutospacing="0" w:before="240" w:lineRule="auto"/>
         <w:ind w:left="720" w:hanging="360"/>
@@ -14247,7 +14570,7 @@
       <w:pPr>
         <w:numPr>
           <w:ilvl w:val="0"/>
-          <w:numId w:val="16"/>
+          <w:numId w:val="17"/>
         </w:numPr>
         <w:spacing w:after="0" w:afterAutospacing="0" w:before="0" w:beforeAutospacing="0" w:lineRule="auto"/>
         <w:ind w:left="720" w:hanging="360"/>
@@ -14263,7 +14586,7 @@
       <w:pPr>
         <w:numPr>
           <w:ilvl w:val="0"/>
-          <w:numId w:val="16"/>
+          <w:numId w:val="17"/>
         </w:numPr>
         <w:spacing w:after="0" w:afterAutospacing="0" w:before="0" w:beforeAutospacing="0" w:lineRule="auto"/>
         <w:ind w:left="720" w:hanging="360"/>
@@ -14279,7 +14602,7 @@
       <w:pPr>
         <w:numPr>
           <w:ilvl w:val="0"/>
-          <w:numId w:val="16"/>
+          <w:numId w:val="17"/>
         </w:numPr>
         <w:spacing w:after="0" w:afterAutospacing="0" w:before="0" w:beforeAutospacing="0" w:lineRule="auto"/>
         <w:ind w:left="720" w:hanging="360"/>
@@ -14295,7 +14618,7 @@
       <w:pPr>
         <w:numPr>
           <w:ilvl w:val="0"/>
-          <w:numId w:val="16"/>
+          <w:numId w:val="17"/>
         </w:numPr>
         <w:spacing w:after="0" w:afterAutospacing="0" w:before="0" w:beforeAutospacing="0" w:lineRule="auto"/>
         <w:ind w:left="720" w:hanging="360"/>
@@ -14311,7 +14634,7 @@
       <w:pPr>
         <w:numPr>
           <w:ilvl w:val="0"/>
-          <w:numId w:val="16"/>
+          <w:numId w:val="17"/>
         </w:numPr>
         <w:spacing w:after="240" w:before="0" w:beforeAutospacing="0" w:lineRule="auto"/>
         <w:ind w:left="720" w:hanging="360"/>
@@ -14380,7 +14703,7 @@
       <w:pPr>
         <w:numPr>
           <w:ilvl w:val="0"/>
-          <w:numId w:val="72"/>
+          <w:numId w:val="74"/>
         </w:numPr>
         <w:spacing w:after="0" w:afterAutospacing="0" w:before="240" w:lineRule="auto"/>
         <w:ind w:left="720" w:hanging="360"/>
@@ -14404,7 +14727,7 @@
       <w:pPr>
         <w:numPr>
           <w:ilvl w:val="0"/>
-          <w:numId w:val="72"/>
+          <w:numId w:val="74"/>
         </w:numPr>
         <w:spacing w:after="0" w:afterAutospacing="0" w:before="0" w:beforeAutospacing="0" w:lineRule="auto"/>
         <w:ind w:left="720" w:hanging="360"/>
@@ -14420,7 +14743,7 @@
       <w:pPr>
         <w:numPr>
           <w:ilvl w:val="0"/>
-          <w:numId w:val="72"/>
+          <w:numId w:val="74"/>
         </w:numPr>
         <w:spacing w:after="0" w:afterAutospacing="0" w:before="0" w:beforeAutospacing="0" w:lineRule="auto"/>
         <w:ind w:left="720" w:hanging="360"/>
@@ -14436,7 +14759,7 @@
       <w:pPr>
         <w:numPr>
           <w:ilvl w:val="0"/>
-          <w:numId w:val="72"/>
+          <w:numId w:val="74"/>
         </w:numPr>
         <w:spacing w:after="240" w:before="0" w:beforeAutospacing="0" w:lineRule="auto"/>
         <w:ind w:left="720" w:hanging="360"/>
@@ -14611,7 +14934,7 @@
       <w:pPr>
         <w:numPr>
           <w:ilvl w:val="0"/>
-          <w:numId w:val="46"/>
+          <w:numId w:val="47"/>
         </w:numPr>
         <w:spacing w:after="0" w:afterAutospacing="0" w:before="240" w:lineRule="auto"/>
         <w:ind w:left="720" w:hanging="360"/>
@@ -14627,7 +14950,7 @@
       <w:pPr>
         <w:numPr>
           <w:ilvl w:val="0"/>
-          <w:numId w:val="46"/>
+          <w:numId w:val="47"/>
         </w:numPr>
         <w:spacing w:after="0" w:afterAutospacing="0" w:before="0" w:beforeAutospacing="0" w:lineRule="auto"/>
         <w:ind w:left="720" w:hanging="360"/>
@@ -14643,7 +14966,7 @@
       <w:pPr>
         <w:numPr>
           <w:ilvl w:val="0"/>
-          <w:numId w:val="46"/>
+          <w:numId w:val="47"/>
         </w:numPr>
         <w:spacing w:after="0" w:afterAutospacing="0" w:before="0" w:beforeAutospacing="0" w:lineRule="auto"/>
         <w:ind w:left="720" w:hanging="360"/>
@@ -14659,7 +14982,7 @@
       <w:pPr>
         <w:numPr>
           <w:ilvl w:val="0"/>
-          <w:numId w:val="46"/>
+          <w:numId w:val="47"/>
         </w:numPr>
         <w:spacing w:after="240" w:before="0" w:beforeAutospacing="0" w:lineRule="auto"/>
         <w:ind w:left="720" w:hanging="360"/>
@@ -14728,7 +15051,7 @@
       <w:pPr>
         <w:numPr>
           <w:ilvl w:val="0"/>
-          <w:numId w:val="14"/>
+          <w:numId w:val="15"/>
         </w:numPr>
         <w:spacing w:after="0" w:afterAutospacing="0" w:before="240" w:lineRule="auto"/>
         <w:ind w:left="720" w:hanging="360"/>
@@ -14766,7 +15089,7 @@
       <w:pPr>
         <w:numPr>
           <w:ilvl w:val="0"/>
-          <w:numId w:val="14"/>
+          <w:numId w:val="15"/>
         </w:numPr>
         <w:spacing w:after="0" w:afterAutospacing="0" w:before="0" w:beforeAutospacing="0" w:lineRule="auto"/>
         <w:ind w:left="720" w:hanging="360"/>
@@ -14790,7 +15113,7 @@
       <w:pPr>
         <w:numPr>
           <w:ilvl w:val="0"/>
-          <w:numId w:val="14"/>
+          <w:numId w:val="15"/>
         </w:numPr>
         <w:spacing w:after="0" w:afterAutospacing="0" w:before="0" w:beforeAutospacing="0" w:lineRule="auto"/>
         <w:ind w:left="720" w:hanging="360"/>
@@ -14806,7 +15129,7 @@
       <w:pPr>
         <w:numPr>
           <w:ilvl w:val="0"/>
-          <w:numId w:val="14"/>
+          <w:numId w:val="15"/>
         </w:numPr>
         <w:spacing w:after="0" w:afterAutospacing="0" w:before="0" w:beforeAutospacing="0" w:lineRule="auto"/>
         <w:ind w:left="720" w:hanging="360"/>
@@ -14822,7 +15145,7 @@
       <w:pPr>
         <w:numPr>
           <w:ilvl w:val="0"/>
-          <w:numId w:val="14"/>
+          <w:numId w:val="15"/>
         </w:numPr>
         <w:spacing w:after="0" w:afterAutospacing="0" w:before="0" w:beforeAutospacing="0" w:lineRule="auto"/>
         <w:ind w:left="720" w:hanging="360"/>
@@ -14838,7 +15161,7 @@
       <w:pPr>
         <w:numPr>
           <w:ilvl w:val="0"/>
-          <w:numId w:val="14"/>
+          <w:numId w:val="15"/>
         </w:numPr>
         <w:spacing w:after="0" w:afterAutospacing="0" w:before="0" w:beforeAutospacing="0" w:lineRule="auto"/>
         <w:ind w:left="720" w:hanging="360"/>
@@ -14854,7 +15177,7 @@
       <w:pPr>
         <w:numPr>
           <w:ilvl w:val="0"/>
-          <w:numId w:val="14"/>
+          <w:numId w:val="15"/>
         </w:numPr>
         <w:spacing w:after="0" w:afterAutospacing="0" w:before="0" w:beforeAutospacing="0" w:lineRule="auto"/>
         <w:ind w:left="720" w:hanging="360"/>
@@ -14870,7 +15193,7 @@
       <w:pPr>
         <w:numPr>
           <w:ilvl w:val="0"/>
-          <w:numId w:val="14"/>
+          <w:numId w:val="15"/>
         </w:numPr>
         <w:spacing w:after="0" w:afterAutospacing="0" w:before="0" w:beforeAutospacing="0" w:lineRule="auto"/>
         <w:ind w:left="720" w:hanging="360"/>
@@ -14886,7 +15209,7 @@
       <w:pPr>
         <w:numPr>
           <w:ilvl w:val="0"/>
-          <w:numId w:val="14"/>
+          <w:numId w:val="15"/>
         </w:numPr>
         <w:spacing w:after="0" w:afterAutospacing="0" w:before="0" w:beforeAutospacing="0" w:lineRule="auto"/>
         <w:ind w:left="720" w:hanging="360"/>
@@ -14902,7 +15225,7 @@
       <w:pPr>
         <w:numPr>
           <w:ilvl w:val="0"/>
-          <w:numId w:val="14"/>
+          <w:numId w:val="15"/>
         </w:numPr>
         <w:spacing w:after="0" w:afterAutospacing="0" w:before="0" w:beforeAutospacing="0" w:lineRule="auto"/>
         <w:ind w:left="720" w:hanging="360"/>
@@ -14918,7 +15241,7 @@
       <w:pPr>
         <w:numPr>
           <w:ilvl w:val="0"/>
-          <w:numId w:val="14"/>
+          <w:numId w:val="15"/>
         </w:numPr>
         <w:spacing w:after="0" w:afterAutospacing="0" w:before="0" w:beforeAutospacing="0" w:lineRule="auto"/>
         <w:ind w:left="720" w:hanging="360"/>
@@ -14934,7 +15257,7 @@
       <w:pPr>
         <w:numPr>
           <w:ilvl w:val="0"/>
-          <w:numId w:val="14"/>
+          <w:numId w:val="15"/>
         </w:numPr>
         <w:spacing w:after="240" w:before="0" w:beforeAutospacing="0" w:lineRule="auto"/>
         <w:ind w:left="720" w:hanging="360"/>
@@ -15503,7 +15826,7 @@
       <w:pPr>
         <w:numPr>
           <w:ilvl w:val="0"/>
-          <w:numId w:val="43"/>
+          <w:numId w:val="44"/>
         </w:numPr>
         <w:spacing w:after="0" w:afterAutospacing="0" w:before="240" w:lineRule="auto"/>
         <w:ind w:left="720" w:hanging="360"/>
@@ -15519,7 +15842,7 @@
       <w:pPr>
         <w:numPr>
           <w:ilvl w:val="0"/>
-          <w:numId w:val="43"/>
+          <w:numId w:val="44"/>
         </w:numPr>
         <w:spacing w:after="240" w:before="0" w:beforeAutospacing="0" w:lineRule="auto"/>
         <w:ind w:left="720" w:hanging="360"/>
@@ -15814,7 +16137,7 @@
       <w:pPr>
         <w:numPr>
           <w:ilvl w:val="0"/>
-          <w:numId w:val="50"/>
+          <w:numId w:val="51"/>
         </w:numPr>
         <w:spacing w:after="0" w:afterAutospacing="0" w:before="240" w:lineRule="auto"/>
         <w:ind w:left="720" w:hanging="360"/>
@@ -15830,7 +16153,7 @@
       <w:pPr>
         <w:numPr>
           <w:ilvl w:val="0"/>
-          <w:numId w:val="50"/>
+          <w:numId w:val="51"/>
         </w:numPr>
         <w:spacing w:after="0" w:afterAutospacing="0" w:before="0" w:beforeAutospacing="0" w:lineRule="auto"/>
         <w:ind w:left="720" w:hanging="360"/>
@@ -15846,7 +16169,7 @@
       <w:pPr>
         <w:numPr>
           <w:ilvl w:val="0"/>
-          <w:numId w:val="50"/>
+          <w:numId w:val="51"/>
         </w:numPr>
         <w:spacing w:after="0" w:afterAutospacing="0" w:before="0" w:beforeAutospacing="0" w:lineRule="auto"/>
         <w:ind w:left="720" w:hanging="360"/>
@@ -15862,7 +16185,7 @@
       <w:pPr>
         <w:numPr>
           <w:ilvl w:val="0"/>
-          <w:numId w:val="50"/>
+          <w:numId w:val="51"/>
         </w:numPr>
         <w:spacing w:after="0" w:afterAutospacing="0" w:before="0" w:beforeAutospacing="0" w:lineRule="auto"/>
         <w:ind w:left="720" w:hanging="360"/>
@@ -15878,7 +16201,7 @@
       <w:pPr>
         <w:numPr>
           <w:ilvl w:val="0"/>
-          <w:numId w:val="50"/>
+          <w:numId w:val="51"/>
         </w:numPr>
         <w:spacing w:after="240" w:before="0" w:beforeAutospacing="0" w:lineRule="auto"/>
         <w:ind w:left="720" w:hanging="360"/>
@@ -15975,7 +16298,7 @@
       <w:pPr>
         <w:numPr>
           <w:ilvl w:val="0"/>
-          <w:numId w:val="34"/>
+          <w:numId w:val="35"/>
         </w:numPr>
         <w:spacing w:after="0" w:afterAutospacing="0" w:before="240" w:lineRule="auto"/>
         <w:ind w:left="720" w:hanging="360"/>
@@ -15991,7 +16314,7 @@
       <w:pPr>
         <w:numPr>
           <w:ilvl w:val="0"/>
-          <w:numId w:val="34"/>
+          <w:numId w:val="35"/>
         </w:numPr>
         <w:spacing w:after="0" w:afterAutospacing="0" w:before="0" w:beforeAutospacing="0" w:lineRule="auto"/>
         <w:ind w:left="720" w:hanging="360"/>
@@ -16007,7 +16330,7 @@
       <w:pPr>
         <w:numPr>
           <w:ilvl w:val="0"/>
-          <w:numId w:val="34"/>
+          <w:numId w:val="35"/>
         </w:numPr>
         <w:spacing w:after="0" w:afterAutospacing="0" w:before="0" w:beforeAutospacing="0" w:lineRule="auto"/>
         <w:ind w:left="720" w:hanging="360"/>
@@ -16023,7 +16346,7 @@
       <w:pPr>
         <w:numPr>
           <w:ilvl w:val="0"/>
-          <w:numId w:val="34"/>
+          <w:numId w:val="35"/>
         </w:numPr>
         <w:spacing w:after="240" w:before="0" w:beforeAutospacing="0" w:lineRule="auto"/>
         <w:ind w:left="720" w:hanging="360"/>
@@ -16106,7 +16429,7 @@
       <w:pPr>
         <w:numPr>
           <w:ilvl w:val="0"/>
-          <w:numId w:val="66"/>
+          <w:numId w:val="68"/>
         </w:numPr>
         <w:spacing w:after="0" w:afterAutospacing="0" w:before="240" w:lineRule="auto"/>
         <w:ind w:left="720" w:hanging="360"/>
@@ -16130,7 +16453,7 @@
       <w:pPr>
         <w:numPr>
           <w:ilvl w:val="0"/>
-          <w:numId w:val="66"/>
+          <w:numId w:val="68"/>
         </w:numPr>
         <w:spacing w:after="0" w:afterAutospacing="0" w:before="0" w:beforeAutospacing="0" w:lineRule="auto"/>
         <w:ind w:left="720" w:hanging="360"/>
@@ -16154,7 +16477,7 @@
       <w:pPr>
         <w:numPr>
           <w:ilvl w:val="0"/>
-          <w:numId w:val="66"/>
+          <w:numId w:val="68"/>
         </w:numPr>
         <w:spacing w:after="0" w:afterAutospacing="0" w:before="0" w:beforeAutospacing="0" w:lineRule="auto"/>
         <w:ind w:left="720" w:hanging="360"/>
@@ -16178,7 +16501,7 @@
       <w:pPr>
         <w:numPr>
           <w:ilvl w:val="0"/>
-          <w:numId w:val="66"/>
+          <w:numId w:val="68"/>
         </w:numPr>
         <w:spacing w:after="240" w:before="0" w:beforeAutospacing="0" w:lineRule="auto"/>
         <w:ind w:left="720" w:hanging="360"/>
@@ -16261,7 +16584,7 @@
       <w:pPr>
         <w:numPr>
           <w:ilvl w:val="0"/>
-          <w:numId w:val="67"/>
+          <w:numId w:val="69"/>
         </w:numPr>
         <w:spacing w:after="0" w:afterAutospacing="0" w:before="240" w:lineRule="auto"/>
         <w:ind w:left="720" w:hanging="360"/>
@@ -16291,7 +16614,7 @@
       <w:pPr>
         <w:numPr>
           <w:ilvl w:val="0"/>
-          <w:numId w:val="67"/>
+          <w:numId w:val="69"/>
         </w:numPr>
         <w:spacing w:after="240" w:before="0" w:beforeAutospacing="0" w:lineRule="auto"/>
         <w:ind w:left="720" w:hanging="360"/>
@@ -16609,7 +16932,7 @@
       <w:pPr>
         <w:numPr>
           <w:ilvl w:val="0"/>
-          <w:numId w:val="39"/>
+          <w:numId w:val="40"/>
         </w:numPr>
         <w:spacing w:after="0" w:afterAutospacing="0" w:before="240" w:lineRule="auto"/>
         <w:ind w:left="720" w:hanging="360"/>
@@ -16639,7 +16962,7 @@
       <w:pPr>
         <w:numPr>
           <w:ilvl w:val="0"/>
-          <w:numId w:val="39"/>
+          <w:numId w:val="40"/>
         </w:numPr>
         <w:spacing w:after="0" w:afterAutospacing="0" w:before="0" w:beforeAutospacing="0" w:lineRule="auto"/>
         <w:ind w:left="720" w:hanging="360"/>
@@ -16655,7 +16978,7 @@
       <w:pPr>
         <w:numPr>
           <w:ilvl w:val="0"/>
-          <w:numId w:val="39"/>
+          <w:numId w:val="40"/>
         </w:numPr>
         <w:spacing w:after="0" w:afterAutospacing="0" w:before="0" w:beforeAutospacing="0" w:lineRule="auto"/>
         <w:ind w:left="720" w:hanging="360"/>
@@ -16685,7 +17008,7 @@
       <w:pPr>
         <w:numPr>
           <w:ilvl w:val="0"/>
-          <w:numId w:val="39"/>
+          <w:numId w:val="40"/>
         </w:numPr>
         <w:spacing w:after="0" w:afterAutospacing="0" w:before="0" w:beforeAutospacing="0" w:lineRule="auto"/>
         <w:ind w:left="720" w:hanging="360"/>
@@ -16723,7 +17046,7 @@
       <w:pPr>
         <w:numPr>
           <w:ilvl w:val="0"/>
-          <w:numId w:val="39"/>
+          <w:numId w:val="40"/>
         </w:numPr>
         <w:spacing w:after="0" w:afterAutospacing="0" w:before="0" w:beforeAutospacing="0" w:lineRule="auto"/>
         <w:ind w:left="720" w:hanging="360"/>
@@ -16739,7 +17062,7 @@
       <w:pPr>
         <w:numPr>
           <w:ilvl w:val="0"/>
-          <w:numId w:val="39"/>
+          <w:numId w:val="40"/>
         </w:numPr>
         <w:spacing w:after="240" w:before="0" w:beforeAutospacing="0" w:lineRule="auto"/>
         <w:ind w:left="720" w:hanging="360"/>
@@ -16822,7 +17145,7 @@
       <w:pPr>
         <w:numPr>
           <w:ilvl w:val="0"/>
-          <w:numId w:val="26"/>
+          <w:numId w:val="27"/>
         </w:numPr>
         <w:spacing w:after="0" w:afterAutospacing="0" w:before="240" w:lineRule="auto"/>
         <w:ind w:left="720" w:hanging="360"/>
@@ -16852,7 +17175,7 @@
       <w:pPr>
         <w:numPr>
           <w:ilvl w:val="0"/>
-          <w:numId w:val="26"/>
+          <w:numId w:val="27"/>
         </w:numPr>
         <w:spacing w:after="0" w:afterAutospacing="0" w:before="0" w:beforeAutospacing="0" w:lineRule="auto"/>
         <w:ind w:left="720" w:hanging="360"/>
@@ -16882,7 +17205,7 @@
       <w:pPr>
         <w:numPr>
           <w:ilvl w:val="0"/>
-          <w:numId w:val="26"/>
+          <w:numId w:val="27"/>
         </w:numPr>
         <w:spacing w:after="0" w:afterAutospacing="0" w:before="0" w:beforeAutospacing="0" w:lineRule="auto"/>
         <w:ind w:left="720" w:hanging="360"/>
@@ -16920,7 +17243,7 @@
       <w:pPr>
         <w:numPr>
           <w:ilvl w:val="0"/>
-          <w:numId w:val="26"/>
+          <w:numId w:val="27"/>
         </w:numPr>
         <w:spacing w:after="0" w:afterAutospacing="0" w:before="0" w:beforeAutospacing="0" w:lineRule="auto"/>
         <w:ind w:left="720" w:hanging="360"/>
@@ -16936,7 +17259,7 @@
       <w:pPr>
         <w:numPr>
           <w:ilvl w:val="0"/>
-          <w:numId w:val="26"/>
+          <w:numId w:val="27"/>
         </w:numPr>
         <w:spacing w:after="240" w:before="0" w:beforeAutospacing="0" w:lineRule="auto"/>
         <w:ind w:left="720" w:hanging="360"/>
@@ -17468,7 +17791,7 @@
       <w:pPr>
         <w:numPr>
           <w:ilvl w:val="0"/>
-          <w:numId w:val="54"/>
+          <w:numId w:val="55"/>
         </w:numPr>
         <w:spacing w:after="0" w:afterAutospacing="0" w:before="240" w:lineRule="auto"/>
         <w:ind w:left="720" w:hanging="360"/>
@@ -17484,7 +17807,7 @@
       <w:pPr>
         <w:numPr>
           <w:ilvl w:val="0"/>
-          <w:numId w:val="54"/>
+          <w:numId w:val="55"/>
         </w:numPr>
         <w:spacing w:after="0" w:afterAutospacing="0" w:before="0" w:beforeAutospacing="0" w:lineRule="auto"/>
         <w:ind w:left="720" w:hanging="360"/>
@@ -17500,7 +17823,7 @@
       <w:pPr>
         <w:numPr>
           <w:ilvl w:val="0"/>
-          <w:numId w:val="54"/>
+          <w:numId w:val="55"/>
         </w:numPr>
         <w:spacing w:after="0" w:afterAutospacing="0" w:before="0" w:beforeAutospacing="0" w:lineRule="auto"/>
         <w:ind w:left="720" w:hanging="360"/>
@@ -17516,7 +17839,7 @@
       <w:pPr>
         <w:numPr>
           <w:ilvl w:val="0"/>
-          <w:numId w:val="54"/>
+          <w:numId w:val="55"/>
         </w:numPr>
         <w:spacing w:after="0" w:afterAutospacing="0" w:before="0" w:beforeAutospacing="0" w:lineRule="auto"/>
         <w:ind w:left="720" w:hanging="360"/>
@@ -17532,7 +17855,7 @@
       <w:pPr>
         <w:numPr>
           <w:ilvl w:val="0"/>
-          <w:numId w:val="54"/>
+          <w:numId w:val="55"/>
         </w:numPr>
         <w:spacing w:after="0" w:afterAutospacing="0" w:before="0" w:beforeAutospacing="0" w:lineRule="auto"/>
         <w:ind w:left="720" w:hanging="360"/>
@@ -17548,7 +17871,7 @@
       <w:pPr>
         <w:numPr>
           <w:ilvl w:val="0"/>
-          <w:numId w:val="54"/>
+          <w:numId w:val="55"/>
         </w:numPr>
         <w:spacing w:after="0" w:afterAutospacing="0" w:before="0" w:beforeAutospacing="0" w:lineRule="auto"/>
         <w:ind w:left="720" w:hanging="360"/>
@@ -17564,7 +17887,7 @@
       <w:pPr>
         <w:numPr>
           <w:ilvl w:val="0"/>
-          <w:numId w:val="54"/>
+          <w:numId w:val="55"/>
         </w:numPr>
         <w:spacing w:after="240" w:before="0" w:beforeAutospacing="0" w:lineRule="auto"/>
         <w:ind w:left="720" w:hanging="360"/>
@@ -17723,7 +18046,7 @@
       <w:pPr>
         <w:numPr>
           <w:ilvl w:val="0"/>
-          <w:numId w:val="27"/>
+          <w:numId w:val="28"/>
         </w:numPr>
         <w:spacing w:after="0" w:afterAutospacing="0" w:before="240" w:lineRule="auto"/>
         <w:ind w:left="720" w:hanging="360"/>
@@ -17747,7 +18070,7 @@
       <w:pPr>
         <w:numPr>
           <w:ilvl w:val="0"/>
-          <w:numId w:val="27"/>
+          <w:numId w:val="28"/>
         </w:numPr>
         <w:spacing w:after="0" w:afterAutospacing="0" w:before="0" w:beforeAutospacing="0" w:lineRule="auto"/>
         <w:ind w:left="720" w:hanging="360"/>
@@ -17771,7 +18094,7 @@
       <w:pPr>
         <w:numPr>
           <w:ilvl w:val="0"/>
-          <w:numId w:val="27"/>
+          <w:numId w:val="28"/>
         </w:numPr>
         <w:spacing w:after="240" w:before="0" w:beforeAutospacing="0" w:lineRule="auto"/>
         <w:ind w:left="720" w:hanging="360"/>
@@ -17979,7 +18302,7 @@
       <w:pPr>
         <w:numPr>
           <w:ilvl w:val="0"/>
-          <w:numId w:val="15"/>
+          <w:numId w:val="16"/>
         </w:numPr>
         <w:spacing w:after="0" w:afterAutospacing="0" w:before="240" w:lineRule="auto"/>
         <w:ind w:left="720" w:hanging="360"/>
@@ -17995,7 +18318,7 @@
       <w:pPr>
         <w:numPr>
           <w:ilvl w:val="0"/>
-          <w:numId w:val="15"/>
+          <w:numId w:val="16"/>
         </w:numPr>
         <w:spacing w:after="0" w:afterAutospacing="0" w:before="0" w:beforeAutospacing="0" w:lineRule="auto"/>
         <w:ind w:left="720" w:hanging="360"/>
@@ -18011,7 +18334,7 @@
       <w:pPr>
         <w:numPr>
           <w:ilvl w:val="0"/>
-          <w:numId w:val="15"/>
+          <w:numId w:val="16"/>
         </w:numPr>
         <w:spacing w:after="240" w:before="0" w:beforeAutospacing="0" w:lineRule="auto"/>
         <w:ind w:left="720" w:hanging="360"/>
@@ -18202,7 +18525,7 @@
       <w:pPr>
         <w:numPr>
           <w:ilvl w:val="0"/>
-          <w:numId w:val="25"/>
+          <w:numId w:val="26"/>
         </w:numPr>
         <w:spacing w:after="0" w:afterAutospacing="0" w:before="240" w:lineRule="auto"/>
         <w:ind w:left="720" w:hanging="360"/>
@@ -18218,7 +18541,7 @@
       <w:pPr>
         <w:numPr>
           <w:ilvl w:val="0"/>
-          <w:numId w:val="25"/>
+          <w:numId w:val="26"/>
         </w:numPr>
         <w:spacing w:after="0" w:afterAutospacing="0" w:before="0" w:beforeAutospacing="0" w:lineRule="auto"/>
         <w:ind w:left="720" w:hanging="360"/>
@@ -18234,7 +18557,7 @@
       <w:pPr>
         <w:numPr>
           <w:ilvl w:val="0"/>
-          <w:numId w:val="25"/>
+          <w:numId w:val="26"/>
         </w:numPr>
         <w:spacing w:after="0" w:afterAutospacing="0" w:before="0" w:beforeAutospacing="0" w:lineRule="auto"/>
         <w:ind w:left="720" w:hanging="360"/>
@@ -18250,7 +18573,7 @@
       <w:pPr>
         <w:numPr>
           <w:ilvl w:val="0"/>
-          <w:numId w:val="25"/>
+          <w:numId w:val="26"/>
         </w:numPr>
         <w:spacing w:after="0" w:afterAutospacing="0" w:before="0" w:beforeAutospacing="0" w:lineRule="auto"/>
         <w:ind w:left="720" w:hanging="360"/>
@@ -18266,7 +18589,7 @@
       <w:pPr>
         <w:numPr>
           <w:ilvl w:val="0"/>
-          <w:numId w:val="25"/>
+          <w:numId w:val="26"/>
         </w:numPr>
         <w:spacing w:after="0" w:afterAutospacing="0" w:before="0" w:beforeAutospacing="0" w:lineRule="auto"/>
         <w:ind w:left="720" w:hanging="360"/>
@@ -18282,7 +18605,7 @@
       <w:pPr>
         <w:numPr>
           <w:ilvl w:val="0"/>
-          <w:numId w:val="25"/>
+          <w:numId w:val="26"/>
         </w:numPr>
         <w:spacing w:after="0" w:afterAutospacing="0" w:before="0" w:beforeAutospacing="0" w:lineRule="auto"/>
         <w:ind w:left="720" w:hanging="360"/>
@@ -18298,7 +18621,7 @@
       <w:pPr>
         <w:numPr>
           <w:ilvl w:val="0"/>
-          <w:numId w:val="25"/>
+          <w:numId w:val="26"/>
         </w:numPr>
         <w:spacing w:after="0" w:afterAutospacing="0" w:before="0" w:beforeAutospacing="0" w:lineRule="auto"/>
         <w:ind w:left="720" w:hanging="360"/>
@@ -18314,7 +18637,7 @@
       <w:pPr>
         <w:numPr>
           <w:ilvl w:val="0"/>
-          <w:numId w:val="25"/>
+          <w:numId w:val="26"/>
         </w:numPr>
         <w:spacing w:after="240" w:before="0" w:beforeAutospacing="0" w:lineRule="auto"/>
         <w:ind w:left="720" w:hanging="360"/>
@@ -18497,7 +18820,7 @@
       <w:pPr>
         <w:numPr>
           <w:ilvl w:val="0"/>
-          <w:numId w:val="63"/>
+          <w:numId w:val="65"/>
         </w:numPr>
         <w:spacing w:after="0" w:afterAutospacing="0" w:before="240" w:lineRule="auto"/>
         <w:ind w:left="720" w:hanging="360"/>
@@ -18527,7 +18850,7 @@
       <w:pPr>
         <w:numPr>
           <w:ilvl w:val="0"/>
-          <w:numId w:val="63"/>
+          <w:numId w:val="65"/>
         </w:numPr>
         <w:spacing w:after="0" w:afterAutospacing="0" w:before="0" w:beforeAutospacing="0" w:lineRule="auto"/>
         <w:ind w:left="720" w:hanging="360"/>
@@ -18557,7 +18880,7 @@
       <w:pPr>
         <w:numPr>
           <w:ilvl w:val="0"/>
-          <w:numId w:val="63"/>
+          <w:numId w:val="65"/>
         </w:numPr>
         <w:spacing w:after="0" w:afterAutospacing="0" w:before="0" w:beforeAutospacing="0" w:lineRule="auto"/>
         <w:ind w:left="720" w:hanging="360"/>
@@ -18601,7 +18924,7 @@
       <w:pPr>
         <w:numPr>
           <w:ilvl w:val="0"/>
-          <w:numId w:val="63"/>
+          <w:numId w:val="65"/>
         </w:numPr>
         <w:spacing w:after="0" w:afterAutospacing="0" w:before="0" w:beforeAutospacing="0" w:lineRule="auto"/>
         <w:ind w:left="720" w:hanging="360"/>
@@ -18631,7 +18954,7 @@
       <w:pPr>
         <w:numPr>
           <w:ilvl w:val="0"/>
-          <w:numId w:val="63"/>
+          <w:numId w:val="65"/>
         </w:numPr>
         <w:spacing w:after="0" w:afterAutospacing="0" w:before="0" w:beforeAutospacing="0" w:lineRule="auto"/>
         <w:ind w:left="720" w:hanging="360"/>
@@ -18661,7 +18984,7 @@
       <w:pPr>
         <w:numPr>
           <w:ilvl w:val="0"/>
-          <w:numId w:val="63"/>
+          <w:numId w:val="65"/>
         </w:numPr>
         <w:spacing w:after="0" w:afterAutospacing="0" w:before="0" w:beforeAutospacing="0" w:lineRule="auto"/>
         <w:ind w:left="720" w:hanging="360"/>
@@ -18691,7 +19014,7 @@
       <w:pPr>
         <w:numPr>
           <w:ilvl w:val="0"/>
-          <w:numId w:val="63"/>
+          <w:numId w:val="65"/>
         </w:numPr>
         <w:spacing w:after="0" w:afterAutospacing="0" w:before="0" w:beforeAutospacing="0" w:lineRule="auto"/>
         <w:ind w:left="720" w:hanging="360"/>
@@ -18707,7 +19030,7 @@
       <w:pPr>
         <w:numPr>
           <w:ilvl w:val="0"/>
-          <w:numId w:val="63"/>
+          <w:numId w:val="65"/>
         </w:numPr>
         <w:spacing w:after="0" w:afterAutospacing="0" w:before="0" w:beforeAutospacing="0" w:lineRule="auto"/>
         <w:ind w:left="720" w:hanging="360"/>
@@ -18723,7 +19046,7 @@
       <w:pPr>
         <w:numPr>
           <w:ilvl w:val="0"/>
-          <w:numId w:val="63"/>
+          <w:numId w:val="65"/>
         </w:numPr>
         <w:spacing w:after="0" w:afterAutospacing="0" w:before="0" w:beforeAutospacing="0" w:lineRule="auto"/>
         <w:ind w:left="720" w:hanging="360"/>
@@ -18739,7 +19062,7 @@
       <w:pPr>
         <w:numPr>
           <w:ilvl w:val="0"/>
-          <w:numId w:val="63"/>
+          <w:numId w:val="65"/>
         </w:numPr>
         <w:spacing w:after="0" w:afterAutospacing="0" w:before="0" w:beforeAutospacing="0" w:lineRule="auto"/>
         <w:ind w:left="720" w:hanging="360"/>
@@ -18755,7 +19078,7 @@
       <w:pPr>
         <w:numPr>
           <w:ilvl w:val="0"/>
-          <w:numId w:val="63"/>
+          <w:numId w:val="65"/>
         </w:numPr>
         <w:spacing w:after="0" w:afterAutospacing="0" w:before="0" w:beforeAutospacing="0" w:lineRule="auto"/>
         <w:ind w:left="720" w:hanging="360"/>
@@ -18771,7 +19094,7 @@
       <w:pPr>
         <w:numPr>
           <w:ilvl w:val="0"/>
-          <w:numId w:val="63"/>
+          <w:numId w:val="65"/>
         </w:numPr>
         <w:spacing w:after="0" w:afterAutospacing="0" w:before="0" w:beforeAutospacing="0" w:lineRule="auto"/>
         <w:ind w:left="720" w:hanging="360"/>
@@ -18787,7 +19110,7 @@
       <w:pPr>
         <w:numPr>
           <w:ilvl w:val="0"/>
-          <w:numId w:val="63"/>
+          <w:numId w:val="65"/>
         </w:numPr>
         <w:spacing w:after="0" w:afterAutospacing="0" w:before="0" w:beforeAutospacing="0" w:lineRule="auto"/>
         <w:ind w:left="720" w:hanging="360"/>
@@ -18803,7 +19126,7 @@
       <w:pPr>
         <w:numPr>
           <w:ilvl w:val="0"/>
-          <w:numId w:val="63"/>
+          <w:numId w:val="65"/>
         </w:numPr>
         <w:spacing w:after="240" w:before="0" w:beforeAutospacing="0" w:lineRule="auto"/>
         <w:ind w:left="720" w:hanging="360"/>
@@ -19113,7 +19436,7 @@
       <w:pPr>
         <w:numPr>
           <w:ilvl w:val="0"/>
-          <w:numId w:val="62"/>
+          <w:numId w:val="63"/>
         </w:numPr>
         <w:spacing w:after="0" w:afterAutospacing="0" w:before="240" w:lineRule="auto"/>
         <w:ind w:left="720" w:hanging="360"/>
@@ -19129,7 +19452,7 @@
       <w:pPr>
         <w:numPr>
           <w:ilvl w:val="0"/>
-          <w:numId w:val="62"/>
+          <w:numId w:val="63"/>
         </w:numPr>
         <w:spacing w:after="0" w:afterAutospacing="0" w:before="0" w:beforeAutospacing="0" w:lineRule="auto"/>
         <w:ind w:left="720" w:hanging="360"/>
@@ -19159,7 +19482,7 @@
       <w:pPr>
         <w:numPr>
           <w:ilvl w:val="0"/>
-          <w:numId w:val="62"/>
+          <w:numId w:val="63"/>
         </w:numPr>
         <w:spacing w:after="0" w:afterAutospacing="0" w:before="0" w:beforeAutospacing="0" w:lineRule="auto"/>
         <w:ind w:left="720" w:hanging="360"/>
@@ -19189,7 +19512,7 @@
       <w:pPr>
         <w:numPr>
           <w:ilvl w:val="0"/>
-          <w:numId w:val="62"/>
+          <w:numId w:val="63"/>
         </w:numPr>
         <w:spacing w:after="0" w:afterAutospacing="0" w:before="0" w:beforeAutospacing="0" w:lineRule="auto"/>
         <w:ind w:left="720" w:hanging="360"/>
@@ -19219,7 +19542,7 @@
       <w:pPr>
         <w:numPr>
           <w:ilvl w:val="0"/>
-          <w:numId w:val="62"/>
+          <w:numId w:val="63"/>
         </w:numPr>
         <w:spacing w:after="0" w:afterAutospacing="0" w:before="0" w:beforeAutospacing="0" w:lineRule="auto"/>
         <w:ind w:left="720" w:hanging="360"/>
@@ -19249,7 +19572,7 @@
       <w:pPr>
         <w:numPr>
           <w:ilvl w:val="0"/>
-          <w:numId w:val="62"/>
+          <w:numId w:val="63"/>
         </w:numPr>
         <w:spacing w:after="0" w:afterAutospacing="0" w:before="0" w:beforeAutospacing="0" w:lineRule="auto"/>
         <w:ind w:left="720" w:hanging="360"/>
@@ -19265,7 +19588,7 @@
       <w:pPr>
         <w:numPr>
           <w:ilvl w:val="0"/>
-          <w:numId w:val="62"/>
+          <w:numId w:val="63"/>
         </w:numPr>
         <w:spacing w:after="0" w:afterAutospacing="0" w:before="0" w:beforeAutospacing="0" w:lineRule="auto"/>
         <w:ind w:left="720" w:hanging="360"/>
@@ -19295,7 +19618,7 @@
       <w:pPr>
         <w:numPr>
           <w:ilvl w:val="0"/>
-          <w:numId w:val="62"/>
+          <w:numId w:val="63"/>
         </w:numPr>
         <w:spacing w:after="0" w:afterAutospacing="0" w:before="0" w:beforeAutospacing="0" w:lineRule="auto"/>
         <w:ind w:left="720" w:hanging="360"/>
@@ -19311,7 +19634,7 @@
       <w:pPr>
         <w:numPr>
           <w:ilvl w:val="0"/>
-          <w:numId w:val="62"/>
+          <w:numId w:val="63"/>
         </w:numPr>
         <w:spacing w:after="0" w:afterAutospacing="0" w:before="0" w:beforeAutospacing="0" w:lineRule="auto"/>
         <w:ind w:left="720" w:hanging="360"/>
@@ -19327,7 +19650,7 @@
       <w:pPr>
         <w:numPr>
           <w:ilvl w:val="0"/>
-          <w:numId w:val="62"/>
+          <w:numId w:val="63"/>
         </w:numPr>
         <w:spacing w:after="240" w:before="0" w:beforeAutospacing="0" w:lineRule="auto"/>
         <w:ind w:left="720" w:hanging="360"/>
@@ -19355,7 +19678,7 @@
       <w:pPr>
         <w:numPr>
           <w:ilvl w:val="0"/>
-          <w:numId w:val="37"/>
+          <w:numId w:val="38"/>
         </w:numPr>
         <w:spacing w:after="0" w:afterAutospacing="0" w:before="240" w:lineRule="auto"/>
         <w:ind w:left="720" w:hanging="360"/>
@@ -19371,7 +19694,7 @@
       <w:pPr>
         <w:numPr>
           <w:ilvl w:val="0"/>
-          <w:numId w:val="37"/>
+          <w:numId w:val="38"/>
         </w:numPr>
         <w:spacing w:after="0" w:afterAutospacing="0" w:before="0" w:beforeAutospacing="0" w:lineRule="auto"/>
         <w:ind w:left="720" w:hanging="360"/>
@@ -19401,7 +19724,7 @@
       <w:pPr>
         <w:numPr>
           <w:ilvl w:val="0"/>
-          <w:numId w:val="37"/>
+          <w:numId w:val="38"/>
         </w:numPr>
         <w:spacing w:after="0" w:afterAutospacing="0" w:before="0" w:beforeAutospacing="0" w:lineRule="auto"/>
         <w:ind w:left="720" w:hanging="360"/>
@@ -19417,7 +19740,7 @@
       <w:pPr>
         <w:numPr>
           <w:ilvl w:val="0"/>
-          <w:numId w:val="37"/>
+          <w:numId w:val="38"/>
         </w:numPr>
         <w:spacing w:after="0" w:afterAutospacing="0" w:before="0" w:beforeAutospacing="0" w:lineRule="auto"/>
         <w:ind w:left="720" w:hanging="360"/>
@@ -19433,7 +19756,7 @@
       <w:pPr>
         <w:numPr>
           <w:ilvl w:val="0"/>
-          <w:numId w:val="37"/>
+          <w:numId w:val="38"/>
         </w:numPr>
         <w:spacing w:after="0" w:afterAutospacing="0" w:before="0" w:beforeAutospacing="0" w:lineRule="auto"/>
         <w:ind w:left="720" w:hanging="360"/>
@@ -19449,7 +19772,7 @@
       <w:pPr>
         <w:numPr>
           <w:ilvl w:val="0"/>
-          <w:numId w:val="37"/>
+          <w:numId w:val="38"/>
         </w:numPr>
         <w:spacing w:after="0" w:afterAutospacing="0" w:before="0" w:beforeAutospacing="0" w:lineRule="auto"/>
         <w:ind w:left="720" w:hanging="360"/>
@@ -19465,7 +19788,7 @@
       <w:pPr>
         <w:numPr>
           <w:ilvl w:val="0"/>
-          <w:numId w:val="37"/>
+          <w:numId w:val="38"/>
         </w:numPr>
         <w:spacing w:after="0" w:afterAutospacing="0" w:before="0" w:beforeAutospacing="0" w:lineRule="auto"/>
         <w:ind w:left="720" w:hanging="360"/>
@@ -19481,7 +19804,7 @@
       <w:pPr>
         <w:numPr>
           <w:ilvl w:val="0"/>
-          <w:numId w:val="37"/>
+          <w:numId w:val="38"/>
         </w:numPr>
         <w:spacing w:after="0" w:afterAutospacing="0" w:before="0" w:beforeAutospacing="0" w:lineRule="auto"/>
         <w:ind w:left="720" w:hanging="360"/>
@@ -19497,7 +19820,7 @@
       <w:pPr>
         <w:numPr>
           <w:ilvl w:val="0"/>
-          <w:numId w:val="37"/>
+          <w:numId w:val="38"/>
         </w:numPr>
         <w:spacing w:after="0" w:afterAutospacing="0" w:before="0" w:beforeAutospacing="0" w:lineRule="auto"/>
         <w:ind w:left="720" w:hanging="360"/>
@@ -19513,7 +19836,7 @@
       <w:pPr>
         <w:numPr>
           <w:ilvl w:val="0"/>
-          <w:numId w:val="37"/>
+          <w:numId w:val="38"/>
         </w:numPr>
         <w:spacing w:after="0" w:afterAutospacing="0" w:before="0" w:beforeAutospacing="0" w:lineRule="auto"/>
         <w:ind w:left="720" w:hanging="360"/>
@@ -19529,7 +19852,7 @@
       <w:pPr>
         <w:numPr>
           <w:ilvl w:val="0"/>
-          <w:numId w:val="37"/>
+          <w:numId w:val="38"/>
         </w:numPr>
         <w:spacing w:after="240" w:before="0" w:beforeAutospacing="0" w:lineRule="auto"/>
         <w:ind w:left="720" w:hanging="360"/>
@@ -22619,8 +22942,8 @@
   <w:abstractNum w:abstractNumId="26">
     <w:lvl w:ilvl="0">
       <w:start w:val="1"/>
-      <w:numFmt w:val="decimal"/>
-      <w:lvlText w:val="%1."/>
+      <w:numFmt w:val="bullet"/>
+      <w:lvlText w:val="●"/>
       <w:lvlJc w:val="left"/>
       <w:pPr>
         <w:ind w:left="720" w:hanging="360"/>
@@ -22631,8 +22954,8 @@
     </w:lvl>
     <w:lvl w:ilvl="1">
       <w:start w:val="1"/>
-      <w:numFmt w:val="lowerLetter"/>
-      <w:lvlText w:val="%2."/>
+      <w:numFmt w:val="bullet"/>
+      <w:lvlText w:val="○"/>
       <w:lvlJc w:val="left"/>
       <w:pPr>
         <w:ind w:left="1440" w:hanging="360"/>
@@ -22643,8 +22966,8 @@
     </w:lvl>
     <w:lvl w:ilvl="2">
       <w:start w:val="1"/>
-      <w:numFmt w:val="lowerRoman"/>
-      <w:lvlText w:val="%3."/>
+      <w:numFmt w:val="bullet"/>
+      <w:lvlText w:val="■"/>
       <w:lvlJc w:val="left"/>
       <w:pPr>
         <w:ind w:left="2160" w:hanging="360"/>
@@ -22655,8 +22978,8 @@
     </w:lvl>
     <w:lvl w:ilvl="3">
       <w:start w:val="1"/>
-      <w:numFmt w:val="decimal"/>
-      <w:lvlText w:val="%4."/>
+      <w:numFmt w:val="bullet"/>
+      <w:lvlText w:val="●"/>
       <w:lvlJc w:val="left"/>
       <w:pPr>
         <w:ind w:left="2880" w:hanging="360"/>
@@ -22667,8 +22990,8 @@
     </w:lvl>
     <w:lvl w:ilvl="4">
       <w:start w:val="1"/>
-      <w:numFmt w:val="lowerLetter"/>
-      <w:lvlText w:val="%5."/>
+      <w:numFmt w:val="bullet"/>
+      <w:lvlText w:val="○"/>
       <w:lvlJc w:val="left"/>
       <w:pPr>
         <w:ind w:left="3600" w:hanging="360"/>
@@ -22679,8 +23002,8 @@
     </w:lvl>
     <w:lvl w:ilvl="5">
       <w:start w:val="1"/>
-      <w:numFmt w:val="lowerRoman"/>
-      <w:lvlText w:val="%6."/>
+      <w:numFmt w:val="bullet"/>
+      <w:lvlText w:val="■"/>
       <w:lvlJc w:val="left"/>
       <w:pPr>
         <w:ind w:left="4320" w:hanging="360"/>
@@ -22691,8 +23014,8 @@
     </w:lvl>
     <w:lvl w:ilvl="6">
       <w:start w:val="1"/>
-      <w:numFmt w:val="decimal"/>
-      <w:lvlText w:val="%7."/>
+      <w:numFmt w:val="bullet"/>
+      <w:lvlText w:val="●"/>
       <w:lvlJc w:val="left"/>
       <w:pPr>
         <w:ind w:left="5040" w:hanging="360"/>
@@ -22703,8 +23026,8 @@
     </w:lvl>
     <w:lvl w:ilvl="7">
       <w:start w:val="1"/>
-      <w:numFmt w:val="lowerLetter"/>
-      <w:lvlText w:val="%8."/>
+      <w:numFmt w:val="bullet"/>
+      <w:lvlText w:val="○"/>
       <w:lvlJc w:val="left"/>
       <w:pPr>
         <w:ind w:left="5760" w:hanging="360"/>
@@ -22715,8 +23038,8 @@
     </w:lvl>
     <w:lvl w:ilvl="8">
       <w:start w:val="1"/>
-      <w:numFmt w:val="lowerRoman"/>
-      <w:lvlText w:val="%9."/>
+      <w:numFmt w:val="bullet"/>
+      <w:lvlText w:val="■"/>
       <w:lvlJc w:val="left"/>
       <w:pPr>
         <w:ind w:left="6480" w:hanging="360"/>
@@ -22729,8 +23052,8 @@
   <w:abstractNum w:abstractNumId="27">
     <w:lvl w:ilvl="0">
       <w:start w:val="1"/>
-      <w:numFmt w:val="bullet"/>
-      <w:lvlText w:val="●"/>
+      <w:numFmt w:val="decimal"/>
+      <w:lvlText w:val="%1."/>
       <w:lvlJc w:val="left"/>
       <w:pPr>
         <w:ind w:left="720" w:hanging="360"/>
@@ -22741,8 +23064,8 @@
     </w:lvl>
     <w:lvl w:ilvl="1">
       <w:start w:val="1"/>
-      <w:numFmt w:val="bullet"/>
-      <w:lvlText w:val="○"/>
+      <w:numFmt w:val="lowerLetter"/>
+      <w:lvlText w:val="%2."/>
       <w:lvlJc w:val="left"/>
       <w:pPr>
         <w:ind w:left="1440" w:hanging="360"/>
@@ -22753,8 +23076,8 @@
     </w:lvl>
     <w:lvl w:ilvl="2">
       <w:start w:val="1"/>
-      <w:numFmt w:val="bullet"/>
-      <w:lvlText w:val="■"/>
+      <w:numFmt w:val="lowerRoman"/>
+      <w:lvlText w:val="%3."/>
       <w:lvlJc w:val="left"/>
       <w:pPr>
         <w:ind w:left="2160" w:hanging="360"/>
@@ -22765,8 +23088,8 @@
     </w:lvl>
     <w:lvl w:ilvl="3">
       <w:start w:val="1"/>
-      <w:numFmt w:val="bullet"/>
-      <w:lvlText w:val="●"/>
+      <w:numFmt w:val="decimal"/>
+      <w:lvlText w:val="%4."/>
       <w:lvlJc w:val="left"/>
       <w:pPr>
         <w:ind w:left="2880" w:hanging="360"/>
@@ -22777,8 +23100,8 @@
     </w:lvl>
     <w:lvl w:ilvl="4">
       <w:start w:val="1"/>
-      <w:numFmt w:val="bullet"/>
-      <w:lvlText w:val="○"/>
+      <w:numFmt w:val="lowerLetter"/>
+      <w:lvlText w:val="%5."/>
       <w:lvlJc w:val="left"/>
       <w:pPr>
         <w:ind w:left="3600" w:hanging="360"/>
@@ -22789,8 +23112,8 @@
     </w:lvl>
     <w:lvl w:ilvl="5">
       <w:start w:val="1"/>
-      <w:numFmt w:val="bullet"/>
-      <w:lvlText w:val="■"/>
+      <w:numFmt w:val="lowerRoman"/>
+      <w:lvlText w:val="%6."/>
       <w:lvlJc w:val="left"/>
       <w:pPr>
         <w:ind w:left="4320" w:hanging="360"/>
@@ -22801,8 +23124,8 @@
     </w:lvl>
     <w:lvl w:ilvl="6">
       <w:start w:val="1"/>
-      <w:numFmt w:val="bullet"/>
-      <w:lvlText w:val="●"/>
+      <w:numFmt w:val="decimal"/>
+      <w:lvlText w:val="%7."/>
       <w:lvlJc w:val="left"/>
       <w:pPr>
         <w:ind w:left="5040" w:hanging="360"/>
@@ -22813,8 +23136,8 @@
     </w:lvl>
     <w:lvl w:ilvl="7">
       <w:start w:val="1"/>
-      <w:numFmt w:val="bullet"/>
-      <w:lvlText w:val="○"/>
+      <w:numFmt w:val="lowerLetter"/>
+      <w:lvlText w:val="%8."/>
       <w:lvlJc w:val="left"/>
       <w:pPr>
         <w:ind w:left="5760" w:hanging="360"/>
@@ -22825,8 +23148,8 @@
     </w:lvl>
     <w:lvl w:ilvl="8">
       <w:start w:val="1"/>
-      <w:numFmt w:val="bullet"/>
-      <w:lvlText w:val="■"/>
+      <w:numFmt w:val="lowerRoman"/>
+      <w:lvlText w:val="%9."/>
       <w:lvlJc w:val="left"/>
       <w:pPr>
         <w:ind w:left="6480" w:hanging="360"/>
@@ -23279,8 +23602,8 @@
   <w:abstractNum w:abstractNumId="32">
     <w:lvl w:ilvl="0">
       <w:start w:val="1"/>
-      <w:numFmt w:val="decimal"/>
-      <w:lvlText w:val="%1."/>
+      <w:numFmt w:val="bullet"/>
+      <w:lvlText w:val="●"/>
       <w:lvlJc w:val="left"/>
       <w:pPr>
         <w:ind w:left="720" w:hanging="360"/>
@@ -23291,8 +23614,8 @@
     </w:lvl>
     <w:lvl w:ilvl="1">
       <w:start w:val="1"/>
-      <w:numFmt w:val="lowerLetter"/>
-      <w:lvlText w:val="%2."/>
+      <w:numFmt w:val="bullet"/>
+      <w:lvlText w:val="○"/>
       <w:lvlJc w:val="left"/>
       <w:pPr>
         <w:ind w:left="1440" w:hanging="360"/>
@@ -23303,8 +23626,8 @@
     </w:lvl>
     <w:lvl w:ilvl="2">
       <w:start w:val="1"/>
-      <w:numFmt w:val="lowerRoman"/>
-      <w:lvlText w:val="%3."/>
+      <w:numFmt w:val="bullet"/>
+      <w:lvlText w:val="■"/>
       <w:lvlJc w:val="left"/>
       <w:pPr>
         <w:ind w:left="2160" w:hanging="360"/>
@@ -23315,8 +23638,8 @@
     </w:lvl>
     <w:lvl w:ilvl="3">
       <w:start w:val="1"/>
-      <w:numFmt w:val="decimal"/>
-      <w:lvlText w:val="%4."/>
+      <w:numFmt w:val="bullet"/>
+      <w:lvlText w:val="●"/>
       <w:lvlJc w:val="left"/>
       <w:pPr>
         <w:ind w:left="2880" w:hanging="360"/>
@@ -23327,8 +23650,8 @@
     </w:lvl>
     <w:lvl w:ilvl="4">
       <w:start w:val="1"/>
-      <w:numFmt w:val="lowerLetter"/>
-      <w:lvlText w:val="%5."/>
+      <w:numFmt w:val="bullet"/>
+      <w:lvlText w:val="○"/>
       <w:lvlJc w:val="left"/>
       <w:pPr>
         <w:ind w:left="3600" w:hanging="360"/>
@@ -23339,8 +23662,8 @@
     </w:lvl>
     <w:lvl w:ilvl="5">
       <w:start w:val="1"/>
-      <w:numFmt w:val="lowerRoman"/>
-      <w:lvlText w:val="%6."/>
+      <w:numFmt w:val="bullet"/>
+      <w:lvlText w:val="■"/>
       <w:lvlJc w:val="left"/>
       <w:pPr>
         <w:ind w:left="4320" w:hanging="360"/>
@@ -23351,8 +23674,8 @@
     </w:lvl>
     <w:lvl w:ilvl="6">
       <w:start w:val="1"/>
-      <w:numFmt w:val="decimal"/>
-      <w:lvlText w:val="%7."/>
+      <w:numFmt w:val="bullet"/>
+      <w:lvlText w:val="●"/>
       <w:lvlJc w:val="left"/>
       <w:pPr>
         <w:ind w:left="5040" w:hanging="360"/>
@@ -23363,8 +23686,8 @@
     </w:lvl>
     <w:lvl w:ilvl="7">
       <w:start w:val="1"/>
-      <w:numFmt w:val="lowerLetter"/>
-      <w:lvlText w:val="%8."/>
+      <w:numFmt w:val="bullet"/>
+      <w:lvlText w:val="○"/>
       <w:lvlJc w:val="left"/>
       <w:pPr>
         <w:ind w:left="5760" w:hanging="360"/>
@@ -23375,8 +23698,8 @@
     </w:lvl>
     <w:lvl w:ilvl="8">
       <w:start w:val="1"/>
-      <w:numFmt w:val="lowerRoman"/>
-      <w:lvlText w:val="%9."/>
+      <w:numFmt w:val="bullet"/>
+      <w:lvlText w:val="■"/>
       <w:lvlJc w:val="left"/>
       <w:pPr>
         <w:ind w:left="6480" w:hanging="360"/>
@@ -23389,8 +23712,8 @@
   <w:abstractNum w:abstractNumId="33">
     <w:lvl w:ilvl="0">
       <w:start w:val="1"/>
-      <w:numFmt w:val="bullet"/>
-      <w:lvlText w:val="●"/>
+      <w:numFmt w:val="decimal"/>
+      <w:lvlText w:val="%1."/>
       <w:lvlJc w:val="left"/>
       <w:pPr>
         <w:ind w:left="720" w:hanging="360"/>
@@ -23401,8 +23724,8 @@
     </w:lvl>
     <w:lvl w:ilvl="1">
       <w:start w:val="1"/>
-      <w:numFmt w:val="bullet"/>
-      <w:lvlText w:val="○"/>
+      <w:numFmt w:val="lowerLetter"/>
+      <w:lvlText w:val="%2."/>
       <w:lvlJc w:val="left"/>
       <w:pPr>
         <w:ind w:left="1440" w:hanging="360"/>
@@ -23413,8 +23736,8 @@
     </w:lvl>
     <w:lvl w:ilvl="2">
       <w:start w:val="1"/>
-      <w:numFmt w:val="bullet"/>
-      <w:lvlText w:val="■"/>
+      <w:numFmt w:val="lowerRoman"/>
+      <w:lvlText w:val="%3."/>
       <w:lvlJc w:val="left"/>
       <w:pPr>
         <w:ind w:left="2160" w:hanging="360"/>
@@ -23425,8 +23748,8 @@
     </w:lvl>
     <w:lvl w:ilvl="3">
       <w:start w:val="1"/>
-      <w:numFmt w:val="bullet"/>
-      <w:lvlText w:val="●"/>
+      <w:numFmt w:val="decimal"/>
+      <w:lvlText w:val="%4."/>
       <w:lvlJc w:val="left"/>
       <w:pPr>
         <w:ind w:left="2880" w:hanging="360"/>
@@ -23437,8 +23760,8 @@
     </w:lvl>
     <w:lvl w:ilvl="4">
       <w:start w:val="1"/>
-      <w:numFmt w:val="bullet"/>
-      <w:lvlText w:val="○"/>
+      <w:numFmt w:val="lowerLetter"/>
+      <w:lvlText w:val="%5."/>
       <w:lvlJc w:val="left"/>
       <w:pPr>
         <w:ind w:left="3600" w:hanging="360"/>
@@ -23449,8 +23772,8 @@
     </w:lvl>
     <w:lvl w:ilvl="5">
       <w:start w:val="1"/>
-      <w:numFmt w:val="bullet"/>
-      <w:lvlText w:val="■"/>
+      <w:numFmt w:val="lowerRoman"/>
+      <w:lvlText w:val="%6."/>
       <w:lvlJc w:val="left"/>
       <w:pPr>
         <w:ind w:left="4320" w:hanging="360"/>
@@ -23461,8 +23784,8 @@
     </w:lvl>
     <w:lvl w:ilvl="6">
       <w:start w:val="1"/>
-      <w:numFmt w:val="bullet"/>
-      <w:lvlText w:val="●"/>
+      <w:numFmt w:val="decimal"/>
+      <w:lvlText w:val="%7."/>
       <w:lvlJc w:val="left"/>
       <w:pPr>
         <w:ind w:left="5040" w:hanging="360"/>
@@ -23473,8 +23796,8 @@
     </w:lvl>
     <w:lvl w:ilvl="7">
       <w:start w:val="1"/>
-      <w:numFmt w:val="bullet"/>
-      <w:lvlText w:val="○"/>
+      <w:numFmt w:val="lowerLetter"/>
+      <w:lvlText w:val="%8."/>
       <w:lvlJc w:val="left"/>
       <w:pPr>
         <w:ind w:left="5760" w:hanging="360"/>
@@ -23485,8 +23808,8 @@
     </w:lvl>
     <w:lvl w:ilvl="8">
       <w:start w:val="1"/>
-      <w:numFmt w:val="bullet"/>
-      <w:lvlText w:val="■"/>
+      <w:numFmt w:val="lowerRoman"/>
+      <w:lvlText w:val="%9."/>
       <w:lvlJc w:val="left"/>
       <w:pPr>
         <w:ind w:left="6480" w:hanging="360"/>
@@ -23939,8 +24262,8 @@
   <w:abstractNum w:abstractNumId="38">
     <w:lvl w:ilvl="0">
       <w:start w:val="1"/>
-      <w:numFmt w:val="decimal"/>
-      <w:lvlText w:val="%1."/>
+      <w:numFmt w:val="bullet"/>
+      <w:lvlText w:val="●"/>
       <w:lvlJc w:val="left"/>
       <w:pPr>
         <w:ind w:left="720" w:hanging="360"/>
@@ -23951,8 +24274,8 @@
     </w:lvl>
     <w:lvl w:ilvl="1">
       <w:start w:val="1"/>
-      <w:numFmt w:val="lowerLetter"/>
-      <w:lvlText w:val="%2."/>
+      <w:numFmt w:val="bullet"/>
+      <w:lvlText w:val="○"/>
       <w:lvlJc w:val="left"/>
       <w:pPr>
         <w:ind w:left="1440" w:hanging="360"/>
@@ -23963,8 +24286,8 @@
     </w:lvl>
     <w:lvl w:ilvl="2">
       <w:start w:val="1"/>
-      <w:numFmt w:val="lowerRoman"/>
-      <w:lvlText w:val="%3."/>
+      <w:numFmt w:val="bullet"/>
+      <w:lvlText w:val="■"/>
       <w:lvlJc w:val="left"/>
       <w:pPr>
         <w:ind w:left="2160" w:hanging="360"/>
@@ -23975,8 +24298,8 @@
     </w:lvl>
     <w:lvl w:ilvl="3">
       <w:start w:val="1"/>
-      <w:numFmt w:val="decimal"/>
-      <w:lvlText w:val="%4."/>
+      <w:numFmt w:val="bullet"/>
+      <w:lvlText w:val="●"/>
       <w:lvlJc w:val="left"/>
       <w:pPr>
         <w:ind w:left="2880" w:hanging="360"/>
@@ -23987,8 +24310,8 @@
     </w:lvl>
     <w:lvl w:ilvl="4">
       <w:start w:val="1"/>
-      <w:numFmt w:val="lowerLetter"/>
-      <w:lvlText w:val="%5."/>
+      <w:numFmt w:val="bullet"/>
+      <w:lvlText w:val="○"/>
       <w:lvlJc w:val="left"/>
       <w:pPr>
         <w:ind w:left="3600" w:hanging="360"/>
@@ -23999,8 +24322,8 @@
     </w:lvl>
     <w:lvl w:ilvl="5">
       <w:start w:val="1"/>
-      <w:numFmt w:val="lowerRoman"/>
-      <w:lvlText w:val="%6."/>
+      <w:numFmt w:val="bullet"/>
+      <w:lvlText w:val="■"/>
       <w:lvlJc w:val="left"/>
       <w:pPr>
         <w:ind w:left="4320" w:hanging="360"/>
@@ -24011,8 +24334,8 @@
     </w:lvl>
     <w:lvl w:ilvl="6">
       <w:start w:val="1"/>
-      <w:numFmt w:val="decimal"/>
-      <w:lvlText w:val="%7."/>
+      <w:numFmt w:val="bullet"/>
+      <w:lvlText w:val="●"/>
       <w:lvlJc w:val="left"/>
       <w:pPr>
         <w:ind w:left="5040" w:hanging="360"/>
@@ -24023,8 +24346,8 @@
     </w:lvl>
     <w:lvl w:ilvl="7">
       <w:start w:val="1"/>
-      <w:numFmt w:val="lowerLetter"/>
-      <w:lvlText w:val="%8."/>
+      <w:numFmt w:val="bullet"/>
+      <w:lvlText w:val="○"/>
       <w:lvlJc w:val="left"/>
       <w:pPr>
         <w:ind w:left="5760" w:hanging="360"/>
@@ -24035,8 +24358,8 @@
     </w:lvl>
     <w:lvl w:ilvl="8">
       <w:start w:val="1"/>
-      <w:numFmt w:val="lowerRoman"/>
-      <w:lvlText w:val="%9."/>
+      <w:numFmt w:val="bullet"/>
+      <w:lvlText w:val="■"/>
       <w:lvlJc w:val="left"/>
       <w:pPr>
         <w:ind w:left="6480" w:hanging="360"/>
@@ -24159,8 +24482,8 @@
   <w:abstractNum w:abstractNumId="40">
     <w:lvl w:ilvl="0">
       <w:start w:val="1"/>
-      <w:numFmt w:val="bullet"/>
-      <w:lvlText w:val="●"/>
+      <w:numFmt w:val="decimal"/>
+      <w:lvlText w:val="%1."/>
       <w:lvlJc w:val="left"/>
       <w:pPr>
         <w:ind w:left="720" w:hanging="360"/>
@@ -24171,8 +24494,8 @@
     </w:lvl>
     <w:lvl w:ilvl="1">
       <w:start w:val="1"/>
-      <w:numFmt w:val="bullet"/>
-      <w:lvlText w:val="○"/>
+      <w:numFmt w:val="lowerLetter"/>
+      <w:lvlText w:val="%2."/>
       <w:lvlJc w:val="left"/>
       <w:pPr>
         <w:ind w:left="1440" w:hanging="360"/>
@@ -24183,8 +24506,8 @@
     </w:lvl>
     <w:lvl w:ilvl="2">
       <w:start w:val="1"/>
-      <w:numFmt w:val="bullet"/>
-      <w:lvlText w:val="■"/>
+      <w:numFmt w:val="lowerRoman"/>
+      <w:lvlText w:val="%3."/>
       <w:lvlJc w:val="left"/>
       <w:pPr>
         <w:ind w:left="2160" w:hanging="360"/>
@@ -24195,8 +24518,8 @@
     </w:lvl>
     <w:lvl w:ilvl="3">
       <w:start w:val="1"/>
-      <w:numFmt w:val="bullet"/>
-      <w:lvlText w:val="●"/>
+      <w:numFmt w:val="decimal"/>
+      <w:lvlText w:val="%4."/>
       <w:lvlJc w:val="left"/>
       <w:pPr>
         <w:ind w:left="2880" w:hanging="360"/>
@@ -24207,8 +24530,8 @@
     </w:lvl>
     <w:lvl w:ilvl="4">
       <w:start w:val="1"/>
-      <w:numFmt w:val="bullet"/>
-      <w:lvlText w:val="○"/>
+      <w:numFmt w:val="lowerLetter"/>
+      <w:lvlText w:val="%5."/>
       <w:lvlJc w:val="left"/>
       <w:pPr>
         <w:ind w:left="3600" w:hanging="360"/>
@@ -24219,8 +24542,8 @@
     </w:lvl>
     <w:lvl w:ilvl="5">
       <w:start w:val="1"/>
-      <w:numFmt w:val="bullet"/>
-      <w:lvlText w:val="■"/>
+      <w:numFmt w:val="lowerRoman"/>
+      <w:lvlText w:val="%6."/>
       <w:lvlJc w:val="left"/>
       <w:pPr>
         <w:ind w:left="4320" w:hanging="360"/>
@@ -24231,8 +24554,8 @@
     </w:lvl>
     <w:lvl w:ilvl="6">
       <w:start w:val="1"/>
-      <w:numFmt w:val="bullet"/>
-      <w:lvlText w:val="●"/>
+      <w:numFmt w:val="decimal"/>
+      <w:lvlText w:val="%7."/>
       <w:lvlJc w:val="left"/>
       <w:pPr>
         <w:ind w:left="5040" w:hanging="360"/>
@@ -24243,8 +24566,8 @@
     </w:lvl>
     <w:lvl w:ilvl="7">
       <w:start w:val="1"/>
-      <w:numFmt w:val="bullet"/>
-      <w:lvlText w:val="○"/>
+      <w:numFmt w:val="lowerLetter"/>
+      <w:lvlText w:val="%8."/>
       <w:lvlJc w:val="left"/>
       <w:pPr>
         <w:ind w:left="5760" w:hanging="360"/>
@@ -24255,8 +24578,8 @@
     </w:lvl>
     <w:lvl w:ilvl="8">
       <w:start w:val="1"/>
-      <w:numFmt w:val="bullet"/>
-      <w:lvlText w:val="■"/>
+      <w:numFmt w:val="lowerRoman"/>
+      <w:lvlText w:val="%9."/>
       <w:lvlJc w:val="left"/>
       <w:pPr>
         <w:ind w:left="6480" w:hanging="360"/>
@@ -26689,8 +27012,8 @@
   <w:abstractNum w:abstractNumId="63">
     <w:lvl w:ilvl="0">
       <w:start w:val="1"/>
-      <w:numFmt w:val="decimal"/>
-      <w:lvlText w:val="%1."/>
+      <w:numFmt w:val="bullet"/>
+      <w:lvlText w:val="●"/>
       <w:lvlJc w:val="left"/>
       <w:pPr>
         <w:ind w:left="720" w:hanging="360"/>
@@ -26701,8 +27024,8 @@
     </w:lvl>
     <w:lvl w:ilvl="1">
       <w:start w:val="1"/>
-      <w:numFmt w:val="lowerLetter"/>
-      <w:lvlText w:val="%2."/>
+      <w:numFmt w:val="bullet"/>
+      <w:lvlText w:val="○"/>
       <w:lvlJc w:val="left"/>
       <w:pPr>
         <w:ind w:left="1440" w:hanging="360"/>
@@ -26713,8 +27036,8 @@
     </w:lvl>
     <w:lvl w:ilvl="2">
       <w:start w:val="1"/>
-      <w:numFmt w:val="lowerRoman"/>
-      <w:lvlText w:val="%3."/>
+      <w:numFmt w:val="bullet"/>
+      <w:lvlText w:val="■"/>
       <w:lvlJc w:val="left"/>
       <w:pPr>
         <w:ind w:left="2160" w:hanging="360"/>
@@ -26725,8 +27048,8 @@
     </w:lvl>
     <w:lvl w:ilvl="3">
       <w:start w:val="1"/>
-      <w:numFmt w:val="decimal"/>
-      <w:lvlText w:val="%4."/>
+      <w:numFmt w:val="bullet"/>
+      <w:lvlText w:val="●"/>
       <w:lvlJc w:val="left"/>
       <w:pPr>
         <w:ind w:left="2880" w:hanging="360"/>
@@ -26737,8 +27060,8 @@
     </w:lvl>
     <w:lvl w:ilvl="4">
       <w:start w:val="1"/>
-      <w:numFmt w:val="lowerLetter"/>
-      <w:lvlText w:val="%5."/>
+      <w:numFmt w:val="bullet"/>
+      <w:lvlText w:val="○"/>
       <w:lvlJc w:val="left"/>
       <w:pPr>
         <w:ind w:left="3600" w:hanging="360"/>
@@ -26749,8 +27072,8 @@
     </w:lvl>
     <w:lvl w:ilvl="5">
       <w:start w:val="1"/>
-      <w:numFmt w:val="lowerRoman"/>
-      <w:lvlText w:val="%6."/>
+      <w:numFmt w:val="bullet"/>
+      <w:lvlText w:val="■"/>
       <w:lvlJc w:val="left"/>
       <w:pPr>
         <w:ind w:left="4320" w:hanging="360"/>
@@ -26761,8 +27084,8 @@
     </w:lvl>
     <w:lvl w:ilvl="6">
       <w:start w:val="1"/>
-      <w:numFmt w:val="decimal"/>
-      <w:lvlText w:val="%7."/>
+      <w:numFmt w:val="bullet"/>
+      <w:lvlText w:val="●"/>
       <w:lvlJc w:val="left"/>
       <w:pPr>
         <w:ind w:left="5040" w:hanging="360"/>
@@ -26773,8 +27096,8 @@
     </w:lvl>
     <w:lvl w:ilvl="7">
       <w:start w:val="1"/>
-      <w:numFmt w:val="lowerLetter"/>
-      <w:lvlText w:val="%8."/>
+      <w:numFmt w:val="bullet"/>
+      <w:lvlText w:val="○"/>
       <w:lvlJc w:val="left"/>
       <w:pPr>
         <w:ind w:left="5760" w:hanging="360"/>
@@ -26785,8 +27108,8 @@
     </w:lvl>
     <w:lvl w:ilvl="8">
       <w:start w:val="1"/>
-      <w:numFmt w:val="lowerRoman"/>
-      <w:lvlText w:val="%9."/>
+      <w:numFmt w:val="bullet"/>
+      <w:lvlText w:val="■"/>
       <w:lvlJc w:val="left"/>
       <w:pPr>
         <w:ind w:left="6480" w:hanging="360"/>
@@ -26909,8 +27232,8 @@
   <w:abstractNum w:abstractNumId="65">
     <w:lvl w:ilvl="0">
       <w:start w:val="1"/>
-      <w:numFmt w:val="bullet"/>
-      <w:lvlText w:val="●"/>
+      <w:numFmt w:val="decimal"/>
+      <w:lvlText w:val="%1."/>
       <w:lvlJc w:val="left"/>
       <w:pPr>
         <w:ind w:left="720" w:hanging="360"/>
@@ -26921,8 +27244,8 @@
     </w:lvl>
     <w:lvl w:ilvl="1">
       <w:start w:val="1"/>
-      <w:numFmt w:val="bullet"/>
-      <w:lvlText w:val="○"/>
+      <w:numFmt w:val="lowerLetter"/>
+      <w:lvlText w:val="%2."/>
       <w:lvlJc w:val="left"/>
       <w:pPr>
         <w:ind w:left="1440" w:hanging="360"/>
@@ -26933,8 +27256,8 @@
     </w:lvl>
     <w:lvl w:ilvl="2">
       <w:start w:val="1"/>
-      <w:numFmt w:val="bullet"/>
-      <w:lvlText w:val="■"/>
+      <w:numFmt w:val="lowerRoman"/>
+      <w:lvlText w:val="%3."/>
       <w:lvlJc w:val="left"/>
       <w:pPr>
         <w:ind w:left="2160" w:hanging="360"/>
@@ -26945,8 +27268,8 @@
     </w:lvl>
     <w:lvl w:ilvl="3">
       <w:start w:val="1"/>
-      <w:numFmt w:val="bullet"/>
-      <w:lvlText w:val="●"/>
+      <w:numFmt w:val="decimal"/>
+      <w:lvlText w:val="%4."/>
       <w:lvlJc w:val="left"/>
       <w:pPr>
         <w:ind w:left="2880" w:hanging="360"/>
@@ -26957,8 +27280,8 @@
     </w:lvl>
     <w:lvl w:ilvl="4">
       <w:start w:val="1"/>
-      <w:numFmt w:val="bullet"/>
-      <w:lvlText w:val="○"/>
+      <w:numFmt w:val="lowerLetter"/>
+      <w:lvlText w:val="%5."/>
       <w:lvlJc w:val="left"/>
       <w:pPr>
         <w:ind w:left="3600" w:hanging="360"/>
@@ -26969,8 +27292,8 @@
     </w:lvl>
     <w:lvl w:ilvl="5">
       <w:start w:val="1"/>
-      <w:numFmt w:val="bullet"/>
-      <w:lvlText w:val="■"/>
+      <w:numFmt w:val="lowerRoman"/>
+      <w:lvlText w:val="%6."/>
       <w:lvlJc w:val="left"/>
       <w:pPr>
         <w:ind w:left="4320" w:hanging="360"/>
@@ -26981,8 +27304,8 @@
     </w:lvl>
     <w:lvl w:ilvl="6">
       <w:start w:val="1"/>
-      <w:numFmt w:val="bullet"/>
-      <w:lvlText w:val="●"/>
+      <w:numFmt w:val="decimal"/>
+      <w:lvlText w:val="%7."/>
       <w:lvlJc w:val="left"/>
       <w:pPr>
         <w:ind w:left="5040" w:hanging="360"/>
@@ -26993,8 +27316,8 @@
     </w:lvl>
     <w:lvl w:ilvl="7">
       <w:start w:val="1"/>
-      <w:numFmt w:val="bullet"/>
-      <w:lvlText w:val="○"/>
+      <w:numFmt w:val="lowerLetter"/>
+      <w:lvlText w:val="%8."/>
       <w:lvlJc w:val="left"/>
       <w:pPr>
         <w:ind w:left="5760" w:hanging="360"/>
@@ -27005,8 +27328,8 @@
     </w:lvl>
     <w:lvl w:ilvl="8">
       <w:start w:val="1"/>
-      <w:numFmt w:val="bullet"/>
-      <w:lvlText w:val="■"/>
+      <w:numFmt w:val="lowerRoman"/>
+      <w:lvlText w:val="%9."/>
       <w:lvlJc w:val="left"/>
       <w:pPr>
         <w:ind w:left="6480" w:hanging="360"/>
@@ -27677,6 +28000,226 @@
     </w:lvl>
   </w:abstractNum>
   <w:abstractNum w:abstractNumId="72">
+    <w:lvl w:ilvl="0">
+      <w:start w:val="1"/>
+      <w:numFmt w:val="bullet"/>
+      <w:lvlText w:val="●"/>
+      <w:lvlJc w:val="left"/>
+      <w:pPr>
+        <w:ind w:left="720" w:hanging="360"/>
+      </w:pPr>
+      <w:rPr>
+        <w:u w:val="none"/>
+      </w:rPr>
+    </w:lvl>
+    <w:lvl w:ilvl="1">
+      <w:start w:val="1"/>
+      <w:numFmt w:val="bullet"/>
+      <w:lvlText w:val="○"/>
+      <w:lvlJc w:val="left"/>
+      <w:pPr>
+        <w:ind w:left="1440" w:hanging="360"/>
+      </w:pPr>
+      <w:rPr>
+        <w:u w:val="none"/>
+      </w:rPr>
+    </w:lvl>
+    <w:lvl w:ilvl="2">
+      <w:start w:val="1"/>
+      <w:numFmt w:val="bullet"/>
+      <w:lvlText w:val="■"/>
+      <w:lvlJc w:val="left"/>
+      <w:pPr>
+        <w:ind w:left="2160" w:hanging="360"/>
+      </w:pPr>
+      <w:rPr>
+        <w:u w:val="none"/>
+      </w:rPr>
+    </w:lvl>
+    <w:lvl w:ilvl="3">
+      <w:start w:val="1"/>
+      <w:numFmt w:val="bullet"/>
+      <w:lvlText w:val="●"/>
+      <w:lvlJc w:val="left"/>
+      <w:pPr>
+        <w:ind w:left="2880" w:hanging="360"/>
+      </w:pPr>
+      <w:rPr>
+        <w:u w:val="none"/>
+      </w:rPr>
+    </w:lvl>
+    <w:lvl w:ilvl="4">
+      <w:start w:val="1"/>
+      <w:numFmt w:val="bullet"/>
+      <w:lvlText w:val="○"/>
+      <w:lvlJc w:val="left"/>
+      <w:pPr>
+        <w:ind w:left="3600" w:hanging="360"/>
+      </w:pPr>
+      <w:rPr>
+        <w:u w:val="none"/>
+      </w:rPr>
+    </w:lvl>
+    <w:lvl w:ilvl="5">
+      <w:start w:val="1"/>
+      <w:numFmt w:val="bullet"/>
+      <w:lvlText w:val="■"/>
+      <w:lvlJc w:val="left"/>
+      <w:pPr>
+        <w:ind w:left="4320" w:hanging="360"/>
+      </w:pPr>
+      <w:rPr>
+        <w:u w:val="none"/>
+      </w:rPr>
+    </w:lvl>
+    <w:lvl w:ilvl="6">
+      <w:start w:val="1"/>
+      <w:numFmt w:val="bullet"/>
+      <w:lvlText w:val="●"/>
+      <w:lvlJc w:val="left"/>
+      <w:pPr>
+        <w:ind w:left="5040" w:hanging="360"/>
+      </w:pPr>
+      <w:rPr>
+        <w:u w:val="none"/>
+      </w:rPr>
+    </w:lvl>
+    <w:lvl w:ilvl="7">
+      <w:start w:val="1"/>
+      <w:numFmt w:val="bullet"/>
+      <w:lvlText w:val="○"/>
+      <w:lvlJc w:val="left"/>
+      <w:pPr>
+        <w:ind w:left="5760" w:hanging="360"/>
+      </w:pPr>
+      <w:rPr>
+        <w:u w:val="none"/>
+      </w:rPr>
+    </w:lvl>
+    <w:lvl w:ilvl="8">
+      <w:start w:val="1"/>
+      <w:numFmt w:val="bullet"/>
+      <w:lvlText w:val="■"/>
+      <w:lvlJc w:val="left"/>
+      <w:pPr>
+        <w:ind w:left="6480" w:hanging="360"/>
+      </w:pPr>
+      <w:rPr>
+        <w:u w:val="none"/>
+      </w:rPr>
+    </w:lvl>
+  </w:abstractNum>
+  <w:abstractNum w:abstractNumId="73">
+    <w:lvl w:ilvl="0">
+      <w:start w:val="1"/>
+      <w:numFmt w:val="bullet"/>
+      <w:lvlText w:val="●"/>
+      <w:lvlJc w:val="left"/>
+      <w:pPr>
+        <w:ind w:left="720" w:hanging="360"/>
+      </w:pPr>
+      <w:rPr>
+        <w:u w:val="none"/>
+      </w:rPr>
+    </w:lvl>
+    <w:lvl w:ilvl="1">
+      <w:start w:val="1"/>
+      <w:numFmt w:val="bullet"/>
+      <w:lvlText w:val="○"/>
+      <w:lvlJc w:val="left"/>
+      <w:pPr>
+        <w:ind w:left="1440" w:hanging="360"/>
+      </w:pPr>
+      <w:rPr>
+        <w:u w:val="none"/>
+      </w:rPr>
+    </w:lvl>
+    <w:lvl w:ilvl="2">
+      <w:start w:val="1"/>
+      <w:numFmt w:val="bullet"/>
+      <w:lvlText w:val="■"/>
+      <w:lvlJc w:val="left"/>
+      <w:pPr>
+        <w:ind w:left="2160" w:hanging="360"/>
+      </w:pPr>
+      <w:rPr>
+        <w:u w:val="none"/>
+      </w:rPr>
+    </w:lvl>
+    <w:lvl w:ilvl="3">
+      <w:start w:val="1"/>
+      <w:numFmt w:val="bullet"/>
+      <w:lvlText w:val="●"/>
+      <w:lvlJc w:val="left"/>
+      <w:pPr>
+        <w:ind w:left="2880" w:hanging="360"/>
+      </w:pPr>
+      <w:rPr>
+        <w:u w:val="none"/>
+      </w:rPr>
+    </w:lvl>
+    <w:lvl w:ilvl="4">
+      <w:start w:val="1"/>
+      <w:numFmt w:val="bullet"/>
+      <w:lvlText w:val="○"/>
+      <w:lvlJc w:val="left"/>
+      <w:pPr>
+        <w:ind w:left="3600" w:hanging="360"/>
+      </w:pPr>
+      <w:rPr>
+        <w:u w:val="none"/>
+      </w:rPr>
+    </w:lvl>
+    <w:lvl w:ilvl="5">
+      <w:start w:val="1"/>
+      <w:numFmt w:val="bullet"/>
+      <w:lvlText w:val="■"/>
+      <w:lvlJc w:val="left"/>
+      <w:pPr>
+        <w:ind w:left="4320" w:hanging="360"/>
+      </w:pPr>
+      <w:rPr>
+        <w:u w:val="none"/>
+      </w:rPr>
+    </w:lvl>
+    <w:lvl w:ilvl="6">
+      <w:start w:val="1"/>
+      <w:numFmt w:val="bullet"/>
+      <w:lvlText w:val="●"/>
+      <w:lvlJc w:val="left"/>
+      <w:pPr>
+        <w:ind w:left="5040" w:hanging="360"/>
+      </w:pPr>
+      <w:rPr>
+        <w:u w:val="none"/>
+      </w:rPr>
+    </w:lvl>
+    <w:lvl w:ilvl="7">
+      <w:start w:val="1"/>
+      <w:numFmt w:val="bullet"/>
+      <w:lvlText w:val="○"/>
+      <w:lvlJc w:val="left"/>
+      <w:pPr>
+        <w:ind w:left="5760" w:hanging="360"/>
+      </w:pPr>
+      <w:rPr>
+        <w:u w:val="none"/>
+      </w:rPr>
+    </w:lvl>
+    <w:lvl w:ilvl="8">
+      <w:start w:val="1"/>
+      <w:numFmt w:val="bullet"/>
+      <w:lvlText w:val="■"/>
+      <w:lvlJc w:val="left"/>
+      <w:pPr>
+        <w:ind w:left="6480" w:hanging="360"/>
+      </w:pPr>
+      <w:rPr>
+        <w:u w:val="none"/>
+      </w:rPr>
+    </w:lvl>
+  </w:abstractNum>
+  <w:abstractNum w:abstractNumId="74">
     <w:lvl w:ilvl="0">
       <w:start w:val="1"/>
       <w:numFmt w:val="bullet"/>
@@ -28001,6 +28544,12 @@
   </w:num>
   <w:num w:numId="72">
     <w:abstractNumId w:val="72"/>
+  </w:num>
+  <w:num w:numId="73">
+    <w:abstractNumId w:val="73"/>
+  </w:num>
+  <w:num w:numId="74">
+    <w:abstractNumId w:val="74"/>
   </w:num>
 </w:numbering>
 </file>

</xml_diff>